<commit_message>
W05 SAT: proofs, guide, sources and Word files for the raised paper
Rewrite the key proofs for the 22 items, re-verify the Zech, Stripe and
Flipkart figures and log them, update the guide's marking and most-missed
table, and let the workbook demo count Part 1's own size, since the raised
Part 1 holds four items (other weeks' manifests are unchanged).

Co-Authored-By: Claude Opus 5.5 <noreply@anthropic.com>
Claude-Session: https://claude.ai/code/session_01TK2R2w1VqUevu4hjhMpfyj
</commit_message>
<xml_diff>
--- a/content/W05/SAT/paper/C2_W05_SAT_recap_paper_STUDENT.docx
+++ b/content/W05/SAT/paper/C2_W05_SAT_recap_paper_STUDENT.docx
@@ -28,7 +28,7 @@
           <w:sz w:val="21"/>
           <w:szCs w:val="21"/>
         </w:rPr>
-        <w:t xml:space="preserve">Cohort 2 | Week 5 | Saturday 7 November 2026 | 60 minutes | 24 items in 5 parts | ungraded</w:t>
+        <w:t xml:space="preserve">Cohort 2 | Week 5 | Saturday 7 November 2026 | 60 minutes | 22 items in 5 parts | ungraded</w:t>
       </w:r>
     </w:p>
     <w:p>
@@ -68,7 +68,7 @@
           <w:sz w:val="21"/>
           <w:szCs w:val="21"/>
         </w:rPr>
-        <w:t xml:space="preserve">This week one real file carried every decision: 41,188 calls a Portuguese bank made to sell a term deposit, scored by the pipeline the room ran from Monday to Friday. The same questions ran on Kalpa in the lab, priced in Kalpa's rupees. This paper puts the week's calls back to you: whether a question needs a model and how the rows are split, which number tells the truth on a lopsided outcome and where the threshold goes, which columns the model was allowed to know, whether a model is learning or memorising, and what the committee needs before it signs and what moves to lending. The room's score in each part, set beside the rating you give that part in step one, tells the next session where to start.</w:t>
+        <w:t xml:space="preserve">This week one real file carried every decision: 41,188 calls a Portuguese bank made to sell a term deposit, scored by the pipeline the room ran from Monday to Friday. The same questions ran on Kalpa in the lab, priced in Kalpa's rupees. This paper puts the week's calls back to you: whether a question needs a model and how the rows are split, which number tells the truth on a lopsided outcome and where the threshold goes, which columns the model was allowed to know, whether a model is learning or memorising, and what the committee needs before it signs and what moves to lending. Most items join two of the week's ideas on one exhibit, the way an interviewer pushes past the first answer. The room's score in each part, set beside the rating you give that part in step one, tells the next session where to start.</w:t>
       </w:r>
     </w:p>
     <w:p>
@@ -254,7 +254,7 @@
                 <w:sz w:val="18"/>
                 <w:szCs w:val="18"/>
               </w:rPr>
-              <w:t xml:space="preserve">60 minutes in one sitting for 24 items, which the blueprint paces at 57 minutes. Each part gives its minutes as a guide; move on when an item is eating your time, and come back to it at the end.</w:t>
+              <w:t xml:space="preserve">60 minutes in one sitting for 22 items, which the blueprint paces at 58.5 minutes. Each part gives its minutes as a guide; move on when an item is eating your time, and come back to it at the end.</w:t>
             </w:r>
           </w:p>
         </w:tc>
@@ -404,7 +404,7 @@
                 <w:sz w:val="18"/>
                 <w:szCs w:val="18"/>
               </w:rPr>
-              <w:t xml:space="preserve">Every answer goes on the answer sheet at the back, which is the page that is marked: one box for a lettered item, every correct box for a starred one, the letter for a word-bank or match item, and the number or the letters in order in the space. A wrong answer costs nothing, so answer every item.</w:t>
+              <w:t xml:space="preserve">Every answer goes on the answer sheet at the back, which is the page that is marked: one box for a lettered item, every correct box for a starred one, and the number or the letters in order in the space. A wrong answer costs nothing, so answer every item.</w:t>
             </w:r>
           </w:p>
         </w:tc>
@@ -629,7 +629,7 @@
                 <w:sz w:val="18"/>
                 <w:szCs w:val="18"/>
               </w:rPr>
-              <w:t xml:space="preserve">Every part opens on the UCI Bank Marketing dataset (Moro, Rita and Cortez, CC BY 4.0), a real bank's real calls, and on the numbers the week's pipeline printed on it; the rupee costs are Kalpa's, from the labs. Kalpa Retail's people are Meera Raghavan, the CEO, and Anand Iyer, the finance controller, with the marketing lead named by role; Kalpa Financial Services is Rohan Desai's payments and lending business, where he is head of risk. Items that use a public case (Instacart, Booking.com) give the source beside the fact, and every number an item needs is on the page.</w:t>
+              <w:t xml:space="preserve">Every part opens on the UCI Bank Marketing dataset (Moro, Rita and Cortez, CC BY 4.0), a real bank's real calls, and on the numbers the week's pipeline printed on it; the rupee costs are Kalpa's, from the labs. Kalpa Retail's people are Meera Raghavan, the CEO, and Anand Iyer, the finance controller, with the marketing lead named by role; Kalpa Financial Services is Rohan Desai's payments and lending business, where he is head of risk. Items that use a public case (Zech and others on pneumonia X-rays, Instacart, Booking.com, Stripe and Flipkart) give the source beside the fact, and every number an item needs is on the page.</w:t>
             </w:r>
           </w:p>
         </w:tc>
@@ -1432,7 +1432,7 @@
                 <w:sz w:val="18"/>
                 <w:szCs w:val="18"/>
               </w:rPr>
-              <w:t xml:space="preserve">Q1 to Q5 (5)</w:t>
+              <w:t xml:space="preserve">Q1 to Q4 (4)</w:t>
             </w:r>
           </w:p>
         </w:tc>
@@ -1504,7 +1504,7 @@
                 <w:sz w:val="18"/>
                 <w:szCs w:val="18"/>
               </w:rPr>
-              <w:t xml:space="preserve">10.5</w:t>
+              <w:t xml:space="preserve">10</w:t>
             </w:r>
           </w:p>
         </w:tc>
@@ -1540,7 +1540,7 @@
                 <w:sz w:val="18"/>
                 <w:szCs w:val="18"/>
               </w:rPr>
-              <w:t xml:space="preserve">1</w:t>
+              <w:t xml:space="preserve">0</w:t>
             </w:r>
           </w:p>
         </w:tc>
@@ -1576,7 +1576,7 @@
                 <w:sz w:val="18"/>
                 <w:szCs w:val="18"/>
               </w:rPr>
-              <w:t xml:space="preserve">3</w:t>
+              <w:t xml:space="preserve">1</w:t>
             </w:r>
           </w:p>
         </w:tc>
@@ -1612,7 +1612,7 @@
                 <w:sz w:val="18"/>
                 <w:szCs w:val="18"/>
               </w:rPr>
-              <w:t xml:space="preserve">1</w:t>
+              <w:t xml:space="preserve">3</w:t>
             </w:r>
           </w:p>
         </w:tc>
@@ -1723,7 +1723,7 @@
                 <w:sz w:val="18"/>
                 <w:szCs w:val="18"/>
               </w:rPr>
-              <w:t xml:space="preserve">Q6 to Q11 (6)</w:t>
+              <w:t xml:space="preserve">Q5 to Q9 (5)</w:t>
             </w:r>
           </w:p>
         </w:tc>
@@ -1831,7 +1831,7 @@
                 <w:sz w:val="18"/>
                 <w:szCs w:val="18"/>
               </w:rPr>
-              <w:t xml:space="preserve">1</w:t>
+              <w:t xml:space="preserve">0</w:t>
             </w:r>
           </w:p>
         </w:tc>
@@ -1867,7 +1867,7 @@
                 <w:sz w:val="18"/>
                 <w:szCs w:val="18"/>
               </w:rPr>
-              <w:t xml:space="preserve">4</w:t>
+              <w:t xml:space="preserve">3</w:t>
             </w:r>
           </w:p>
         </w:tc>
@@ -1903,7 +1903,7 @@
                 <w:sz w:val="18"/>
                 <w:szCs w:val="18"/>
               </w:rPr>
-              <w:t xml:space="preserve">1</w:t>
+              <w:t xml:space="preserve">2</w:t>
             </w:r>
           </w:p>
         </w:tc>
@@ -2014,7 +2014,7 @@
                 <w:sz w:val="18"/>
                 <w:szCs w:val="18"/>
               </w:rPr>
-              <w:t xml:space="preserve">Q12 to Q16 (5)</w:t>
+              <w:t xml:space="preserve">Q10 to Q13 (4)</w:t>
             </w:r>
           </w:p>
         </w:tc>
@@ -2086,7 +2086,7 @@
                 <w:sz w:val="18"/>
                 <w:szCs w:val="18"/>
               </w:rPr>
-              <w:t xml:space="preserve">11</w:t>
+              <w:t xml:space="preserve">10.5</w:t>
             </w:r>
           </w:p>
         </w:tc>
@@ -2122,7 +2122,7 @@
                 <w:sz w:val="18"/>
                 <w:szCs w:val="18"/>
               </w:rPr>
-              <w:t xml:space="preserve">1</w:t>
+              <w:t xml:space="preserve">0</w:t>
             </w:r>
           </w:p>
         </w:tc>
@@ -2158,7 +2158,7 @@
                 <w:sz w:val="18"/>
                 <w:szCs w:val="18"/>
               </w:rPr>
-              <w:t xml:space="preserve">3</w:t>
+              <w:t xml:space="preserve">1</w:t>
             </w:r>
           </w:p>
         </w:tc>
@@ -2194,7 +2194,7 @@
                 <w:sz w:val="18"/>
                 <w:szCs w:val="18"/>
               </w:rPr>
-              <w:t xml:space="preserve">1</w:t>
+              <w:t xml:space="preserve">3</w:t>
             </w:r>
           </w:p>
         </w:tc>
@@ -2305,7 +2305,7 @@
                 <w:sz w:val="18"/>
                 <w:szCs w:val="18"/>
               </w:rPr>
-              <w:t xml:space="preserve">Q17 to Q20 (4)</w:t>
+              <w:t xml:space="preserve">Q14 to Q17 (4)</w:t>
             </w:r>
           </w:p>
         </w:tc>
@@ -2596,7 +2596,7 @@
                 <w:sz w:val="18"/>
                 <w:szCs w:val="18"/>
               </w:rPr>
-              <w:t xml:space="preserve">Q21 to Q24 (4)</w:t>
+              <w:t xml:space="preserve">Q18 to Q22 (5)</w:t>
             </w:r>
           </w:p>
         </w:tc>
@@ -2668,7 +2668,7 @@
                 <w:sz w:val="18"/>
                 <w:szCs w:val="18"/>
               </w:rPr>
-              <w:t xml:space="preserve">10</w:t>
+              <w:t xml:space="preserve">12.5</w:t>
             </w:r>
           </w:p>
         </w:tc>
@@ -2740,7 +2740,7 @@
                 <w:sz w:val="18"/>
                 <w:szCs w:val="18"/>
               </w:rPr>
-              <w:t xml:space="preserve">2</w:t>
+              <w:t xml:space="preserve">1</w:t>
             </w:r>
           </w:p>
         </w:tc>
@@ -2776,7 +2776,7 @@
                 <w:sz w:val="18"/>
                 <w:szCs w:val="18"/>
               </w:rPr>
-              <w:t xml:space="preserve">2</w:t>
+              <w:t xml:space="preserve">4</w:t>
             </w:r>
           </w:p>
         </w:tc>
@@ -2889,7 +2889,7 @@
                 <w:sz w:val="18"/>
                 <w:szCs w:val="18"/>
               </w:rPr>
-              <w:t xml:space="preserve">24</w:t>
+              <w:t xml:space="preserve">22</w:t>
             </w:r>
           </w:p>
         </w:tc>
@@ -2961,7 +2961,7 @@
                 <w:sz w:val="18"/>
                 <w:szCs w:val="18"/>
               </w:rPr>
-              <w:t xml:space="preserve">57</w:t>
+              <w:t xml:space="preserve">58.5</w:t>
             </w:r>
           </w:p>
         </w:tc>
@@ -2997,7 +2997,7 @@
                 <w:sz w:val="18"/>
                 <w:szCs w:val="18"/>
               </w:rPr>
-              <w:t xml:space="preserve">3</w:t>
+              <w:t xml:space="preserve">0</w:t>
             </w:r>
           </w:p>
         </w:tc>
@@ -3033,7 +3033,7 @@
                 <w:sz w:val="18"/>
                 <w:szCs w:val="18"/>
               </w:rPr>
-              <w:t xml:space="preserve">14</w:t>
+              <w:t xml:space="preserve">8</w:t>
             </w:r>
           </w:p>
         </w:tc>
@@ -3069,7 +3069,7 @@
                 <w:sz w:val="18"/>
                 <w:szCs w:val="18"/>
               </w:rPr>
-              <w:t xml:space="preserve">7</w:t>
+              <w:t xml:space="preserve">14</w:t>
             </w:r>
           </w:p>
         </w:tc>
@@ -3104,7 +3104,7 @@
           <w:sz w:val="19"/>
           <w:szCs w:val="19"/>
         </w:rPr>
-        <w:t xml:space="preserve">Each band is as wide as its part's minutes; the timed items fill 57 of the 60 minutes, and the minute each part starts is under it.</w:t>
+        <w:t xml:space="preserve">Each band is as wide as its part's minutes; the timed items fill 58.5 of the 60 minutes, and the minute each part starts is under it.</w:t>
       </w:r>
     </w:p>
     <w:tbl>
@@ -3120,11 +3120,11 @@
         </w:tblBorders>
       </w:tblPr>
       <w:tblGrid>
-        <w:gridCol w:w="1805"/>
-        <w:gridCol w:w="2666"/>
-        <w:gridCol w:w="1891"/>
-        <w:gridCol w:w="1719"/>
-        <w:gridCol w:w="1719"/>
+        <w:gridCol w:w="1675"/>
+        <w:gridCol w:w="2597"/>
+        <w:gridCol w:w="1759"/>
+        <w:gridCol w:w="1675"/>
+        <w:gridCol w:w="2094"/>
       </w:tblGrid>
       <w:tr>
         <w:trPr>
@@ -3133,7 +3133,7 @@
         </w:trPr>
         <w:tc>
           <w:tcPr>
-            <w:tcW w:type="dxa" w:w="1805"/>
+            <w:tcW w:type="dxa" w:w="1675"/>
             <w:tcBorders>
               <w:top w:val="single" w:color="FFFFFF" w:sz="4"/>
               <w:left w:val="single" w:color="FFFFFF" w:sz="4"/>
@@ -3180,13 +3180,13 @@
                 <w:sz w:val="15"/>
                 <w:szCs w:val="15"/>
               </w:rPr>
-              <w:t xml:space="preserve">10.5 min</w:t>
+              <w:t xml:space="preserve">10 min</w:t>
             </w:r>
           </w:p>
         </w:tc>
         <w:tc>
           <w:tcPr>
-            <w:tcW w:type="dxa" w:w="2666"/>
+            <w:tcW w:type="dxa" w:w="2597"/>
             <w:tcBorders>
               <w:top w:val="single" w:color="FFFFFF" w:sz="4"/>
               <w:left w:val="single" w:color="FFFFFF" w:sz="4"/>
@@ -3239,7 +3239,7 @@
         </w:tc>
         <w:tc>
           <w:tcPr>
-            <w:tcW w:type="dxa" w:w="1891"/>
+            <w:tcW w:type="dxa" w:w="1759"/>
             <w:tcBorders>
               <w:top w:val="single" w:color="FFFFFF" w:sz="4"/>
               <w:left w:val="single" w:color="FFFFFF" w:sz="4"/>
@@ -3286,13 +3286,13 @@
                 <w:sz w:val="15"/>
                 <w:szCs w:val="15"/>
               </w:rPr>
-              <w:t xml:space="preserve">11 min</w:t>
+              <w:t xml:space="preserve">10.5 min</w:t>
             </w:r>
           </w:p>
         </w:tc>
         <w:tc>
           <w:tcPr>
-            <w:tcW w:type="dxa" w:w="1719"/>
+            <w:tcW w:type="dxa" w:w="1675"/>
             <w:tcBorders>
               <w:top w:val="single" w:color="FFFFFF" w:sz="4"/>
               <w:left w:val="single" w:color="FFFFFF" w:sz="4"/>
@@ -3345,7 +3345,7 @@
         </w:tc>
         <w:tc>
           <w:tcPr>
-            <w:tcW w:type="dxa" w:w="1719"/>
+            <w:tcW w:type="dxa" w:w="2094"/>
             <w:tcBorders>
               <w:top w:val="single" w:color="FFFFFF" w:sz="4"/>
               <w:left w:val="single" w:color="FFFFFF" w:sz="4"/>
@@ -3392,7 +3392,7 @@
                 <w:sz w:val="15"/>
                 <w:szCs w:val="15"/>
               </w:rPr>
-              <w:t xml:space="preserve">10 min</w:t>
+              <w:t xml:space="preserve">12.5 min</w:t>
             </w:r>
           </w:p>
         </w:tc>
@@ -3403,7 +3403,7 @@
         </w:trPr>
         <w:tc>
           <w:tcPr>
-            <w:tcW w:type="dxa" w:w="1805"/>
+            <w:tcW w:type="dxa" w:w="1675"/>
             <w:tcBorders>
               <w:top w:val="none" w:color="FFFFFF" w:sz="0"/>
               <w:left w:val="none" w:color="FFFFFF" w:sz="0"/>
@@ -3436,7 +3436,7 @@
         </w:tc>
         <w:tc>
           <w:tcPr>
-            <w:tcW w:type="dxa" w:w="2666"/>
+            <w:tcW w:type="dxa" w:w="2597"/>
             <w:tcBorders>
               <w:top w:val="none" w:color="FFFFFF" w:sz="0"/>
               <w:left w:val="none" w:color="FFFFFF" w:sz="0"/>
@@ -3463,13 +3463,13 @@
                 <w:sz w:val="15"/>
                 <w:szCs w:val="15"/>
               </w:rPr>
-              <w:t xml:space="preserve">10.5</w:t>
+              <w:t xml:space="preserve">10</w:t>
             </w:r>
           </w:p>
         </w:tc>
         <w:tc>
           <w:tcPr>
-            <w:tcW w:type="dxa" w:w="1891"/>
+            <w:tcW w:type="dxa" w:w="1759"/>
             <w:tcBorders>
               <w:top w:val="none" w:color="FFFFFF" w:sz="0"/>
               <w:left w:val="none" w:color="FFFFFF" w:sz="0"/>
@@ -3496,13 +3496,13 @@
                 <w:sz w:val="15"/>
                 <w:szCs w:val="15"/>
               </w:rPr>
-              <w:t xml:space="preserve">26</w:t>
+              <w:t xml:space="preserve">25.5</w:t>
             </w:r>
           </w:p>
         </w:tc>
         <w:tc>
           <w:tcPr>
-            <w:tcW w:type="dxa" w:w="1719"/>
+            <w:tcW w:type="dxa" w:w="1675"/>
             <w:tcBorders>
               <w:top w:val="none" w:color="FFFFFF" w:sz="0"/>
               <w:left w:val="none" w:color="FFFFFF" w:sz="0"/>
@@ -3529,13 +3529,13 @@
                 <w:sz w:val="15"/>
                 <w:szCs w:val="15"/>
               </w:rPr>
-              <w:t xml:space="preserve">37</w:t>
+              <w:t xml:space="preserve">36</w:t>
             </w:r>
           </w:p>
         </w:tc>
         <w:tc>
           <w:tcPr>
-            <w:tcW w:type="dxa" w:w="1719"/>
+            <w:tcW w:type="dxa" w:w="2094"/>
             <w:tcBorders>
               <w:top w:val="none" w:color="FFFFFF" w:sz="0"/>
               <w:left w:val="none" w:color="FFFFFF" w:sz="0"/>
@@ -3562,7 +3562,7 @@
                 <w:sz w:val="15"/>
                 <w:szCs w:val="15"/>
               </w:rPr>
-              <w:t xml:space="preserve">47</w:t>
+              <w:t xml:space="preserve">46</w:t>
             </w:r>
           </w:p>
         </w:tc>
@@ -3598,7 +3598,7 @@
           <w:sz w:val="19"/>
           <w:szCs w:val="19"/>
         </w:rPr>
-        <w:t xml:space="preserve">5 items, Q1 to Q5, about 10.5 minutes. What it shows: whether you can frame a prediction problem, split the rows honestly and read what a model's score says.</w:t>
+        <w:t xml:space="preserve">4 items, Q1 to Q4, about 10 minutes. What it shows: whether you can frame a prediction problem, split the rows honestly and read what a model's score says.</w:t>
       </w:r>
     </w:p>
     <w:p>
@@ -4238,7 +4238,7 @@
                 <w:sz w:val="18"/>
                 <w:szCs w:val="18"/>
               </w:rPr>
-              <w:t xml:space="preserve">  ·  Catch the peek</w:t>
+              <w:t xml:space="preserve">  ·  Sort the asks</w:t>
             </w:r>
             <w:r>
               <w:rPr>
@@ -4249,7 +4249,7 @@
                 <w:sz w:val="18"/>
                 <w:szCs w:val="18"/>
               </w:rPr>
-              <w:t xml:space="preserve">  ·  one letter</w:t>
+              <w:t xml:space="preserve">  ·  every correct letter</w:t>
             </w:r>
           </w:p>
           <w:p>
@@ -4264,7 +4264,7 @@
                 <w:sz w:val="21"/>
                 <w:szCs w:val="21"/>
               </w:rPr>
-              <w:t xml:space="preserve">On Thursday an analyst opens the sealed test slice, sees 0.79, moves the threshold until the test score improves and reports the new test score to the committee. What is wrong, and what should the committee be told?</w:t>
+              <w:t xml:space="preserve">The bank's marketing head brings four asks. Which need a model that predicts? Circle every correct letter.</w:t>
             </w:r>
           </w:p>
           <w:p>
@@ -4292,7 +4292,7 @@
                 <w:sz w:val="20"/>
                 <w:szCs w:val="20"/>
               </w:rPr>
-              <w:t xml:space="preserve">Nothing is wrong: the test rows were never used to fit the weights, so any score read from them stays honest.</w:t>
+              <w:t xml:space="preserve">the clients to call first next month, ranked by their chance of saying yes</w:t>
             </w:r>
           </w:p>
           <w:p>
@@ -4320,7 +4320,7 @@
                 <w:sz w:val="20"/>
                 <w:szCs w:val="20"/>
               </w:rPr>
-              <w:t xml:space="preserve">The test helped choose the threshold, so its score flatters; say it was spent and score once on new calls.</w:t>
+              <w:t xml:space="preserve">the count of yes answers in each month of 2009, for the annual report</w:t>
             </w:r>
           </w:p>
           <w:p>
@@ -4348,7 +4348,7 @@
                 <w:sz w:val="20"/>
                 <w:szCs w:val="20"/>
               </w:rPr>
-              <w:t xml:space="preserve">The threshold belongs on the training rows, so move it there and the test score can be reported as it stands.</w:t>
+              <w:t xml:space="preserve">the clients whose previous campaign ended in success, listed by branch</w:t>
             </w:r>
           </w:p>
           <w:p>
@@ -4376,7 +4376,7 @@
                 <w:sz w:val="20"/>
                 <w:szCs w:val="20"/>
               </w:rPr>
-              <w:t xml:space="preserve">The slice is too small at 8,238 clients, so merge it with validation and report the pooled score as the test.</w:t>
+              <w:t xml:space="preserve">each new client's own chance of a yes on a first call, before anyone calls</w:t>
             </w:r>
           </w:p>
         </w:tc>
@@ -4457,7 +4457,7 @@
                 <w:sz w:val="18"/>
                 <w:szCs w:val="18"/>
               </w:rPr>
-              <w:t xml:space="preserve">  ·  Judge the split</w:t>
+              <w:t xml:space="preserve">  ·  Read one score</w:t>
             </w:r>
             <w:r>
               <w:rPr>
@@ -4483,7 +4483,7 @@
                 <w:sz w:val="21"/>
                 <w:szCs w:val="21"/>
               </w:rPr>
-              <w:t xml:space="preserve">The calls run in date order. On the week's run the earliest 70 percent of rows say yes 5.6 percent of the time and the latest 30 percent say yes 24.6 percent of the time. Statement: for the question "whom do we call in the next campaign", a split by date estimates the model's score more honestly than a random split of all the rows. True or false, and why?</w:t>
+              <w:t xml:space="preserve">The logistic model on the customer table gives one client a score of 0.71, and its validation AUC is 0.761 (Exhibit 1A). What does the 0.71 say, and what would let the memo read it that way?</w:t>
             </w:r>
           </w:p>
           <w:p>
@@ -4511,7 +4511,7 @@
                 <w:sz w:val="20"/>
                 <w:szCs w:val="20"/>
               </w:rPr>
-              <w:t xml:space="preserve">True: a random split trains on later months than it validates on; train early and score late, like the ask.</w:t>
+              <w:t xml:space="preserve">A 71 percent chance of a yes, and the AUC of 0.761 already shows the scores can be read as chances.</w:t>
             </w:r>
           </w:p>
           <w:p>
@@ -4539,7 +4539,7 @@
                 <w:sz w:val="20"/>
                 <w:szCs w:val="20"/>
               </w:rPr>
-              <w:t xml:space="preserve">True: a split by date keeps more yes rows in validation, so its score is less noisy than a random split's.</w:t>
+              <w:t xml:space="preserve">The model is right on about 71 percent of the clients it scores, which the validation slice confirms.</w:t>
             </w:r>
           </w:p>
           <w:p>
@@ -4567,7 +4567,7 @@
                 <w:sz w:val="20"/>
                 <w:szCs w:val="20"/>
               </w:rPr>
-              <w:t xml:space="preserve">False: a stratified random split keeps 11.27 percent yes in every slice, so each is a fair sample of clients.</w:t>
+              <w:t xml:space="preserve">The client will say yes, since a score above 0.5 is a yes once the model beats calling nobody.</w:t>
             </w:r>
           </w:p>
           <w:p>
@@ -4595,7 +4595,7 @@
                 <w:sz w:val="20"/>
                 <w:szCs w:val="20"/>
               </w:rPr>
-              <w:t xml:space="preserve">False: the model never reads a date column, so the order in which the calls were made cannot move its score.</w:t>
+              <w:t xml:space="preserve">About 71 in 100 such clients say yes, if about 71 in 100 validation clients scored near 0.71 did.</w:t>
             </w:r>
           </w:p>
         </w:tc>
@@ -4667,7 +4667,7 @@
                 <w:sz w:val="18"/>
                 <w:szCs w:val="18"/>
               </w:rPr>
-              <w:t xml:space="preserve">   Medium</w:t>
+              <w:t xml:space="preserve">   Hard</w:t>
             </w:r>
             <w:r>
               <w:rPr>
@@ -4676,7 +4676,7 @@
                 <w:sz w:val="18"/>
                 <w:szCs w:val="18"/>
               </w:rPr>
-              <w:t xml:space="preserve">  ·  Read one score</w:t>
+              <w:t xml:space="preserve">  ·  Predict the fresh score</w:t>
             </w:r>
             <w:r>
               <w:rPr>
@@ -4702,7 +4702,7 @@
                 <w:sz w:val="21"/>
                 <w:szCs w:val="21"/>
               </w:rPr>
-              <w:t xml:space="preserve">The logistic model gives one client a score of 0.71. What does the 0.71 say?</w:t>
+              <w:t xml:space="preserve">On Monday a junior tried 60 versions of the model, each on a different list of columns, scored all 60 on the same 2,000 held-out clients and kept the best: accuracy 0.9055 there, where calling nobody scores 0.8875. On 6,238 fresh clients, where calling nobody scores 0.8873, what does the chosen version score, and what have the 2,000 clients become?</w:t>
             </w:r>
           </w:p>
           <w:p>
@@ -4730,7 +4730,7 @@
                 <w:sz w:val="20"/>
                 <w:szCs w:val="20"/>
               </w:rPr>
-              <w:t xml:space="preserve">The client will say yes, because any score above 0.5 is read by the model as a yes.</w:t>
+              <w:t xml:space="preserve">About 0.906 again, since the version never trained on the 2,000; they remain a fair test of it.</w:t>
             </w:r>
           </w:p>
           <w:p>
@@ -4758,7 +4758,7 @@
                 <w:sz w:val="20"/>
                 <w:szCs w:val="20"/>
               </w:rPr>
-              <w:t xml:space="preserve">The model is right about 71 percent of the clients it scores on the validation slice.</w:t>
+              <w:t xml:space="preserve">About 0.887, since the loop found only luck and its edge vanishes; the 2,000 have become training.</w:t>
             </w:r>
           </w:p>
           <w:p>
@@ -4786,7 +4786,7 @@
                 <w:sz w:val="20"/>
                 <w:szCs w:val="20"/>
               </w:rPr>
-              <w:t xml:space="preserve">The client is 71 percent more likely to say yes than the average client in the file is.</w:t>
+              <w:t xml:space="preserve">About 0.897: part of the 1.8-point edge was luck the loop picked; the 2,000 are now validation.</w:t>
             </w:r>
           </w:p>
           <w:p>
@@ -4814,7 +4814,7 @@
                 <w:sz w:val="20"/>
                 <w:szCs w:val="20"/>
               </w:rPr>
-              <w:t xml:space="preserve">Of clients scored like this one, about 71 in 100 say yes, if the scores are calibrated.</w:t>
+              <w:t xml:space="preserve">About 0.80, since 60 versions overfit the 2,000 and fall below calling nobody; they are now spent.</w:t>
             </w:r>
           </w:p>
         </w:tc>
@@ -4886,7 +4886,7 @@
                 <w:sz w:val="18"/>
                 <w:szCs w:val="18"/>
               </w:rPr>
-              <w:t xml:space="preserve">   Medium</w:t>
+              <w:t xml:space="preserve">   Hard</w:t>
             </w:r>
             <w:r>
               <w:rPr>
@@ -4895,7 +4895,7 @@
                 <w:sz w:val="18"/>
                 <w:szCs w:val="18"/>
               </w:rPr>
-              <w:t xml:space="preserve">  ·  Sort the asks</w:t>
+              <w:t xml:space="preserve">  ·  Judge the split</w:t>
             </w:r>
             <w:r>
               <w:rPr>
@@ -4906,7 +4906,7 @@
                 <w:sz w:val="18"/>
                 <w:szCs w:val="18"/>
               </w:rPr>
-              <w:t xml:space="preserve">  ·  every correct letter</w:t>
+              <w:t xml:space="preserve">  ·  one letter</w:t>
             </w:r>
           </w:p>
           <w:p>
@@ -4921,7 +4921,7 @@
                 <w:sz w:val="21"/>
                 <w:szCs w:val="21"/>
               </w:rPr>
-              <w:t xml:space="preserve">The bank's marketing head brings four asks. Which need a model that predicts? Circle every correct letter.</w:t>
+              <w:t xml:space="preserve">The calls run in date order. On the week's run the earliest 70 percent of rows say yes 5.6 percent of the time and the latest 30 percent say yes 24.6 percent of the time. Statement: for the question "whom do we call in the next campaign", a split by date estimates the model's score more honestly than a random split of all the rows. True or false, and why?</w:t>
             </w:r>
           </w:p>
           <w:p>
@@ -4949,7 +4949,7 @@
                 <w:sz w:val="20"/>
                 <w:szCs w:val="20"/>
               </w:rPr>
-              <w:t xml:space="preserve">the clients to call first next month, ranked by their chance of saying yes</w:t>
+              <w:t xml:space="preserve">True: a random split trains on later months than it validates on; train early and score late, like the ask.</w:t>
             </w:r>
           </w:p>
           <w:p>
@@ -4977,7 +4977,7 @@
                 <w:sz w:val="20"/>
                 <w:szCs w:val="20"/>
               </w:rPr>
-              <w:t xml:space="preserve">the count of yes answers in each month of 2009, for the annual report</w:t>
+              <w:t xml:space="preserve">True: a split by date keeps more yes rows in validation, so its score is less noisy than a random split's.</w:t>
             </w:r>
           </w:p>
           <w:p>
@@ -5005,7 +5005,7 @@
                 <w:sz w:val="20"/>
                 <w:szCs w:val="20"/>
               </w:rPr>
-              <w:t xml:space="preserve">the clients whose previous campaign ended in success, listed by branch</w:t>
+              <w:t xml:space="preserve">False: a stratified random split keeps 11.27 percent yes in every slice, so each is a fair sample of clients.</w:t>
             </w:r>
           </w:p>
           <w:p>
@@ -5033,435 +5033,7 @@
                 <w:sz w:val="20"/>
                 <w:szCs w:val="20"/>
               </w:rPr>
-              <w:t xml:space="preserve">each new client's own chance of a yes on a first call, before anyone calls</w:t>
-            </w:r>
-          </w:p>
-        </w:tc>
-      </w:tr>
-    </w:tbl>
-    <w:p>
-      <w:pPr>
-        <w:keepNext w:val="false"/>
-        <w:spacing w:after="120" w:before="0"/>
-      </w:pPr>
-    </w:p>
-    <w:tbl>
-      <w:tblPr>
-        <w:tblW w:type="dxa" w:w="9800"/>
-        <w:tblBorders>
-          <w:top w:val="none" w:color="FFFFFF" w:sz="0"/>
-          <w:left w:val="none" w:color="FFFFFF" w:sz="0"/>
-          <w:bottom w:val="none" w:color="FFFFFF" w:sz="0"/>
-          <w:right w:val="none" w:color="FFFFFF" w:sz="0"/>
-          <w:insideH w:val="none" w:color="FFFFFF" w:sz="0"/>
-          <w:insideV w:val="none" w:color="FFFFFF" w:sz="0"/>
-        </w:tblBorders>
-      </w:tblPr>
-      <w:tblGrid>
-        <w:gridCol w:w="9800"/>
-      </w:tblGrid>
-      <w:tr>
-        <w:trPr>
-          <w:cantSplit/>
-        </w:trPr>
-        <w:tc>
-          <w:tcPr>
-            <w:tcW w:type="dxa" w:w="9800"/>
-            <w:tcBorders>
-              <w:top w:val="none" w:color="FFFFFF" w:sz="0"/>
-              <w:left w:val="none" w:color="FFFFFF" w:sz="0"/>
-              <w:bottom w:val="none" w:color="FFFFFF" w:sz="0"/>
-              <w:right w:val="none" w:color="FFFFFF" w:sz="0"/>
-            </w:tcBorders>
-            <w:tcMar>
-              <w:top w:type="dxa" w:w="0"/>
-              <w:left w:type="dxa" w:w="0"/>
-              <w:bottom w:type="dxa" w:w="0"/>
-              <w:right w:type="dxa" w:w="0"/>
-            </w:tcMar>
-          </w:tcPr>
-          <w:p>
-            <w:pPr>
-              <w:keepNext/>
-              <w:spacing w:after="80" w:before="80" w:line="264"/>
-            </w:pPr>
-            <w:r>
-              <w:rPr>
-                <w:rFonts w:ascii="Arial" w:cs="Arial" w:eastAsia="Arial" w:hAnsi="Arial"/>
-                <w:b/>
-                <w:bCs/>
-                <w:color w:val="B37A33"/>
-                <w:sz w:val="19"/>
-                <w:szCs w:val="19"/>
-              </w:rPr>
-              <w:t xml:space="preserve">Word bank 1</w:t>
-            </w:r>
-            <w:r>
-              <w:rPr>
-                <w:rFonts w:ascii="Arial" w:cs="Arial" w:eastAsia="Arial" w:hAnsi="Arial"/>
-                <w:i/>
-                <w:iCs/>
-                <w:color w:val="6B675E"/>
-                <w:sz w:val="18"/>
-                <w:szCs w:val="18"/>
-              </w:rPr>
-              <w:t xml:space="preserve">   Write the letter of the word or phrase that completes each statement. Each is used once at most, and some are not used.</w:t>
-            </w:r>
-          </w:p>
-          <w:tbl>
-            <w:tblPr>
-              <w:tblW w:type="dxa" w:w="9798"/>
-              <w:tblBorders>
-                <w:top w:val="single" w:color="FFFFFF" w:sz="4"/>
-                <w:left w:val="single" w:color="FFFFFF" w:sz="4"/>
-                <w:bottom w:val="single" w:color="FFFFFF" w:sz="4"/>
-                <w:right w:val="single" w:color="FFFFFF" w:sz="4"/>
-                <w:insideH w:val="single" w:color="FFFFFF" w:sz="4"/>
-                <w:insideV w:val="single" w:color="FFFFFF" w:sz="4"/>
-              </w:tblBorders>
-            </w:tblPr>
-            <w:tblGrid>
-              <w:gridCol w:w="3266"/>
-              <w:gridCol w:w="3266"/>
-              <w:gridCol w:w="3266"/>
-            </w:tblGrid>
-            <w:tr>
-              <w:trPr>
-                <w:cantSplit/>
-              </w:trPr>
-              <w:tc>
-                <w:tcPr>
-                  <w:tcW w:type="dxa" w:w="3266"/>
-                  <w:tcBorders>
-                    <w:top w:val="single" w:color="FFFFFF" w:sz="4"/>
-                    <w:left w:val="single" w:color="FFFFFF" w:sz="4"/>
-                    <w:bottom w:val="single" w:color="FFFFFF" w:sz="4"/>
-                    <w:right w:val="single" w:color="FFFFFF" w:sz="4"/>
-                  </w:tcBorders>
-                  <w:shd w:fill="F3F1EA" w:color="auto" w:val="clear"/>
-                  <w:tcMar>
-                    <w:top w:type="dxa" w:w="60"/>
-                    <w:left w:type="dxa" w:w="140"/>
-                    <w:bottom w:type="dxa" w:w="60"/>
-                    <w:right w:type="dxa" w:w="100"/>
-                  </w:tcMar>
-                  <w:vAlign w:val="center"/>
-                </w:tcPr>
-                <w:p>
-                  <w:pPr>
-                    <w:keepNext/>
-                    <w:spacing w:after="0" w:line="252"/>
-                  </w:pPr>
-                  <w:r>
-                    <w:rPr>
-                      <w:rFonts w:ascii="Arial" w:cs="Arial" w:eastAsia="Arial" w:hAnsi="Arial"/>
-                      <w:b/>
-                      <w:bCs/>
-                      <w:color w:val="B37A33"/>
-                      <w:sz w:val="20"/>
-                      <w:szCs w:val="20"/>
-                    </w:rPr>
-                    <w:t xml:space="preserve">A   </w:t>
-                  </w:r>
-                  <w:r>
-                    <w:rPr>
-                      <w:rFonts w:ascii="Arial" w:cs="Arial" w:eastAsia="Arial" w:hAnsi="Arial"/>
-                      <w:color w:val="1C1B16"/>
-                      <w:sz w:val="20"/>
-                      <w:szCs w:val="20"/>
-                    </w:rPr>
-                    <w:t xml:space="preserve">training</w:t>
-                  </w:r>
-                </w:p>
-              </w:tc>
-              <w:tc>
-                <w:tcPr>
-                  <w:tcW w:type="dxa" w:w="3266"/>
-                  <w:tcBorders>
-                    <w:top w:val="single" w:color="FFFFFF" w:sz="4"/>
-                    <w:left w:val="single" w:color="FFFFFF" w:sz="4"/>
-                    <w:bottom w:val="single" w:color="FFFFFF" w:sz="4"/>
-                    <w:right w:val="single" w:color="FFFFFF" w:sz="4"/>
-                  </w:tcBorders>
-                  <w:shd w:fill="F3F1EA" w:color="auto" w:val="clear"/>
-                  <w:tcMar>
-                    <w:top w:type="dxa" w:w="60"/>
-                    <w:left w:type="dxa" w:w="140"/>
-                    <w:bottom w:type="dxa" w:w="60"/>
-                    <w:right w:type="dxa" w:w="100"/>
-                  </w:tcMar>
-                  <w:vAlign w:val="center"/>
-                </w:tcPr>
-                <w:p>
-                  <w:pPr>
-                    <w:keepNext/>
-                    <w:spacing w:after="0" w:line="252"/>
-                  </w:pPr>
-                  <w:r>
-                    <w:rPr>
-                      <w:rFonts w:ascii="Arial" w:cs="Arial" w:eastAsia="Arial" w:hAnsi="Arial"/>
-                      <w:b/>
-                      <w:bCs/>
-                      <w:color w:val="B37A33"/>
-                      <w:sz w:val="20"/>
-                      <w:szCs w:val="20"/>
-                    </w:rPr>
-                    <w:t xml:space="preserve">B   </w:t>
-                  </w:r>
-                  <w:r>
-                    <w:rPr>
-                      <w:rFonts w:ascii="Arial" w:cs="Arial" w:eastAsia="Arial" w:hAnsi="Arial"/>
-                      <w:color w:val="1C1B16"/>
-                      <w:sz w:val="20"/>
-                      <w:szCs w:val="20"/>
-                    </w:rPr>
-                    <w:t xml:space="preserve">validation</w:t>
-                  </w:r>
-                </w:p>
-              </w:tc>
-              <w:tc>
-                <w:tcPr>
-                  <w:tcW w:type="dxa" w:w="3266"/>
-                  <w:tcBorders>
-                    <w:top w:val="single" w:color="FFFFFF" w:sz="4"/>
-                    <w:left w:val="single" w:color="FFFFFF" w:sz="4"/>
-                    <w:bottom w:val="single" w:color="FFFFFF" w:sz="4"/>
-                    <w:right w:val="single" w:color="FFFFFF" w:sz="4"/>
-                  </w:tcBorders>
-                  <w:shd w:fill="F3F1EA" w:color="auto" w:val="clear"/>
-                  <w:tcMar>
-                    <w:top w:type="dxa" w:w="60"/>
-                    <w:left w:type="dxa" w:w="140"/>
-                    <w:bottom w:type="dxa" w:w="60"/>
-                    <w:right w:type="dxa" w:w="100"/>
-                  </w:tcMar>
-                  <w:vAlign w:val="center"/>
-                </w:tcPr>
-                <w:p>
-                  <w:pPr>
-                    <w:keepNext/>
-                    <w:spacing w:after="0" w:line="252"/>
-                  </w:pPr>
-                  <w:r>
-                    <w:rPr>
-                      <w:rFonts w:ascii="Arial" w:cs="Arial" w:eastAsia="Arial" w:hAnsi="Arial"/>
-                      <w:b/>
-                      <w:bCs/>
-                      <w:color w:val="B37A33"/>
-                      <w:sz w:val="20"/>
-                      <w:szCs w:val="20"/>
-                    </w:rPr>
-                    <w:t xml:space="preserve">C   </w:t>
-                  </w:r>
-                  <w:r>
-                    <w:rPr>
-                      <w:rFonts w:ascii="Arial" w:cs="Arial" w:eastAsia="Arial" w:hAnsi="Arial"/>
-                      <w:color w:val="1C1B16"/>
-                      <w:sz w:val="20"/>
-                      <w:szCs w:val="20"/>
-                    </w:rPr>
-                    <w:t xml:space="preserve">test</w:t>
-                  </w:r>
-                </w:p>
-              </w:tc>
-            </w:tr>
-            <w:tr>
-              <w:trPr>
-                <w:cantSplit/>
-              </w:trPr>
-              <w:tc>
-                <w:tcPr>
-                  <w:tcW w:type="dxa" w:w="3266"/>
-                  <w:tcBorders>
-                    <w:top w:val="single" w:color="FFFFFF" w:sz="4"/>
-                    <w:left w:val="single" w:color="FFFFFF" w:sz="4"/>
-                    <w:bottom w:val="single" w:color="FFFFFF" w:sz="4"/>
-                    <w:right w:val="single" w:color="FFFFFF" w:sz="4"/>
-                  </w:tcBorders>
-                  <w:shd w:fill="F3F1EA" w:color="auto" w:val="clear"/>
-                  <w:tcMar>
-                    <w:top w:type="dxa" w:w="60"/>
-                    <w:left w:type="dxa" w:w="140"/>
-                    <w:bottom w:type="dxa" w:w="60"/>
-                    <w:right w:type="dxa" w:w="100"/>
-                  </w:tcMar>
-                  <w:vAlign w:val="center"/>
-                </w:tcPr>
-                <w:p>
-                  <w:pPr>
-                    <w:keepNext/>
-                    <w:spacing w:after="0" w:line="252"/>
-                  </w:pPr>
-                  <w:r>
-                    <w:rPr>
-                      <w:rFonts w:ascii="Arial" w:cs="Arial" w:eastAsia="Arial" w:hAnsi="Arial"/>
-                      <w:b/>
-                      <w:bCs/>
-                      <w:color w:val="B37A33"/>
-                      <w:sz w:val="20"/>
-                      <w:szCs w:val="20"/>
-                    </w:rPr>
-                    <w:t xml:space="preserve">D   </w:t>
-                  </w:r>
-                  <w:r>
-                    <w:rPr>
-                      <w:rFonts w:ascii="Arial" w:cs="Arial" w:eastAsia="Arial" w:hAnsi="Arial"/>
-                      <w:color w:val="1C1B16"/>
-                      <w:sz w:val="20"/>
-                      <w:szCs w:val="20"/>
-                    </w:rPr>
-                    <w:t xml:space="preserve">baseline</w:t>
-                  </w:r>
-                </w:p>
-              </w:tc>
-              <w:tc>
-                <w:tcPr>
-                  <w:tcW w:type="dxa" w:w="3266"/>
-                  <w:tcBorders>
-                    <w:top w:val="single" w:color="FFFFFF" w:sz="4"/>
-                    <w:left w:val="single" w:color="FFFFFF" w:sz="4"/>
-                    <w:bottom w:val="single" w:color="FFFFFF" w:sz="4"/>
-                    <w:right w:val="single" w:color="FFFFFF" w:sz="4"/>
-                  </w:tcBorders>
-                  <w:shd w:fill="F3F1EA" w:color="auto" w:val="clear"/>
-                  <w:tcMar>
-                    <w:top w:type="dxa" w:w="60"/>
-                    <w:left w:type="dxa" w:w="140"/>
-                    <w:bottom w:type="dxa" w:w="60"/>
-                    <w:right w:type="dxa" w:w="100"/>
-                  </w:tcMar>
-                  <w:vAlign w:val="center"/>
-                </w:tcPr>
-                <w:p>
-                  <w:pPr>
-                    <w:keepNext/>
-                    <w:spacing w:after="0" w:line="252"/>
-                  </w:pPr>
-                  <w:r>
-                    <w:rPr>
-                      <w:rFonts w:ascii="Arial" w:cs="Arial" w:eastAsia="Arial" w:hAnsi="Arial"/>
-                      <w:b/>
-                      <w:bCs/>
-                      <w:color w:val="B37A33"/>
-                      <w:sz w:val="20"/>
-                      <w:szCs w:val="20"/>
-                    </w:rPr>
-                    <w:t xml:space="preserve">E   </w:t>
-                  </w:r>
-                  <w:r>
-                    <w:rPr>
-                      <w:rFonts w:ascii="Arial" w:cs="Arial" w:eastAsia="Arial" w:hAnsi="Arial"/>
-                      <w:color w:val="1C1B16"/>
-                      <w:sz w:val="20"/>
-                      <w:szCs w:val="20"/>
-                    </w:rPr>
-                    <w:t xml:space="preserve">threshold</w:t>
-                  </w:r>
-                </w:p>
-              </w:tc>
-              <w:tc>
-                <w:tcPr>
-                  <w:tcW w:type="dxa" w:w="3266"/>
-                  <w:tcBorders>
-                    <w:top w:val="single" w:color="FFFFFF" w:sz="4"/>
-                    <w:left w:val="single" w:color="FFFFFF" w:sz="4"/>
-                    <w:bottom w:val="single" w:color="FFFFFF" w:sz="4"/>
-                    <w:right w:val="single" w:color="FFFFFF" w:sz="4"/>
-                  </w:tcBorders>
-                  <w:shd w:fill="F3F1EA" w:color="auto" w:val="clear"/>
-                  <w:tcMar>
-                    <w:top w:type="dxa" w:w="60"/>
-                    <w:left w:type="dxa" w:w="140"/>
-                    <w:bottom w:type="dxa" w:w="60"/>
-                    <w:right w:type="dxa" w:w="100"/>
-                  </w:tcMar>
-                  <w:vAlign w:val="center"/>
-                </w:tcPr>
-                <w:p>
-                  <w:pPr>
-                    <w:keepNext/>
-                    <w:spacing w:after="80" w:before="0" w:line="276"/>
-                  </w:pPr>
-                  <w:r>
-                    <w:rPr>
-                      <w:rFonts w:ascii="Arial" w:cs="Arial" w:eastAsia="Arial" w:hAnsi="Arial"/>
-                      <w:color w:val="1C1B16"/>
-                      <w:sz w:val="21"/>
-                      <w:szCs w:val="21"/>
-                    </w:rPr>
-                    <w:t xml:space="preserve"/>
-                  </w:r>
-                </w:p>
-              </w:tc>
-            </w:tr>
-          </w:tbl>
-          <w:p>
-            <w:pPr>
-              <w:keepNext/>
-              <w:spacing w:after="140" w:before="0"/>
-            </w:pPr>
-          </w:p>
-          <w:p>
-            <w:pPr>
-              <w:keepNext/>
-              <w:spacing w:after="60" w:before="60" w:line="276"/>
-            </w:pPr>
-            <w:r>
-              <w:rPr>
-                <w:rFonts w:ascii="Arial" w:cs="Arial" w:eastAsia="Arial" w:hAnsi="Arial"/>
-                <w:b/>
-                <w:bCs/>
-                <w:color w:val="B37A33"/>
-                <w:sz w:val="22"/>
-                <w:szCs w:val="22"/>
-              </w:rPr>
-              <w:t xml:space="preserve">Q5</w:t>
-            </w:r>
-            <w:r>
-              <w:rPr>
-                <w:rFonts w:ascii="Arial" w:cs="Arial" w:eastAsia="Arial" w:hAnsi="Arial"/>
-                <w:b/>
-                <w:bCs/>
-                <w:color w:val="6B675E"/>
-                <w:sz w:val="18"/>
-                <w:szCs w:val="18"/>
-              </w:rPr>
-              <w:t xml:space="preserve">   Easy</w:t>
-            </w:r>
-            <w:r>
-              <w:rPr>
-                <w:rFonts w:ascii="Arial" w:cs="Arial" w:eastAsia="Arial" w:hAnsi="Arial"/>
-                <w:color w:val="6B675E"/>
-                <w:sz w:val="18"/>
-                <w:szCs w:val="18"/>
-              </w:rPr>
-              <w:t xml:space="preserve">  ·  Name the sealed slice</w:t>
-            </w:r>
-            <w:r>
-              <w:rPr>
-                <w:rFonts w:ascii="Arial" w:cs="Arial" w:eastAsia="Arial" w:hAnsi="Arial"/>
-                <w:i/>
-                <w:iCs/>
-                <w:color w:val="6B675E"/>
-                <w:sz w:val="18"/>
-                <w:szCs w:val="18"/>
-              </w:rPr>
-              <w:t xml:space="preserve">  ·  a letter from Word bank 1</w:t>
-            </w:r>
-          </w:p>
-          <w:p>
-            <w:pPr>
-              <w:keepNext/>
-              <w:spacing w:after="80" w:line="276"/>
-            </w:pPr>
-            <w:r>
-              <w:rPr>
-                <w:rFonts w:ascii="Arial" w:cs="Arial" w:eastAsia="Arial" w:hAnsi="Arial"/>
-                <w:color w:val="1C1B16"/>
-                <w:sz w:val="21"/>
-                <w:szCs w:val="21"/>
-              </w:rPr>
-              <w:t xml:space="preserve">Of the three data splits, the ____ set is spent once, at the end.</w:t>
+              <w:t xml:space="preserve">False: the model never reads a date column, so the order in which the calls were made cannot move its score.</w:t>
             </w:r>
           </w:p>
         </w:tc>
@@ -5497,7 +5069,7 @@
           <w:sz w:val="19"/>
           <w:szCs w:val="19"/>
         </w:rPr>
-        <w:t xml:space="preserve">6 items, Q6 to Q11, about 15.5 minutes. What it shows: whether you can read a confusion matrix, price each error and set the line the business can afford.</w:t>
+        <w:t xml:space="preserve">5 items, Q5 to Q9, about 15.5 minutes. What it shows: whether you can read a confusion matrix, price each error and set the line the business can afford.</w:t>
       </w:r>
     </w:p>
     <w:p>
@@ -6222,7 +5794,7 @@
                 <w:sz w:val="22"/>
                 <w:szCs w:val="22"/>
               </w:rPr>
-              <w:t xml:space="preserve">Q6</w:t>
+              <w:t xml:space="preserve">Q5</w:t>
             </w:r>
             <w:r>
               <w:rPr>
@@ -6441,7 +6013,7 @@
                 <w:sz w:val="22"/>
                 <w:szCs w:val="22"/>
               </w:rPr>
-              <w:t xml:space="preserve">Q7</w:t>
+              <w:t xml:space="preserve">Q6</w:t>
             </w:r>
             <w:r>
               <w:rPr>
@@ -6610,7 +6182,7 @@
                 <w:sz w:val="22"/>
                 <w:szCs w:val="22"/>
               </w:rPr>
-              <w:t xml:space="preserve">Q8</w:t>
+              <w:t xml:space="preserve">Q7</w:t>
             </w:r>
             <w:r>
               <w:rPr>
@@ -7756,7 +7328,7 @@
                 <w:sz w:val="22"/>
                 <w:szCs w:val="22"/>
               </w:rPr>
-              <w:t xml:space="preserve">Q9</w:t>
+              <w:t xml:space="preserve">Q8</w:t>
             </w:r>
             <w:r>
               <w:rPr>
@@ -7767,7 +7339,7 @@
                 <w:sz w:val="18"/>
                 <w:szCs w:val="18"/>
               </w:rPr>
-              <w:t xml:space="preserve">   Medium</w:t>
+              <w:t xml:space="preserve">   Hard</w:t>
             </w:r>
             <w:r>
               <w:rPr>
@@ -7776,7 +7348,7 @@
                 <w:sz w:val="18"/>
                 <w:szCs w:val="18"/>
               </w:rPr>
-              <w:t xml:space="preserve">  ·  Price two thresholds</w:t>
+              <w:t xml:space="preserve">  ·  Choose by F1 or by the bill</w:t>
             </w:r>
             <w:r>
               <w:rPr>
@@ -7787,7 +7359,7 @@
                 <w:sz w:val="18"/>
                 <w:szCs w:val="18"/>
               </w:rPr>
-              <w:t xml:space="preserve">  ·  one letter</w:t>
+              <w:t xml:space="preserve">  ·  show the working</w:t>
             </w:r>
           </w:p>
           <w:p>
@@ -7802,121 +7374,71 @@
                 <w:sz w:val="21"/>
                 <w:szCs w:val="21"/>
               </w:rPr>
-              <w:t xml:space="preserve">At Rs 40 a wasted call and Rs 1,200 a missed buyer, what is the error bill at the thresholds of 0.5 and 0.10 in Exhibit 2B, and which costs less?</w:t>
+              <w:t xml:space="preserve">Two teammates choose between the thresholds of 0.20 and 0.10 in Exhibit 2B: one by F1, the other by the error bill at Rs 40 a wasted call and Rs 1,200 a missed buyer. Which threshold does each choose, with the figures that decide it, and why do the two choices differ? Show the working.</w:t>
             </w:r>
           </w:p>
           <w:p>
             <w:pPr>
               <w:keepNext/>
-              <w:keepLines/>
-              <w:spacing w:after="60" w:before="0" w:line="264"/>
-              <w:ind w:left="360" w:hanging="360"/>
-            </w:pPr>
-            <w:r>
-              <w:rPr>
-                <w:rFonts w:ascii="Arial" w:cs="Arial" w:eastAsia="Arial" w:hAnsi="Arial"/>
-                <w:b/>
-                <w:bCs/>
-                <w:color w:val="1C1B16"/>
-                <w:sz w:val="20"/>
-                <w:szCs w:val="20"/>
-              </w:rPr>
-              <w:t xml:space="preserve">A.  </w:t>
-            </w:r>
-            <w:r>
-              <w:rPr>
-                <w:rFonts w:ascii="Arial" w:cs="Arial" w:eastAsia="Arial" w:hAnsi="Arial"/>
-                <w:color w:val="1C1B16"/>
-                <w:sz w:val="20"/>
-                <w:szCs w:val="20"/>
-              </w:rPr>
-              <w:t xml:space="preserve">Rs 142,960 at 0.5 and Rs 2,578,080 at 0.10, so 0.5 is cheaper by Rs 2,435,120.</w:t>
-            </w:r>
-          </w:p>
-          <w:p>
-            <w:pPr>
-              <w:keepNext/>
-              <w:keepLines/>
-              <w:spacing w:after="60" w:before="0" w:line="264"/>
-              <w:ind w:left="360" w:hanging="360"/>
-            </w:pPr>
-            <w:r>
-              <w:rPr>
-                <w:rFonts w:ascii="Arial" w:cs="Arial" w:eastAsia="Arial" w:hAnsi="Arial"/>
-                <w:b/>
-                <w:bCs/>
-                <w:color w:val="1C1B16"/>
-                <w:sz w:val="20"/>
-                <w:szCs w:val="20"/>
-              </w:rPr>
-              <w:t xml:space="preserve">B.  </w:t>
-            </w:r>
-            <w:r>
-              <w:rPr>
-                <w:rFonts w:ascii="Arial" w:cs="Arial" w:eastAsia="Arial" w:hAnsi="Arial"/>
-                <w:color w:val="1C1B16"/>
-                <w:sz w:val="20"/>
-                <w:szCs w:val="20"/>
-              </w:rPr>
-              <w:t xml:space="preserve">Rs 908,560 at 0.5 and Rs 459,920 at 0.10, so 0.10 is cheaper by Rs 448,640.</w:t>
-            </w:r>
-          </w:p>
-          <w:p>
-            <w:pPr>
-              <w:keepNext/>
-              <w:keepLines/>
-              <w:spacing w:after="60" w:before="0" w:line="264"/>
-              <w:ind w:left="360" w:hanging="360"/>
-            </w:pPr>
-            <w:r>
-              <w:rPr>
-                <w:rFonts w:ascii="Arial" w:cs="Arial" w:eastAsia="Arial" w:hAnsi="Arial"/>
-                <w:b/>
-                <w:bCs/>
-                <w:color w:val="1C1B16"/>
-                <w:sz w:val="20"/>
-                <w:szCs w:val="20"/>
-              </w:rPr>
-              <w:t xml:space="preserve">C.  </w:t>
-            </w:r>
-            <w:r>
-              <w:rPr>
-                <w:rFonts w:ascii="Arial" w:cs="Arial" w:eastAsia="Arial" w:hAnsi="Arial"/>
-                <w:color w:val="1C1B16"/>
-                <w:sz w:val="20"/>
-                <w:szCs w:val="20"/>
-              </w:rPr>
-              <w:t xml:space="preserve">Rs 3,760 at 0.5 and Rs 85,520 at 0.10, so 0.5 is cheaper by Rs 81,760 in all.</w:t>
-            </w:r>
-          </w:p>
-          <w:p>
-            <w:pPr>
-              <w:keepNext w:val="false"/>
-              <w:keepLines/>
-              <w:spacing w:after="60" w:before="0" w:line="264"/>
-              <w:ind w:left="360" w:hanging="360"/>
-            </w:pPr>
-            <w:r>
-              <w:rPr>
-                <w:rFonts w:ascii="Arial" w:cs="Arial" w:eastAsia="Arial" w:hAnsi="Arial"/>
-                <w:b/>
-                <w:bCs/>
-                <w:color w:val="1C1B16"/>
-                <w:sz w:val="20"/>
-                <w:szCs w:val="20"/>
-              </w:rPr>
-              <w:t xml:space="preserve">D.  </w:t>
-            </w:r>
-            <w:r>
-              <w:rPr>
-                <w:rFonts w:ascii="Arial" w:cs="Arial" w:eastAsia="Arial" w:hAnsi="Arial"/>
-                <w:color w:val="1C1B16"/>
-                <w:sz w:val="20"/>
-                <w:szCs w:val="20"/>
-              </w:rPr>
-              <w:t xml:space="preserve">Rs 904,800 at 0.5 and Rs 374,400 at 0.10, so 0.10 is cheaper by Rs 530,400.</w:t>
-            </w:r>
-          </w:p>
+              <w:spacing w:after="60" w:before="0"/>
+            </w:pPr>
+          </w:p>
+          <w:tbl>
+            <w:tblPr>
+              <w:tblW w:type="dxa" w:w="9800"/>
+              <w:tblBorders>
+                <w:top w:val="single" w:color="D5D0C4" w:sz="4"/>
+                <w:left w:val="single" w:color="D5D0C4" w:sz="4"/>
+                <w:bottom w:val="single" w:color="D5D0C4" w:sz="4"/>
+                <w:right w:val="single" w:color="D5D0C4" w:sz="4"/>
+                <w:insideH w:val="single" w:color="D5D0C4" w:sz="4"/>
+                <w:insideV w:val="single" w:color="D5D0C4" w:sz="4"/>
+              </w:tblBorders>
+            </w:tblPr>
+            <w:tblGrid>
+              <w:gridCol w:w="9800"/>
+            </w:tblGrid>
+            <w:tr>
+              <w:trPr>
+                <w:cantSplit/>
+                <w:trHeight w:val="1500" w:hRule="atLeast"/>
+              </w:trPr>
+              <w:tc>
+                <w:tcPr>
+                  <w:tcW w:type="dxa" w:w="9800"/>
+                  <w:tcBorders>
+                    <w:top w:val="single" w:color="D5D0C4" w:sz="4"/>
+                    <w:left w:val="single" w:color="D5D0C4" w:sz="4"/>
+                    <w:bottom w:val="single" w:color="D5D0C4" w:sz="4"/>
+                    <w:right w:val="single" w:color="D5D0C4" w:sz="4"/>
+                  </w:tcBorders>
+                  <w:tcMar>
+                    <w:top w:type="dxa" w:w="60"/>
+                    <w:left w:type="dxa" w:w="120"/>
+                    <w:bottom w:type="dxa" w:w="60"/>
+                    <w:right w:type="dxa" w:w="120"/>
+                  </w:tcMar>
+                  <w:vAlign w:val="top"/>
+                </w:tcPr>
+                <w:p>
+                  <w:pPr>
+                    <w:keepNext w:val="false"/>
+                    <w:spacing w:after="0"/>
+                  </w:pPr>
+                  <w:r>
+                    <w:rPr>
+                      <w:rFonts w:ascii="Arial" w:cs="Arial" w:eastAsia="Arial" w:hAnsi="Arial"/>
+                      <w:color w:val="6B675E"/>
+                      <w:sz w:val="15"/>
+                      <w:szCs w:val="15"/>
+                    </w:rPr>
+                    <w:t xml:space="preserve">Working. The final answer goes on the answer sheet.</w:t>
+                  </w:r>
+                </w:p>
+              </w:tc>
+            </w:tr>
+          </w:tbl>
+          <w:p/>
         </w:tc>
       </w:tr>
     </w:tbl>
@@ -7975,7 +7497,7 @@
                 <w:sz w:val="22"/>
                 <w:szCs w:val="22"/>
               </w:rPr>
-              <w:t xml:space="preserve">Q10</w:t>
+              <w:t xml:space="preserve">Q9</w:t>
             </w:r>
             <w:r>
               <w:rPr>
@@ -8049,7 +7571,7 @@
                 <w:sz w:val="20"/>
                 <w:szCs w:val="20"/>
               </w:rPr>
-              <w:t xml:space="preserve">Keep the cost line and call the first 1,000 clients above it in the order the file lists them.</w:t>
+              <w:t xml:space="preserve">Call the 864 clients above 0.20, at a precision of 0.435, and hold the other 136 calls in reserve.</w:t>
             </w:r>
           </w:p>
           <w:p>
@@ -8077,7 +7599,7 @@
                 <w:sz w:val="20"/>
                 <w:szCs w:val="20"/>
               </w:rPr>
-              <w:t xml:space="preserve">Raise the threshold to 0.5 and call its 268 clients, since precision is the highest at that line.</w:t>
+              <w:t xml:space="preserve">Call the 268 clients above 0.5, where precision is at its highest, and save the rest of the budget.</w:t>
             </w:r>
           </w:p>
           <w:p>
@@ -8105,7 +7627,7 @@
                 <w:sz w:val="20"/>
                 <w:szCs w:val="20"/>
               </w:rPr>
-              <w:t xml:space="preserve">Rank every client by score and call the top 1,000; 404 of them said yes, 3.6 times the base rate.</w:t>
+              <w:t xml:space="preserve">Rank every client by score and call the top 1,000, wherever that cut happens to fall on the scores.</w:t>
             </w:r>
           </w:p>
           <w:p>
@@ -8133,424 +7655,7 @@
                 <w:sz w:val="20"/>
                 <w:szCs w:val="20"/>
               </w:rPr>
-              <w:t xml:space="preserve">Call 1,000 clients drawn at random, since a ranking on an outcome this rare is mostly noise.</w:t>
-            </w:r>
-          </w:p>
-        </w:tc>
-      </w:tr>
-    </w:tbl>
-    <w:p>
-      <w:pPr>
-        <w:keepNext w:val="false"/>
-        <w:spacing w:after="120" w:before="0"/>
-      </w:pPr>
-    </w:p>
-    <w:tbl>
-      <w:tblPr>
-        <w:tblW w:type="dxa" w:w="9800"/>
-        <w:tblBorders>
-          <w:top w:val="none" w:color="FFFFFF" w:sz="0"/>
-          <w:left w:val="none" w:color="FFFFFF" w:sz="0"/>
-          <w:bottom w:val="none" w:color="FFFFFF" w:sz="0"/>
-          <w:right w:val="none" w:color="FFFFFF" w:sz="0"/>
-          <w:insideH w:val="none" w:color="FFFFFF" w:sz="0"/>
-          <w:insideV w:val="none" w:color="FFFFFF" w:sz="0"/>
-        </w:tblBorders>
-      </w:tblPr>
-      <w:tblGrid>
-        <w:gridCol w:w="9800"/>
-      </w:tblGrid>
-      <w:tr>
-        <w:trPr>
-          <w:cantSplit/>
-        </w:trPr>
-        <w:tc>
-          <w:tcPr>
-            <w:tcW w:type="dxa" w:w="9800"/>
-            <w:tcBorders>
-              <w:top w:val="none" w:color="FFFFFF" w:sz="0"/>
-              <w:left w:val="none" w:color="FFFFFF" w:sz="0"/>
-              <w:bottom w:val="none" w:color="FFFFFF" w:sz="0"/>
-              <w:right w:val="none" w:color="FFFFFF" w:sz="0"/>
-            </w:tcBorders>
-            <w:tcMar>
-              <w:top w:type="dxa" w:w="0"/>
-              <w:left w:type="dxa" w:w="0"/>
-              <w:bottom w:type="dxa" w:w="0"/>
-              <w:right w:type="dxa" w:w="0"/>
-            </w:tcMar>
-          </w:tcPr>
-          <w:p>
-            <w:pPr>
-              <w:keepNext/>
-              <w:spacing w:after="80" w:before="80" w:line="264"/>
-            </w:pPr>
-            <w:r>
-              <w:rPr>
-                <w:rFonts w:ascii="Arial" w:cs="Arial" w:eastAsia="Arial" w:hAnsi="Arial"/>
-                <w:b/>
-                <w:bCs/>
-                <w:color w:val="B37A33"/>
-                <w:sz w:val="19"/>
-                <w:szCs w:val="19"/>
-              </w:rPr>
-              <w:t xml:space="preserve">Word bank 2</w:t>
-            </w:r>
-            <w:r>
-              <w:rPr>
-                <w:rFonts w:ascii="Arial" w:cs="Arial" w:eastAsia="Arial" w:hAnsi="Arial"/>
-                <w:i/>
-                <w:iCs/>
-                <w:color w:val="6B675E"/>
-                <w:sz w:val="18"/>
-                <w:szCs w:val="18"/>
-              </w:rPr>
-              <w:t xml:space="preserve">   Write the letter of the word or phrase that completes each statement. Each is used once at most, and some are not used.</w:t>
-            </w:r>
-          </w:p>
-          <w:tbl>
-            <w:tblPr>
-              <w:tblW w:type="dxa" w:w="9798"/>
-              <w:tblBorders>
-                <w:top w:val="single" w:color="FFFFFF" w:sz="4"/>
-                <w:left w:val="single" w:color="FFFFFF" w:sz="4"/>
-                <w:bottom w:val="single" w:color="FFFFFF" w:sz="4"/>
-                <w:right w:val="single" w:color="FFFFFF" w:sz="4"/>
-                <w:insideH w:val="single" w:color="FFFFFF" w:sz="4"/>
-                <w:insideV w:val="single" w:color="FFFFFF" w:sz="4"/>
-              </w:tblBorders>
-            </w:tblPr>
-            <w:tblGrid>
-              <w:gridCol w:w="3266"/>
-              <w:gridCol w:w="3266"/>
-              <w:gridCol w:w="3266"/>
-            </w:tblGrid>
-            <w:tr>
-              <w:trPr>
-                <w:cantSplit/>
-              </w:trPr>
-              <w:tc>
-                <w:tcPr>
-                  <w:tcW w:type="dxa" w:w="3266"/>
-                  <w:tcBorders>
-                    <w:top w:val="single" w:color="FFFFFF" w:sz="4"/>
-                    <w:left w:val="single" w:color="FFFFFF" w:sz="4"/>
-                    <w:bottom w:val="single" w:color="FFFFFF" w:sz="4"/>
-                    <w:right w:val="single" w:color="FFFFFF" w:sz="4"/>
-                  </w:tcBorders>
-                  <w:shd w:fill="F3F1EA" w:color="auto" w:val="clear"/>
-                  <w:tcMar>
-                    <w:top w:type="dxa" w:w="60"/>
-                    <w:left w:type="dxa" w:w="140"/>
-                    <w:bottom w:type="dxa" w:w="60"/>
-                    <w:right w:type="dxa" w:w="100"/>
-                  </w:tcMar>
-                  <w:vAlign w:val="center"/>
-                </w:tcPr>
-                <w:p>
-                  <w:pPr>
-                    <w:keepNext/>
-                    <w:spacing w:after="0" w:line="252"/>
-                  </w:pPr>
-                  <w:r>
-                    <w:rPr>
-                      <w:rFonts w:ascii="Arial" w:cs="Arial" w:eastAsia="Arial" w:hAnsi="Arial"/>
-                      <w:b/>
-                      <w:bCs/>
-                      <w:color w:val="B37A33"/>
-                      <w:sz w:val="20"/>
-                      <w:szCs w:val="20"/>
-                    </w:rPr>
-                    <w:t xml:space="preserve">A   </w:t>
-                  </w:r>
-                  <w:r>
-                    <w:rPr>
-                      <w:rFonts w:ascii="Arial" w:cs="Arial" w:eastAsia="Arial" w:hAnsi="Arial"/>
-                      <w:color w:val="1C1B16"/>
-                      <w:sz w:val="20"/>
-                      <w:szCs w:val="20"/>
-                    </w:rPr>
-                    <w:t xml:space="preserve">positives</w:t>
-                  </w:r>
-                </w:p>
-              </w:tc>
-              <w:tc>
-                <w:tcPr>
-                  <w:tcW w:type="dxa" w:w="3266"/>
-                  <w:tcBorders>
-                    <w:top w:val="single" w:color="FFFFFF" w:sz="4"/>
-                    <w:left w:val="single" w:color="FFFFFF" w:sz="4"/>
-                    <w:bottom w:val="single" w:color="FFFFFF" w:sz="4"/>
-                    <w:right w:val="single" w:color="FFFFFF" w:sz="4"/>
-                  </w:tcBorders>
-                  <w:shd w:fill="F3F1EA" w:color="auto" w:val="clear"/>
-                  <w:tcMar>
-                    <w:top w:type="dxa" w:w="60"/>
-                    <w:left w:type="dxa" w:w="140"/>
-                    <w:bottom w:type="dxa" w:w="60"/>
-                    <w:right w:type="dxa" w:w="100"/>
-                  </w:tcMar>
-                  <w:vAlign w:val="center"/>
-                </w:tcPr>
-                <w:p>
-                  <w:pPr>
-                    <w:keepNext/>
-                    <w:spacing w:after="0" w:line="252"/>
-                  </w:pPr>
-                  <w:r>
-                    <w:rPr>
-                      <w:rFonts w:ascii="Arial" w:cs="Arial" w:eastAsia="Arial" w:hAnsi="Arial"/>
-                      <w:b/>
-                      <w:bCs/>
-                      <w:color w:val="B37A33"/>
-                      <w:sz w:val="20"/>
-                      <w:szCs w:val="20"/>
-                    </w:rPr>
-                    <w:t xml:space="preserve">B   </w:t>
-                  </w:r>
-                  <w:r>
-                    <w:rPr>
-                      <w:rFonts w:ascii="Arial" w:cs="Arial" w:eastAsia="Arial" w:hAnsi="Arial"/>
-                      <w:color w:val="1C1B16"/>
-                      <w:sz w:val="20"/>
-                      <w:szCs w:val="20"/>
-                    </w:rPr>
-                    <w:t xml:space="preserve">negatives</w:t>
-                  </w:r>
-                </w:p>
-              </w:tc>
-              <w:tc>
-                <w:tcPr>
-                  <w:tcW w:type="dxa" w:w="3266"/>
-                  <w:tcBorders>
-                    <w:top w:val="single" w:color="FFFFFF" w:sz="4"/>
-                    <w:left w:val="single" w:color="FFFFFF" w:sz="4"/>
-                    <w:bottom w:val="single" w:color="FFFFFF" w:sz="4"/>
-                    <w:right w:val="single" w:color="FFFFFF" w:sz="4"/>
-                  </w:tcBorders>
-                  <w:shd w:fill="F3F1EA" w:color="auto" w:val="clear"/>
-                  <w:tcMar>
-                    <w:top w:type="dxa" w:w="60"/>
-                    <w:left w:type="dxa" w:w="140"/>
-                    <w:bottom w:type="dxa" w:w="60"/>
-                    <w:right w:type="dxa" w:w="100"/>
-                  </w:tcMar>
-                  <w:vAlign w:val="center"/>
-                </w:tcPr>
-                <w:p>
-                  <w:pPr>
-                    <w:keepNext/>
-                    <w:spacing w:after="0" w:line="252"/>
-                  </w:pPr>
-                  <w:r>
-                    <w:rPr>
-                      <w:rFonts w:ascii="Arial" w:cs="Arial" w:eastAsia="Arial" w:hAnsi="Arial"/>
-                      <w:b/>
-                      <w:bCs/>
-                      <w:color w:val="B37A33"/>
-                      <w:sz w:val="20"/>
-                      <w:szCs w:val="20"/>
-                    </w:rPr>
-                    <w:t xml:space="preserve">C   </w:t>
-                  </w:r>
-                  <w:r>
-                    <w:rPr>
-                      <w:rFonts w:ascii="Arial" w:cs="Arial" w:eastAsia="Arial" w:hAnsi="Arial"/>
-                      <w:color w:val="1C1B16"/>
-                      <w:sz w:val="20"/>
-                      <w:szCs w:val="20"/>
-                    </w:rPr>
-                    <w:t xml:space="preserve">calls</w:t>
-                  </w:r>
-                </w:p>
-              </w:tc>
-            </w:tr>
-            <w:tr>
-              <w:trPr>
-                <w:cantSplit/>
-              </w:trPr>
-              <w:tc>
-                <w:tcPr>
-                  <w:tcW w:type="dxa" w:w="3266"/>
-                  <w:tcBorders>
-                    <w:top w:val="single" w:color="FFFFFF" w:sz="4"/>
-                    <w:left w:val="single" w:color="FFFFFF" w:sz="4"/>
-                    <w:bottom w:val="single" w:color="FFFFFF" w:sz="4"/>
-                    <w:right w:val="single" w:color="FFFFFF" w:sz="4"/>
-                  </w:tcBorders>
-                  <w:shd w:fill="F3F1EA" w:color="auto" w:val="clear"/>
-                  <w:tcMar>
-                    <w:top w:type="dxa" w:w="60"/>
-                    <w:left w:type="dxa" w:w="140"/>
-                    <w:bottom w:type="dxa" w:w="60"/>
-                    <w:right w:type="dxa" w:w="100"/>
-                  </w:tcMar>
-                  <w:vAlign w:val="center"/>
-                </w:tcPr>
-                <w:p>
-                  <w:pPr>
-                    <w:keepNext/>
-                    <w:spacing w:after="0" w:line="252"/>
-                  </w:pPr>
-                  <w:r>
-                    <w:rPr>
-                      <w:rFonts w:ascii="Arial" w:cs="Arial" w:eastAsia="Arial" w:hAnsi="Arial"/>
-                      <w:b/>
-                      <w:bCs/>
-                      <w:color w:val="B37A33"/>
-                      <w:sz w:val="20"/>
-                      <w:szCs w:val="20"/>
-                    </w:rPr>
-                    <w:t xml:space="preserve">D   </w:t>
-                  </w:r>
-                  <w:r>
-                    <w:rPr>
-                      <w:rFonts w:ascii="Arial" w:cs="Arial" w:eastAsia="Arial" w:hAnsi="Arial"/>
-                      <w:color w:val="1C1B16"/>
-                      <w:sz w:val="20"/>
-                      <w:szCs w:val="20"/>
-                    </w:rPr>
-                    <w:t xml:space="preserve">thresholds</w:t>
-                  </w:r>
-                </w:p>
-              </w:tc>
-              <w:tc>
-                <w:tcPr>
-                  <w:tcW w:type="dxa" w:w="3266"/>
-                  <w:tcBorders>
-                    <w:top w:val="single" w:color="FFFFFF" w:sz="4"/>
-                    <w:left w:val="single" w:color="FFFFFF" w:sz="4"/>
-                    <w:bottom w:val="single" w:color="FFFFFF" w:sz="4"/>
-                    <w:right w:val="single" w:color="FFFFFF" w:sz="4"/>
-                  </w:tcBorders>
-                  <w:shd w:fill="F3F1EA" w:color="auto" w:val="clear"/>
-                  <w:tcMar>
-                    <w:top w:type="dxa" w:w="60"/>
-                    <w:left w:type="dxa" w:w="140"/>
-                    <w:bottom w:type="dxa" w:w="60"/>
-                    <w:right w:type="dxa" w:w="100"/>
-                  </w:tcMar>
-                  <w:vAlign w:val="center"/>
-                </w:tcPr>
-                <w:p>
-                  <w:pPr>
-                    <w:keepNext/>
-                    <w:spacing w:after="80" w:before="0" w:line="276"/>
-                  </w:pPr>
-                  <w:r>
-                    <w:rPr>
-                      <w:rFonts w:ascii="Arial" w:cs="Arial" w:eastAsia="Arial" w:hAnsi="Arial"/>
-                      <w:color w:val="1C1B16"/>
-                      <w:sz w:val="21"/>
-                      <w:szCs w:val="21"/>
-                    </w:rPr>
-                    <w:t xml:space="preserve"/>
-                  </w:r>
-                </w:p>
-              </w:tc>
-              <w:tc>
-                <w:tcPr>
-                  <w:tcW w:type="dxa" w:w="3266"/>
-                  <w:tcBorders>
-                    <w:top w:val="single" w:color="FFFFFF" w:sz="4"/>
-                    <w:left w:val="single" w:color="FFFFFF" w:sz="4"/>
-                    <w:bottom w:val="single" w:color="FFFFFF" w:sz="4"/>
-                    <w:right w:val="single" w:color="FFFFFF" w:sz="4"/>
-                  </w:tcBorders>
-                  <w:shd w:fill="F3F1EA" w:color="auto" w:val="clear"/>
-                  <w:tcMar>
-                    <w:top w:type="dxa" w:w="60"/>
-                    <w:left w:type="dxa" w:w="140"/>
-                    <w:bottom w:type="dxa" w:w="60"/>
-                    <w:right w:type="dxa" w:w="100"/>
-                  </w:tcMar>
-                  <w:vAlign w:val="center"/>
-                </w:tcPr>
-                <w:p>
-                  <w:pPr>
-                    <w:keepNext/>
-                    <w:spacing w:after="80" w:before="0" w:line="276"/>
-                  </w:pPr>
-                  <w:r>
-                    <w:rPr>
-                      <w:rFonts w:ascii="Arial" w:cs="Arial" w:eastAsia="Arial" w:hAnsi="Arial"/>
-                      <w:color w:val="1C1B16"/>
-                      <w:sz w:val="21"/>
-                      <w:szCs w:val="21"/>
-                    </w:rPr>
-                    <w:t xml:space="preserve"/>
-                  </w:r>
-                </w:p>
-              </w:tc>
-            </w:tr>
-          </w:tbl>
-          <w:p>
-            <w:pPr>
-              <w:keepNext/>
-              <w:spacing w:after="140" w:before="0"/>
-            </w:pPr>
-          </w:p>
-          <w:p>
-            <w:pPr>
-              <w:keepNext/>
-              <w:spacing w:after="60" w:before="60" w:line="276"/>
-            </w:pPr>
-            <w:r>
-              <w:rPr>
-                <w:rFonts w:ascii="Arial" w:cs="Arial" w:eastAsia="Arial" w:hAnsi="Arial"/>
-                <w:b/>
-                <w:bCs/>
-                <w:color w:val="B37A33"/>
-                <w:sz w:val="22"/>
-                <w:szCs w:val="22"/>
-              </w:rPr>
-              <w:t xml:space="preserve">Q11</w:t>
-            </w:r>
-            <w:r>
-              <w:rPr>
-                <w:rFonts w:ascii="Arial" w:cs="Arial" w:eastAsia="Arial" w:hAnsi="Arial"/>
-                <w:b/>
-                <w:bCs/>
-                <w:color w:val="6B675E"/>
-                <w:sz w:val="18"/>
-                <w:szCs w:val="18"/>
-              </w:rPr>
-              <w:t xml:space="preserve">   Easy</w:t>
-            </w:r>
-            <w:r>
-              <w:rPr>
-                <w:rFonts w:ascii="Arial" w:cs="Arial" w:eastAsia="Arial" w:hAnsi="Arial"/>
-                <w:color w:val="6B675E"/>
-                <w:sz w:val="18"/>
-                <w:szCs w:val="18"/>
-              </w:rPr>
-              <w:t xml:space="preserve">  ·  Complete the formula</w:t>
-            </w:r>
-            <w:r>
-              <w:rPr>
-                <w:rFonts w:ascii="Arial" w:cs="Arial" w:eastAsia="Arial" w:hAnsi="Arial"/>
-                <w:i/>
-                <w:iCs/>
-                <w:color w:val="6B675E"/>
-                <w:sz w:val="18"/>
-                <w:szCs w:val="18"/>
-              </w:rPr>
-              <w:t xml:space="preserve">  ·  a letter from Word bank 2</w:t>
-            </w:r>
-          </w:p>
-          <w:p>
-            <w:pPr>
-              <w:keepNext/>
-              <w:spacing w:after="80" w:line="276"/>
-            </w:pPr>
-            <w:r>
-              <w:rPr>
-                <w:rFonts w:ascii="Arial" w:cs="Arial" w:eastAsia="Arial" w:hAnsi="Arial"/>
-                <w:color w:val="1C1B16"/>
-                <w:sz w:val="21"/>
-                <w:szCs w:val="21"/>
-              </w:rPr>
-              <w:t xml:space="preserve">Recall is true positives divided by true positives plus false ____.</w:t>
+              <w:t xml:space="preserve">Draw 1,000 clients at random from the 7,438 above the cost line, since every one of them clears it.</w:t>
             </w:r>
           </w:p>
         </w:tc>
@@ -8586,7 +7691,7 @@
           <w:sz w:val="19"/>
           <w:szCs w:val="19"/>
         </w:rPr>
-        <w:t xml:space="preserve">5 items, Q12 to Q16, about 11 minutes. What it shows: whether you can test each column against the moment of prediction and say what a coefficient does and does not prove.</w:t>
+        <w:t xml:space="preserve">4 items, Q10 to Q13, about 10.5 minutes. What it shows: whether you can test each column against the moment of prediction and say what a coefficient does and does not prove.</w:t>
       </w:r>
     </w:p>
     <w:p>
@@ -9348,7 +8453,7 @@
                 <w:sz w:val="22"/>
                 <w:szCs w:val="22"/>
               </w:rPr>
-              <w:t xml:space="preserve">Q12</w:t>
+              <w:t xml:space="preserve">Q10</w:t>
             </w:r>
             <w:r>
               <w:rPr>
@@ -9567,7 +8672,7 @@
                 <w:sz w:val="22"/>
                 <w:szCs w:val="22"/>
               </w:rPr>
-              <w:t xml:space="preserve">Q13</w:t>
+              <w:t xml:space="preserve">Q11</w:t>
             </w:r>
             <w:r>
               <w:rPr>
@@ -9775,6 +8880,512 @@
           <w:p>
             <w:pPr>
               <w:keepNext/>
+              <w:spacing w:after="80" w:before="80"/>
+            </w:pPr>
+            <w:r>
+              <w:rPr>
+                <w:rFonts w:ascii="Arial" w:cs="Arial" w:eastAsia="Arial" w:hAnsi="Arial"/>
+                <w:b/>
+                <w:bCs/>
+                <w:color w:val="B37A33"/>
+                <w:sz w:val="19"/>
+                <w:szCs w:val="19"/>
+              </w:rPr>
+              <w:t xml:space="preserve">Exhibit 3B</w:t>
+            </w:r>
+            <w:r>
+              <w:rPr>
+                <w:rFonts w:ascii="Arial" w:cs="Arial" w:eastAsia="Arial" w:hAnsi="Arial"/>
+                <w:i/>
+                <w:iCs/>
+                <w:color w:val="6B675E"/>
+                <w:sz w:val="18"/>
+                <w:szCs w:val="18"/>
+              </w:rPr>
+              <w:t xml:space="preserve">   A pneumonia model trained on chest X-rays from two hospital systems, as Zech and others report it (PLOS Medicine, 2018).</w:t>
+            </w:r>
+          </w:p>
+          <w:tbl>
+            <w:tblPr>
+              <w:tblW w:type="dxa" w:w="9799"/>
+              <w:tblBorders>
+                <w:top w:val="single" w:color="D5D0C4" w:sz="4"/>
+                <w:left w:val="single" w:color="D5D0C4" w:sz="4"/>
+                <w:bottom w:val="single" w:color="D5D0C4" w:sz="4"/>
+                <w:right w:val="single" w:color="D5D0C4" w:sz="4"/>
+                <w:insideH w:val="single" w:color="D5D0C4" w:sz="4"/>
+                <w:insideV w:val="single" w:color="D5D0C4" w:sz="4"/>
+              </w:tblBorders>
+            </w:tblPr>
+            <w:tblGrid>
+              <w:gridCol w:w="6939"/>
+              <w:gridCol w:w="2860"/>
+            </w:tblGrid>
+            <w:tr>
+              <w:trPr>
+                <w:cantSplit/>
+                <w:tblHeader/>
+              </w:trPr>
+              <w:tc>
+                <w:tcPr>
+                  <w:tcW w:type="dxa" w:w="6939"/>
+                  <w:tcBorders>
+                    <w:top w:val="single" w:color="D5D0C4" w:sz="4"/>
+                    <w:left w:val="single" w:color="D5D0C4" w:sz="4"/>
+                    <w:bottom w:val="single" w:color="D5D0C4" w:sz="4"/>
+                    <w:right w:val="single" w:color="D5D0C4" w:sz="4"/>
+                  </w:tcBorders>
+                  <w:shd w:fill="F9F8F3" w:color="auto" w:val="clear"/>
+                  <w:tcMar>
+                    <w:top w:type="dxa" w:w="40"/>
+                    <w:left w:type="dxa" w:w="100"/>
+                    <w:bottom w:type="dxa" w:w="40"/>
+                    <w:right w:type="dxa" w:w="100"/>
+                  </w:tcMar>
+                  <w:vAlign w:val="center"/>
+                </w:tcPr>
+                <w:p>
+                  <w:pPr>
+                    <w:keepNext/>
+                    <w:spacing w:after="0" w:line="240"/>
+                    <w:jc w:val="left"/>
+                  </w:pPr>
+                  <w:r>
+                    <w:rPr>
+                      <w:rFonts w:ascii="Arial" w:cs="Arial" w:eastAsia="Arial" w:hAnsi="Arial"/>
+                      <w:b/>
+                      <w:bCs/>
+                      <w:color w:val="1C1B16"/>
+                      <w:sz w:val="18"/>
+                      <w:szCs w:val="18"/>
+                    </w:rPr>
+                    <w:t xml:space="preserve">What the paper reports</w:t>
+                  </w:r>
+                </w:p>
+              </w:tc>
+              <w:tc>
+                <w:tcPr>
+                  <w:tcW w:type="dxa" w:w="2860"/>
+                  <w:tcBorders>
+                    <w:top w:val="single" w:color="D5D0C4" w:sz="4"/>
+                    <w:left w:val="single" w:color="D5D0C4" w:sz="4"/>
+                    <w:bottom w:val="single" w:color="D5D0C4" w:sz="4"/>
+                    <w:right w:val="single" w:color="D5D0C4" w:sz="4"/>
+                  </w:tcBorders>
+                  <w:shd w:fill="F9F8F3" w:color="auto" w:val="clear"/>
+                  <w:tcMar>
+                    <w:top w:type="dxa" w:w="40"/>
+                    <w:left w:type="dxa" w:w="100"/>
+                    <w:bottom w:type="dxa" w:w="40"/>
+                    <w:right w:type="dxa" w:w="100"/>
+                  </w:tcMar>
+                  <w:vAlign w:val="center"/>
+                </w:tcPr>
+                <w:p>
+                  <w:pPr>
+                    <w:keepNext/>
+                    <w:spacing w:after="0" w:line="240"/>
+                    <w:jc w:val="left"/>
+                  </w:pPr>
+                  <w:r>
+                    <w:rPr>
+                      <w:rFonts w:ascii="Arial" w:cs="Arial" w:eastAsia="Arial" w:hAnsi="Arial"/>
+                      <w:b/>
+                      <w:bCs/>
+                      <w:color w:val="1C1B16"/>
+                      <w:sz w:val="18"/>
+                      <w:szCs w:val="18"/>
+                    </w:rPr>
+                    <w:t xml:space="preserve">Value</w:t>
+                  </w:r>
+                </w:p>
+              </w:tc>
+            </w:tr>
+            <w:tr>
+              <w:trPr>
+                <w:cantSplit/>
+              </w:trPr>
+              <w:tc>
+                <w:tcPr>
+                  <w:tcW w:type="dxa" w:w="6939"/>
+                  <w:tcBorders>
+                    <w:top w:val="single" w:color="D5D0C4" w:sz="4"/>
+                    <w:left w:val="single" w:color="D5D0C4" w:sz="4"/>
+                    <w:bottom w:val="single" w:color="D5D0C4" w:sz="4"/>
+                    <w:right w:val="single" w:color="D5D0C4" w:sz="4"/>
+                  </w:tcBorders>
+                  <w:tcMar>
+                    <w:top w:type="dxa" w:w="40"/>
+                    <w:left w:type="dxa" w:w="100"/>
+                    <w:bottom w:type="dxa" w:w="40"/>
+                    <w:right w:type="dxa" w:w="100"/>
+                  </w:tcMar>
+                  <w:vAlign w:val="center"/>
+                </w:tcPr>
+                <w:p>
+                  <w:pPr>
+                    <w:keepNext w:val="false"/>
+                    <w:spacing w:after="0" w:line="252"/>
+                    <w:jc w:val="left"/>
+                  </w:pPr>
+                  <w:r>
+                    <w:rPr>
+                      <w:rFonts w:ascii="Arial" w:cs="Arial" w:eastAsia="Arial" w:hAnsi="Arial"/>
+                      <w:color w:val="1C1B16"/>
+                      <w:sz w:val="18"/>
+                      <w:szCs w:val="18"/>
+                    </w:rPr>
+                    <w:t xml:space="preserve">The model's AUC on held-out X-rays from its own two hospital systems</w:t>
+                  </w:r>
+                </w:p>
+              </w:tc>
+              <w:tc>
+                <w:tcPr>
+                  <w:tcW w:type="dxa" w:w="2860"/>
+                  <w:tcBorders>
+                    <w:top w:val="single" w:color="D5D0C4" w:sz="4"/>
+                    <w:left w:val="single" w:color="D5D0C4" w:sz="4"/>
+                    <w:bottom w:val="single" w:color="D5D0C4" w:sz="4"/>
+                    <w:right w:val="single" w:color="D5D0C4" w:sz="4"/>
+                  </w:tcBorders>
+                  <w:tcMar>
+                    <w:top w:type="dxa" w:w="40"/>
+                    <w:left w:type="dxa" w:w="100"/>
+                    <w:bottom w:type="dxa" w:w="40"/>
+                    <w:right w:type="dxa" w:w="100"/>
+                  </w:tcMar>
+                  <w:vAlign w:val="center"/>
+                </w:tcPr>
+                <w:p>
+                  <w:pPr>
+                    <w:keepNext w:val="false"/>
+                    <w:spacing w:after="0" w:line="252"/>
+                    <w:jc w:val="right"/>
+                  </w:pPr>
+                  <w:r>
+                    <w:rPr>
+                      <w:rFonts w:ascii="Arial" w:cs="Arial" w:eastAsia="Arial" w:hAnsi="Arial"/>
+                      <w:b w:val="false"/>
+                      <w:bCs w:val="false"/>
+                      <w:color w:val="1C1B16"/>
+                      <w:sz w:val="18"/>
+                      <w:szCs w:val="18"/>
+                    </w:rPr>
+                    <w:t xml:space="preserve">0.931</w:t>
+                  </w:r>
+                </w:p>
+              </w:tc>
+            </w:tr>
+            <w:tr>
+              <w:trPr>
+                <w:cantSplit/>
+              </w:trPr>
+              <w:tc>
+                <w:tcPr>
+                  <w:tcW w:type="dxa" w:w="6939"/>
+                  <w:tcBorders>
+                    <w:top w:val="single" w:color="D5D0C4" w:sz="4"/>
+                    <w:left w:val="single" w:color="D5D0C4" w:sz="4"/>
+                    <w:bottom w:val="single" w:color="D5D0C4" w:sz="4"/>
+                    <w:right w:val="single" w:color="D5D0C4" w:sz="4"/>
+                  </w:tcBorders>
+                  <w:tcMar>
+                    <w:top w:type="dxa" w:w="40"/>
+                    <w:left w:type="dxa" w:w="100"/>
+                    <w:bottom w:type="dxa" w:w="40"/>
+                    <w:right w:type="dxa" w:w="100"/>
+                  </w:tcMar>
+                  <w:vAlign w:val="center"/>
+                </w:tcPr>
+                <w:p>
+                  <w:pPr>
+                    <w:keepNext w:val="false"/>
+                    <w:spacing w:after="0" w:line="252"/>
+                    <w:jc w:val="left"/>
+                  </w:pPr>
+                  <w:r>
+                    <w:rPr>
+                      <w:rFonts w:ascii="Arial" w:cs="Arial" w:eastAsia="Arial" w:hAnsi="Arial"/>
+                      <w:color w:val="1C1B16"/>
+                      <w:sz w:val="18"/>
+                      <w:szCs w:val="18"/>
+                    </w:rPr>
+                    <w:t xml:space="preserve">The same model's AUC at a third hospital system</w:t>
+                  </w:r>
+                </w:p>
+              </w:tc>
+              <w:tc>
+                <w:tcPr>
+                  <w:tcW w:type="dxa" w:w="2860"/>
+                  <w:tcBorders>
+                    <w:top w:val="single" w:color="D5D0C4" w:sz="4"/>
+                    <w:left w:val="single" w:color="D5D0C4" w:sz="4"/>
+                    <w:bottom w:val="single" w:color="D5D0C4" w:sz="4"/>
+                    <w:right w:val="single" w:color="D5D0C4" w:sz="4"/>
+                  </w:tcBorders>
+                  <w:tcMar>
+                    <w:top w:type="dxa" w:w="40"/>
+                    <w:left w:type="dxa" w:w="100"/>
+                    <w:bottom w:type="dxa" w:w="40"/>
+                    <w:right w:type="dxa" w:w="100"/>
+                  </w:tcMar>
+                  <w:vAlign w:val="center"/>
+                </w:tcPr>
+                <w:p>
+                  <w:pPr>
+                    <w:keepNext w:val="false"/>
+                    <w:spacing w:after="0" w:line="252"/>
+                    <w:jc w:val="right"/>
+                  </w:pPr>
+                  <w:r>
+                    <w:rPr>
+                      <w:rFonts w:ascii="Arial" w:cs="Arial" w:eastAsia="Arial" w:hAnsi="Arial"/>
+                      <w:b w:val="false"/>
+                      <w:bCs w:val="false"/>
+                      <w:color w:val="1C1B16"/>
+                      <w:sz w:val="18"/>
+                      <w:szCs w:val="18"/>
+                    </w:rPr>
+                    <w:t xml:space="preserve">0.815</w:t>
+                  </w:r>
+                </w:p>
+              </w:tc>
+            </w:tr>
+            <w:tr>
+              <w:trPr>
+                <w:cantSplit/>
+              </w:trPr>
+              <w:tc>
+                <w:tcPr>
+                  <w:tcW w:type="dxa" w:w="6939"/>
+                  <w:tcBorders>
+                    <w:top w:val="single" w:color="D5D0C4" w:sz="4"/>
+                    <w:left w:val="single" w:color="D5D0C4" w:sz="4"/>
+                    <w:bottom w:val="single" w:color="D5D0C4" w:sz="4"/>
+                    <w:right w:val="single" w:color="D5D0C4" w:sz="4"/>
+                  </w:tcBorders>
+                  <w:tcMar>
+                    <w:top w:type="dxa" w:w="40"/>
+                    <w:left w:type="dxa" w:w="100"/>
+                    <w:bottom w:type="dxa" w:w="40"/>
+                    <w:right w:type="dxa" w:w="100"/>
+                  </w:tcMar>
+                  <w:vAlign w:val="center"/>
+                </w:tcPr>
+                <w:p>
+                  <w:pPr>
+                    <w:keepNext w:val="false"/>
+                    <w:spacing w:after="0" w:line="252"/>
+                    <w:jc w:val="left"/>
+                  </w:pPr>
+                  <w:r>
+                    <w:rPr>
+                      <w:rFonts w:ascii="Arial" w:cs="Arial" w:eastAsia="Arial" w:hAnsi="Arial"/>
+                      <w:color w:val="1C1B16"/>
+                      <w:sz w:val="18"/>
+                      <w:szCs w:val="18"/>
+                    </w:rPr>
+                    <w:t xml:space="preserve">AUC from sorting X-rays from the two training systems by hospital alone</w:t>
+                  </w:r>
+                </w:p>
+              </w:tc>
+              <w:tc>
+                <w:tcPr>
+                  <w:tcW w:type="dxa" w:w="2860"/>
+                  <w:tcBorders>
+                    <w:top w:val="single" w:color="D5D0C4" w:sz="4"/>
+                    <w:left w:val="single" w:color="D5D0C4" w:sz="4"/>
+                    <w:bottom w:val="single" w:color="D5D0C4" w:sz="4"/>
+                    <w:right w:val="single" w:color="D5D0C4" w:sz="4"/>
+                  </w:tcBorders>
+                  <w:tcMar>
+                    <w:top w:type="dxa" w:w="40"/>
+                    <w:left w:type="dxa" w:w="100"/>
+                    <w:bottom w:type="dxa" w:w="40"/>
+                    <w:right w:type="dxa" w:w="100"/>
+                  </w:tcMar>
+                  <w:vAlign w:val="center"/>
+                </w:tcPr>
+                <w:p>
+                  <w:pPr>
+                    <w:keepNext w:val="false"/>
+                    <w:spacing w:after="0" w:line="252"/>
+                    <w:jc w:val="right"/>
+                  </w:pPr>
+                  <w:r>
+                    <w:rPr>
+                      <w:rFonts w:ascii="Arial" w:cs="Arial" w:eastAsia="Arial" w:hAnsi="Arial"/>
+                      <w:b w:val="false"/>
+                      <w:bCs w:val="false"/>
+                      <w:color w:val="1C1B16"/>
+                      <w:sz w:val="18"/>
+                      <w:szCs w:val="18"/>
+                    </w:rPr>
+                    <w:t xml:space="preserve">0.861</w:t>
+                  </w:r>
+                </w:p>
+              </w:tc>
+            </w:tr>
+            <w:tr>
+              <w:trPr>
+                <w:cantSplit/>
+              </w:trPr>
+              <w:tc>
+                <w:tcPr>
+                  <w:tcW w:type="dxa" w:w="6939"/>
+                  <w:tcBorders>
+                    <w:top w:val="single" w:color="D5D0C4" w:sz="4"/>
+                    <w:left w:val="single" w:color="D5D0C4" w:sz="4"/>
+                    <w:bottom w:val="single" w:color="D5D0C4" w:sz="4"/>
+                    <w:right w:val="single" w:color="D5D0C4" w:sz="4"/>
+                  </w:tcBorders>
+                  <w:tcMar>
+                    <w:top w:type="dxa" w:w="40"/>
+                    <w:left w:type="dxa" w:w="100"/>
+                    <w:bottom w:type="dxa" w:w="40"/>
+                    <w:right w:type="dxa" w:w="100"/>
+                  </w:tcMar>
+                  <w:vAlign w:val="center"/>
+                </w:tcPr>
+                <w:p>
+                  <w:pPr>
+                    <w:keepNext w:val="false"/>
+                    <w:spacing w:after="0" w:line="252"/>
+                    <w:jc w:val="left"/>
+                  </w:pPr>
+                  <w:r>
+                    <w:rPr>
+                      <w:rFonts w:ascii="Arial" w:cs="Arial" w:eastAsia="Arial" w:hAnsi="Arial"/>
+                      <w:color w:val="1C1B16"/>
+                      <w:sz w:val="18"/>
+                      <w:szCs w:val="18"/>
+                    </w:rPr>
+                    <w:t xml:space="preserve">Pneumonia rate in the two training systems</w:t>
+                  </w:r>
+                </w:p>
+              </w:tc>
+              <w:tc>
+                <w:tcPr>
+                  <w:tcW w:type="dxa" w:w="2860"/>
+                  <w:tcBorders>
+                    <w:top w:val="single" w:color="D5D0C4" w:sz="4"/>
+                    <w:left w:val="single" w:color="D5D0C4" w:sz="4"/>
+                    <w:bottom w:val="single" w:color="D5D0C4" w:sz="4"/>
+                    <w:right w:val="single" w:color="D5D0C4" w:sz="4"/>
+                  </w:tcBorders>
+                  <w:tcMar>
+                    <w:top w:type="dxa" w:w="40"/>
+                    <w:left w:type="dxa" w:w="100"/>
+                    <w:bottom w:type="dxa" w:w="40"/>
+                    <w:right w:type="dxa" w:w="100"/>
+                  </w:tcMar>
+                  <w:vAlign w:val="center"/>
+                </w:tcPr>
+                <w:p>
+                  <w:pPr>
+                    <w:keepNext w:val="false"/>
+                    <w:spacing w:after="0" w:line="252"/>
+                    <w:jc w:val="left"/>
+                  </w:pPr>
+                  <w:r>
+                    <w:rPr>
+                      <w:rFonts w:ascii="Arial" w:cs="Arial" w:eastAsia="Arial" w:hAnsi="Arial"/>
+                      <w:b w:val="false"/>
+                      <w:bCs w:val="false"/>
+                      <w:color w:val="1C1B16"/>
+                      <w:sz w:val="18"/>
+                      <w:szCs w:val="18"/>
+                    </w:rPr>
+                    <w:t xml:space="preserve">34.2 percent and 1.2 percent</w:t>
+                  </w:r>
+                </w:p>
+              </w:tc>
+            </w:tr>
+            <w:tr>
+              <w:trPr>
+                <w:cantSplit/>
+              </w:trPr>
+              <w:tc>
+                <w:tcPr>
+                  <w:tcW w:type="dxa" w:w="6939"/>
+                  <w:tcBorders>
+                    <w:top w:val="single" w:color="D5D0C4" w:sz="4"/>
+                    <w:left w:val="single" w:color="D5D0C4" w:sz="4"/>
+                    <w:bottom w:val="single" w:color="D5D0C4" w:sz="4"/>
+                    <w:right w:val="single" w:color="D5D0C4" w:sz="4"/>
+                  </w:tcBorders>
+                  <w:tcMar>
+                    <w:top w:type="dxa" w:w="40"/>
+                    <w:left w:type="dxa" w:w="100"/>
+                    <w:bottom w:type="dxa" w:w="40"/>
+                    <w:right w:type="dxa" w:w="100"/>
+                  </w:tcMar>
+                  <w:vAlign w:val="center"/>
+                </w:tcPr>
+                <w:p>
+                  <w:pPr>
+                    <w:keepNext w:val="false"/>
+                    <w:spacing w:after="0" w:line="252"/>
+                    <w:jc w:val="left"/>
+                  </w:pPr>
+                  <w:r>
+                    <w:rPr>
+                      <w:rFonts w:ascii="Arial" w:cs="Arial" w:eastAsia="Arial" w:hAnsi="Arial"/>
+                      <w:color w:val="1C1B16"/>
+                      <w:sz w:val="18"/>
+                      <w:szCs w:val="18"/>
+                    </w:rPr>
+                    <w:t xml:space="preserve">X-rays from one system whose hospital a network identified</w:t>
+                  </w:r>
+                </w:p>
+              </w:tc>
+              <w:tc>
+                <w:tcPr>
+                  <w:tcW w:type="dxa" w:w="2860"/>
+                  <w:tcBorders>
+                    <w:top w:val="single" w:color="D5D0C4" w:sz="4"/>
+                    <w:left w:val="single" w:color="D5D0C4" w:sz="4"/>
+                    <w:bottom w:val="single" w:color="D5D0C4" w:sz="4"/>
+                    <w:right w:val="single" w:color="D5D0C4" w:sz="4"/>
+                  </w:tcBorders>
+                  <w:tcMar>
+                    <w:top w:type="dxa" w:w="40"/>
+                    <w:left w:type="dxa" w:w="100"/>
+                    <w:bottom w:type="dxa" w:w="40"/>
+                    <w:right w:type="dxa" w:w="100"/>
+                  </w:tcMar>
+                  <w:vAlign w:val="center"/>
+                </w:tcPr>
+                <w:p>
+                  <w:pPr>
+                    <w:keepNext w:val="false"/>
+                    <w:spacing w:after="0" w:line="252"/>
+                    <w:jc w:val="left"/>
+                  </w:pPr>
+                  <w:r>
+                    <w:rPr>
+                      <w:rFonts w:ascii="Arial" w:cs="Arial" w:eastAsia="Arial" w:hAnsi="Arial"/>
+                      <w:b w:val="false"/>
+                      <w:bCs w:val="false"/>
+                      <w:color w:val="1C1B16"/>
+                      <w:sz w:val="18"/>
+                      <w:szCs w:val="18"/>
+                    </w:rPr>
+                    <w:t xml:space="preserve">22,050 of 22,062</w:t>
+                  </w:r>
+                </w:p>
+              </w:tc>
+            </w:tr>
+          </w:tbl>
+          <w:p>
+            <w:pPr>
+              <w:keepNext/>
+              <w:spacing w:after="140" w:before="0"/>
+            </w:pPr>
+          </w:p>
+          <w:p>
+            <w:pPr>
+              <w:keepNext/>
               <w:spacing w:after="60" w:before="60" w:line="276"/>
             </w:pPr>
             <w:r>
@@ -9786,7 +9397,7 @@
                 <w:sz w:val="22"/>
                 <w:szCs w:val="22"/>
               </w:rPr>
-              <w:t xml:space="preserve">Q14</w:t>
+              <w:t xml:space="preserve">Q12</w:t>
             </w:r>
             <w:r>
               <w:rPr>
@@ -9797,7 +9408,7 @@
                 <w:sz w:val="18"/>
                 <w:szCs w:val="18"/>
               </w:rPr>
-              <w:t xml:space="preserve">   Medium</w:t>
+              <w:t xml:space="preserve">   Hard</w:t>
             </w:r>
             <w:r>
               <w:rPr>
@@ -9806,7 +9417,7 @@
                 <w:sz w:val="18"/>
                 <w:szCs w:val="18"/>
               </w:rPr>
-              <w:t xml:space="preserve">  ·  Judge the chart</w:t>
+              <w:t xml:space="preserve">  ·  Diagnose the drop</w:t>
             </w:r>
             <w:r>
               <w:rPr>
@@ -9832,7 +9443,7 @@
                 <w:sz w:val="21"/>
                 <w:szCs w:val="21"/>
               </w:rPr>
-              <w:t xml:space="preserve">In the model with duration, duration tops the importance chart, and clients who said yes talked 553 seconds on average against 221 for those who said no. Statement: longer calls cause deposits, so agents should be coached to keep clients on the line. True or false, and why?</w:t>
+              <w:t xml:space="preserve">Exhibit 3B reports a pneumonia model that scored well on held-out X-rays and worse at a new hospital. Which reading holds, and which check would have caught it before launch?</w:t>
             </w:r>
           </w:p>
           <w:p>
@@ -9860,7 +9471,7 @@
                 <w:sz w:val="20"/>
                 <w:szCs w:val="20"/>
               </w:rPr>
-              <w:t xml:space="preserve">False: a client who means to buy stays on to arrange it, so the yes drives the length as much as the reverse.</w:t>
+              <w:t xml:space="preserve">It learned which hospital took each X-ray, a shortcut its held-out set shared; test it on a new site.</w:t>
             </w:r>
           </w:p>
           <w:p>
@@ -9888,7 +9499,7 @@
                 <w:sz w:val="20"/>
                 <w:szCs w:val="20"/>
               </w:rPr>
-              <w:t xml:space="preserve">False: an importance chart is valid for tree models only, so the logistic weights say nothing about duration.</w:t>
+              <w:t xml:space="preserve">It memorised its training X-rays, so a stronger penalty or a smaller network would have closed the gap.</w:t>
             </w:r>
           </w:p>
           <w:p>
@@ -9916,7 +9527,7 @@
                 <w:sz w:val="20"/>
                 <w:szCs w:val="20"/>
               </w:rPr>
-              <w:t xml:space="preserve">True: duration carries the largest weight in the model, and the largest weight points to the cause of the yes.</w:t>
+              <w:t xml:space="preserve">The new hospital's X-rays were poorer, so the drop says nothing about the model and needs no check.</w:t>
             </w:r>
           </w:p>
           <w:p>
@@ -9944,7 +9555,7 @@
                 <w:sz w:val="20"/>
                 <w:szCs w:val="20"/>
               </w:rPr>
-              <w:t xml:space="preserve">True: a gap of 332 seconds is too large to be chance across 41,188 calls, so the effect has to be causal.</w:t>
+              <w:t xml:space="preserve">0.815 is still a strong AUC, so the model carries over, and the drop is the noise of one test set.</w:t>
             </w:r>
           </w:p>
         </w:tc>
@@ -9994,6 +9605,437 @@
           <w:p>
             <w:pPr>
               <w:keepNext/>
+              <w:spacing w:after="80" w:before="80"/>
+            </w:pPr>
+            <w:r>
+              <w:rPr>
+                <w:rFonts w:ascii="Arial" w:cs="Arial" w:eastAsia="Arial" w:hAnsi="Arial"/>
+                <w:b/>
+                <w:bCs/>
+                <w:color w:val="B37A33"/>
+                <w:sz w:val="19"/>
+                <w:szCs w:val="19"/>
+              </w:rPr>
+              <w:t xml:space="preserve">Exhibit 3C</w:t>
+            </w:r>
+            <w:r>
+              <w:rPr>
+                <w:rFonts w:ascii="Arial" w:cs="Arial" w:eastAsia="Arial" w:hAnsi="Arial"/>
+                <w:i/>
+                <w:iCs/>
+                <w:color w:val="6B675E"/>
+                <w:sz w:val="18"/>
+                <w:szCs w:val="18"/>
+              </w:rPr>
+              <w:t xml:space="preserve">   Two readings of Wednesday's models on the week's run: the importance chart of the model with every column, and the logistic model's weight on euribor3m, the three-month interest rate, on the standardised scale.</w:t>
+            </w:r>
+          </w:p>
+          <w:tbl>
+            <w:tblPr>
+              <w:tblW w:type="dxa" w:w="9799"/>
+              <w:tblBorders>
+                <w:top w:val="single" w:color="D5D0C4" w:sz="4"/>
+                <w:left w:val="single" w:color="D5D0C4" w:sz="4"/>
+                <w:bottom w:val="single" w:color="D5D0C4" w:sz="4"/>
+                <w:right w:val="single" w:color="D5D0C4" w:sz="4"/>
+                <w:insideH w:val="single" w:color="D5D0C4" w:sz="4"/>
+                <w:insideV w:val="single" w:color="D5D0C4" w:sz="4"/>
+              </w:tblBorders>
+            </w:tblPr>
+            <w:tblGrid>
+              <w:gridCol w:w="7294"/>
+              <w:gridCol w:w="2505"/>
+            </w:tblGrid>
+            <w:tr>
+              <w:trPr>
+                <w:cantSplit/>
+                <w:tblHeader/>
+              </w:trPr>
+              <w:tc>
+                <w:tcPr>
+                  <w:tcW w:type="dxa" w:w="7294"/>
+                  <w:tcBorders>
+                    <w:top w:val="single" w:color="D5D0C4" w:sz="4"/>
+                    <w:left w:val="single" w:color="D5D0C4" w:sz="4"/>
+                    <w:bottom w:val="single" w:color="D5D0C4" w:sz="4"/>
+                    <w:right w:val="single" w:color="D5D0C4" w:sz="4"/>
+                  </w:tcBorders>
+                  <w:shd w:fill="F9F8F3" w:color="auto" w:val="clear"/>
+                  <w:tcMar>
+                    <w:top w:type="dxa" w:w="40"/>
+                    <w:left w:type="dxa" w:w="100"/>
+                    <w:bottom w:type="dxa" w:w="40"/>
+                    <w:right w:type="dxa" w:w="100"/>
+                  </w:tcMar>
+                  <w:vAlign w:val="center"/>
+                </w:tcPr>
+                <w:p>
+                  <w:pPr>
+                    <w:keepNext/>
+                    <w:spacing w:after="0" w:line="240"/>
+                    <w:jc w:val="left"/>
+                  </w:pPr>
+                  <w:r>
+                    <w:rPr>
+                      <w:rFonts w:ascii="Arial" w:cs="Arial" w:eastAsia="Arial" w:hAnsi="Arial"/>
+                      <w:b/>
+                      <w:bCs/>
+                      <w:color w:val="1C1B16"/>
+                      <w:sz w:val="18"/>
+                      <w:szCs w:val="18"/>
+                    </w:rPr>
+                    <w:t xml:space="preserve">What the week's run shows</w:t>
+                  </w:r>
+                </w:p>
+              </w:tc>
+              <w:tc>
+                <w:tcPr>
+                  <w:tcW w:type="dxa" w:w="2505"/>
+                  <w:tcBorders>
+                    <w:top w:val="single" w:color="D5D0C4" w:sz="4"/>
+                    <w:left w:val="single" w:color="D5D0C4" w:sz="4"/>
+                    <w:bottom w:val="single" w:color="D5D0C4" w:sz="4"/>
+                    <w:right w:val="single" w:color="D5D0C4" w:sz="4"/>
+                  </w:tcBorders>
+                  <w:shd w:fill="F9F8F3" w:color="auto" w:val="clear"/>
+                  <w:tcMar>
+                    <w:top w:type="dxa" w:w="40"/>
+                    <w:left w:type="dxa" w:w="100"/>
+                    <w:bottom w:type="dxa" w:w="40"/>
+                    <w:right w:type="dxa" w:w="100"/>
+                  </w:tcMar>
+                  <w:vAlign w:val="center"/>
+                </w:tcPr>
+                <w:p>
+                  <w:pPr>
+                    <w:keepNext/>
+                    <w:spacing w:after="0" w:line="240"/>
+                    <w:jc w:val="left"/>
+                  </w:pPr>
+                  <w:r>
+                    <w:rPr>
+                      <w:rFonts w:ascii="Arial" w:cs="Arial" w:eastAsia="Arial" w:hAnsi="Arial"/>
+                      <w:b/>
+                      <w:bCs/>
+                      <w:color w:val="1C1B16"/>
+                      <w:sz w:val="18"/>
+                      <w:szCs w:val="18"/>
+                    </w:rPr>
+                    <w:t xml:space="preserve">Value</w:t>
+                  </w:r>
+                </w:p>
+              </w:tc>
+            </w:tr>
+            <w:tr>
+              <w:trPr>
+                <w:cantSplit/>
+              </w:trPr>
+              <w:tc>
+                <w:tcPr>
+                  <w:tcW w:type="dxa" w:w="7294"/>
+                  <w:tcBorders>
+                    <w:top w:val="single" w:color="D5D0C4" w:sz="4"/>
+                    <w:left w:val="single" w:color="D5D0C4" w:sz="4"/>
+                    <w:bottom w:val="single" w:color="D5D0C4" w:sz="4"/>
+                    <w:right w:val="single" w:color="D5D0C4" w:sz="4"/>
+                  </w:tcBorders>
+                  <w:tcMar>
+                    <w:top w:type="dxa" w:w="40"/>
+                    <w:left w:type="dxa" w:w="100"/>
+                    <w:bottom w:type="dxa" w:w="40"/>
+                    <w:right w:type="dxa" w:w="100"/>
+                  </w:tcMar>
+                  <w:vAlign w:val="center"/>
+                </w:tcPr>
+                <w:p>
+                  <w:pPr>
+                    <w:keepNext w:val="false"/>
+                    <w:spacing w:after="0" w:line="252"/>
+                    <w:jc w:val="left"/>
+                  </w:pPr>
+                  <w:r>
+                    <w:rPr>
+                      <w:rFonts w:ascii="Arial" w:cs="Arial" w:eastAsia="Arial" w:hAnsi="Arial"/>
+                      <w:color w:val="1C1B16"/>
+                      <w:sz w:val="18"/>
+                      <w:szCs w:val="18"/>
+                    </w:rPr>
+                    <w:t xml:space="preserve">duration's place on the importance chart of the model with every column</w:t>
+                  </w:r>
+                </w:p>
+              </w:tc>
+              <w:tc>
+                <w:tcPr>
+                  <w:tcW w:type="dxa" w:w="2505"/>
+                  <w:tcBorders>
+                    <w:top w:val="single" w:color="D5D0C4" w:sz="4"/>
+                    <w:left w:val="single" w:color="D5D0C4" w:sz="4"/>
+                    <w:bottom w:val="single" w:color="D5D0C4" w:sz="4"/>
+                    <w:right w:val="single" w:color="D5D0C4" w:sz="4"/>
+                  </w:tcBorders>
+                  <w:tcMar>
+                    <w:top w:type="dxa" w:w="40"/>
+                    <w:left w:type="dxa" w:w="100"/>
+                    <w:bottom w:type="dxa" w:w="40"/>
+                    <w:right w:type="dxa" w:w="100"/>
+                  </w:tcMar>
+                  <w:vAlign w:val="center"/>
+                </w:tcPr>
+                <w:p>
+                  <w:pPr>
+                    <w:keepNext w:val="false"/>
+                    <w:spacing w:after="0" w:line="252"/>
+                    <w:jc w:val="left"/>
+                  </w:pPr>
+                  <w:r>
+                    <w:rPr>
+                      <w:rFonts w:ascii="Arial" w:cs="Arial" w:eastAsia="Arial" w:hAnsi="Arial"/>
+                      <w:b w:val="false"/>
+                      <w:bCs w:val="false"/>
+                      <w:color w:val="1C1B16"/>
+                      <w:sz w:val="18"/>
+                      <w:szCs w:val="18"/>
+                    </w:rPr>
+                    <w:t xml:space="preserve">first</w:t>
+                  </w:r>
+                </w:p>
+              </w:tc>
+            </w:tr>
+            <w:tr>
+              <w:trPr>
+                <w:cantSplit/>
+              </w:trPr>
+              <w:tc>
+                <w:tcPr>
+                  <w:tcW w:type="dxa" w:w="7294"/>
+                  <w:tcBorders>
+                    <w:top w:val="single" w:color="D5D0C4" w:sz="4"/>
+                    <w:left w:val="single" w:color="D5D0C4" w:sz="4"/>
+                    <w:bottom w:val="single" w:color="D5D0C4" w:sz="4"/>
+                    <w:right w:val="single" w:color="D5D0C4" w:sz="4"/>
+                  </w:tcBorders>
+                  <w:tcMar>
+                    <w:top w:type="dxa" w:w="40"/>
+                    <w:left w:type="dxa" w:w="100"/>
+                    <w:bottom w:type="dxa" w:w="40"/>
+                    <w:right w:type="dxa" w:w="100"/>
+                  </w:tcMar>
+                  <w:vAlign w:val="center"/>
+                </w:tcPr>
+                <w:p>
+                  <w:pPr>
+                    <w:keepNext w:val="false"/>
+                    <w:spacing w:after="0" w:line="252"/>
+                    <w:jc w:val="left"/>
+                  </w:pPr>
+                  <w:r>
+                    <w:rPr>
+                      <w:rFonts w:ascii="Arial" w:cs="Arial" w:eastAsia="Arial" w:hAnsi="Arial"/>
+                      <w:color w:val="1C1B16"/>
+                      <w:sz w:val="18"/>
+                      <w:szCs w:val="18"/>
+                    </w:rPr>
+                    <w:t xml:space="preserve">Mean call length: clients who said yes; clients who said no</w:t>
+                  </w:r>
+                </w:p>
+              </w:tc>
+              <w:tc>
+                <w:tcPr>
+                  <w:tcW w:type="dxa" w:w="2505"/>
+                  <w:tcBorders>
+                    <w:top w:val="single" w:color="D5D0C4" w:sz="4"/>
+                    <w:left w:val="single" w:color="D5D0C4" w:sz="4"/>
+                    <w:bottom w:val="single" w:color="D5D0C4" w:sz="4"/>
+                    <w:right w:val="single" w:color="D5D0C4" w:sz="4"/>
+                  </w:tcBorders>
+                  <w:tcMar>
+                    <w:top w:type="dxa" w:w="40"/>
+                    <w:left w:type="dxa" w:w="100"/>
+                    <w:bottom w:type="dxa" w:w="40"/>
+                    <w:right w:type="dxa" w:w="100"/>
+                  </w:tcMar>
+                  <w:vAlign w:val="center"/>
+                </w:tcPr>
+                <w:p>
+                  <w:pPr>
+                    <w:keepNext w:val="false"/>
+                    <w:spacing w:after="0" w:line="252"/>
+                    <w:jc w:val="left"/>
+                  </w:pPr>
+                  <w:r>
+                    <w:rPr>
+                      <w:rFonts w:ascii="Arial" w:cs="Arial" w:eastAsia="Arial" w:hAnsi="Arial"/>
+                      <w:b w:val="false"/>
+                      <w:bCs w:val="false"/>
+                      <w:color w:val="1C1B16"/>
+                      <w:sz w:val="18"/>
+                      <w:szCs w:val="18"/>
+                    </w:rPr>
+                    <w:t xml:space="preserve">553 seconds; 221 seconds</w:t>
+                  </w:r>
+                </w:p>
+              </w:tc>
+            </w:tr>
+            <w:tr>
+              <w:trPr>
+                <w:cantSplit/>
+              </w:trPr>
+              <w:tc>
+                <w:tcPr>
+                  <w:tcW w:type="dxa" w:w="7294"/>
+                  <w:tcBorders>
+                    <w:top w:val="single" w:color="D5D0C4" w:sz="4"/>
+                    <w:left w:val="single" w:color="D5D0C4" w:sz="4"/>
+                    <w:bottom w:val="single" w:color="D5D0C4" w:sz="4"/>
+                    <w:right w:val="single" w:color="D5D0C4" w:sz="4"/>
+                  </w:tcBorders>
+                  <w:tcMar>
+                    <w:top w:type="dxa" w:w="40"/>
+                    <w:left w:type="dxa" w:w="100"/>
+                    <w:bottom w:type="dxa" w:w="40"/>
+                    <w:right w:type="dxa" w:w="100"/>
+                  </w:tcMar>
+                  <w:vAlign w:val="center"/>
+                </w:tcPr>
+                <w:p>
+                  <w:pPr>
+                    <w:keepNext w:val="false"/>
+                    <w:spacing w:after="0" w:line="252"/>
+                    <w:jc w:val="left"/>
+                  </w:pPr>
+                  <w:r>
+                    <w:rPr>
+                      <w:rFonts w:ascii="Arial" w:cs="Arial" w:eastAsia="Arial" w:hAnsi="Arial"/>
+                      <w:color w:val="1C1B16"/>
+                      <w:sz w:val="18"/>
+                      <w:szCs w:val="18"/>
+                    </w:rPr>
+                    <w:t xml:space="preserve">euribor3m's weight with no other column in the model</w:t>
+                  </w:r>
+                </w:p>
+              </w:tc>
+              <w:tc>
+                <w:tcPr>
+                  <w:tcW w:type="dxa" w:w="2505"/>
+                  <w:tcBorders>
+                    <w:top w:val="single" w:color="D5D0C4" w:sz="4"/>
+                    <w:left w:val="single" w:color="D5D0C4" w:sz="4"/>
+                    <w:bottom w:val="single" w:color="D5D0C4" w:sz="4"/>
+                    <w:right w:val="single" w:color="D5D0C4" w:sz="4"/>
+                  </w:tcBorders>
+                  <w:tcMar>
+                    <w:top w:type="dxa" w:w="40"/>
+                    <w:left w:type="dxa" w:w="100"/>
+                    <w:bottom w:type="dxa" w:w="40"/>
+                    <w:right w:type="dxa" w:w="100"/>
+                  </w:tcMar>
+                  <w:vAlign w:val="center"/>
+                </w:tcPr>
+                <w:p>
+                  <w:pPr>
+                    <w:keepNext w:val="false"/>
+                    <w:spacing w:after="0" w:line="252"/>
+                    <w:jc w:val="right"/>
+                  </w:pPr>
+                  <w:r>
+                    <w:rPr>
+                      <w:rFonts w:ascii="Arial" w:cs="Arial" w:eastAsia="Arial" w:hAnsi="Arial"/>
+                      <w:b w:val="false"/>
+                      <w:bCs w:val="false"/>
+                      <w:color w:val="1C1B16"/>
+                      <w:sz w:val="18"/>
+                      <w:szCs w:val="18"/>
+                    </w:rPr>
+                    <w:t xml:space="preserve">-0.92</w:t>
+                  </w:r>
+                </w:p>
+              </w:tc>
+            </w:tr>
+            <w:tr>
+              <w:trPr>
+                <w:cantSplit/>
+              </w:trPr>
+              <w:tc>
+                <w:tcPr>
+                  <w:tcW w:type="dxa" w:w="7294"/>
+                  <w:tcBorders>
+                    <w:top w:val="single" w:color="D5D0C4" w:sz="4"/>
+                    <w:left w:val="single" w:color="D5D0C4" w:sz="4"/>
+                    <w:bottom w:val="single" w:color="D5D0C4" w:sz="4"/>
+                    <w:right w:val="single" w:color="D5D0C4" w:sz="4"/>
+                  </w:tcBorders>
+                  <w:tcMar>
+                    <w:top w:type="dxa" w:w="40"/>
+                    <w:left w:type="dxa" w:w="100"/>
+                    <w:bottom w:type="dxa" w:w="40"/>
+                    <w:right w:type="dxa" w:w="100"/>
+                  </w:tcMar>
+                  <w:vAlign w:val="center"/>
+                </w:tcPr>
+                <w:p>
+                  <w:pPr>
+                    <w:keepNext w:val="false"/>
+                    <w:spacing w:after="0" w:line="252"/>
+                    <w:jc w:val="left"/>
+                  </w:pPr>
+                  <w:r>
+                    <w:rPr>
+                      <w:rFonts w:ascii="Arial" w:cs="Arial" w:eastAsia="Arial" w:hAnsi="Arial"/>
+                      <w:color w:val="1C1B16"/>
+                      <w:sz w:val="18"/>
+                      <w:szCs w:val="18"/>
+                    </w:rPr>
+                    <w:t xml:space="preserve">euribor3m's weight beside the customer table and the other four indicators</w:t>
+                  </w:r>
+                </w:p>
+              </w:tc>
+              <w:tc>
+                <w:tcPr>
+                  <w:tcW w:type="dxa" w:w="2505"/>
+                  <w:tcBorders>
+                    <w:top w:val="single" w:color="D5D0C4" w:sz="4"/>
+                    <w:left w:val="single" w:color="D5D0C4" w:sz="4"/>
+                    <w:bottom w:val="single" w:color="D5D0C4" w:sz="4"/>
+                    <w:right w:val="single" w:color="D5D0C4" w:sz="4"/>
+                  </w:tcBorders>
+                  <w:tcMar>
+                    <w:top w:type="dxa" w:w="40"/>
+                    <w:left w:type="dxa" w:w="100"/>
+                    <w:bottom w:type="dxa" w:w="40"/>
+                    <w:right w:type="dxa" w:w="100"/>
+                  </w:tcMar>
+                  <w:vAlign w:val="center"/>
+                </w:tcPr>
+                <w:p>
+                  <w:pPr>
+                    <w:keepNext w:val="false"/>
+                    <w:spacing w:after="0" w:line="252"/>
+                    <w:jc w:val="right"/>
+                  </w:pPr>
+                  <w:r>
+                    <w:rPr>
+                      <w:rFonts w:ascii="Arial" w:cs="Arial" w:eastAsia="Arial" w:hAnsi="Arial"/>
+                      <w:b w:val="false"/>
+                      <w:bCs w:val="false"/>
+                      <w:color w:val="1C1B16"/>
+                      <w:sz w:val="18"/>
+                      <w:szCs w:val="18"/>
+                    </w:rPr>
+                    <w:t xml:space="preserve">+0.39</w:t>
+                  </w:r>
+                </w:p>
+              </w:tc>
+            </w:tr>
+          </w:tbl>
+          <w:p>
+            <w:pPr>
+              <w:keepNext/>
+              <w:spacing w:after="140" w:before="0"/>
+            </w:pPr>
+          </w:p>
+          <w:p>
+            <w:pPr>
+              <w:keepNext/>
               <w:spacing w:after="60" w:before="60" w:line="276"/>
             </w:pPr>
             <w:r>
@@ -10005,7 +10047,7 @@
                 <w:sz w:val="22"/>
                 <w:szCs w:val="22"/>
               </w:rPr>
-              <w:t xml:space="preserve">Q15</w:t>
+              <w:t xml:space="preserve">Q13</w:t>
             </w:r>
             <w:r>
               <w:rPr>
@@ -10016,7 +10058,7 @@
                 <w:sz w:val="18"/>
                 <w:szCs w:val="18"/>
               </w:rPr>
-              <w:t xml:space="preserve">   Medium</w:t>
+              <w:t xml:space="preserve">   Hard</w:t>
             </w:r>
             <w:r>
               <w:rPr>
@@ -10025,7 +10067,7 @@
                 <w:sz w:val="18"/>
                 <w:szCs w:val="18"/>
               </w:rPr>
-              <w:t xml:space="preserve">  ·  Explain the flip</w:t>
+              <w:t xml:space="preserve">  ·  Check two conclusions</w:t>
             </w:r>
             <w:r>
               <w:rPr>
@@ -10051,7 +10093,7 @@
                 <w:sz w:val="21"/>
                 <w:szCs w:val="21"/>
               </w:rPr>
-              <w:t xml:space="preserve">On its own, euribor3m takes a coefficient of -0.92 on the standardised scale; beside the four other economic indicators it takes +0.39. The marketing head asks whether higher rates help the campaign. What is the likeliest cause of the flip, and what does the memo say?</w:t>
+              <w:t xml:space="preserve">The marketing head reads Exhibit 3C and draws two conclusions. One: longer calls make deposits, so agents should be coached to keep clients on the line. Two: higher rates bring deposits, since euribor3m's weight is +0.39 once the other columns are held fixed. Which reply holds?</w:t>
             </w:r>
           </w:p>
           <w:p>
@@ -10079,7 +10121,7 @@
                 <w:sz w:val="20"/>
                 <w:szCs w:val="20"/>
               </w:rPr>
-              <w:t xml:space="preserve">A solver bug once a model passes ten columns; refit with another solver and report the sign it gives.</w:t>
+              <w:t xml:space="preserve">Both hold: the chart and the weight come from models that scored well on the validation slice.</w:t>
             </w:r>
           </w:p>
           <w:p>
@@ -10107,7 +10149,7 @@
                 <w:sz w:val="20"/>
                 <w:szCs w:val="20"/>
               </w:rPr>
-              <w:t xml:space="preserve">Since 2009 the rate's effect has reversed; report the +0.39 as the effect on this year's campaign.</w:t>
+              <w:t xml:space="preserve">One fails, since a yes makes the call long; two holds, since the full model holds the other columns fixed.</w:t>
             </w:r>
           </w:p>
           <w:p>
@@ -10135,7 +10177,7 @@
                 <w:sz w:val="20"/>
                 <w:szCs w:val="20"/>
               </w:rPr>
-              <w:t xml:space="preserve">The 11 percent yes rate shrinks rare-outcome weights; report -0.92 from the model fitted on its own.</w:t>
+              <w:t xml:space="preserve">One holds, since 332 seconds is far beyond chance; two fails, since the weight flips as columns join.</w:t>
             </w:r>
           </w:p>
           <w:p>
@@ -10163,435 +10205,7 @@
                 <w:sz w:val="20"/>
                 <w:szCs w:val="20"/>
               </w:rPr>
-              <w:t xml:space="preserve">The indicators move together and share one signal; read them as a group and quote no one sign.</w:t>
-            </w:r>
-          </w:p>
-        </w:tc>
-      </w:tr>
-    </w:tbl>
-    <w:p>
-      <w:pPr>
-        <w:keepNext w:val="false"/>
-        <w:spacing w:after="120" w:before="0"/>
-      </w:pPr>
-    </w:p>
-    <w:tbl>
-      <w:tblPr>
-        <w:tblW w:type="dxa" w:w="9800"/>
-        <w:tblBorders>
-          <w:top w:val="none" w:color="FFFFFF" w:sz="0"/>
-          <w:left w:val="none" w:color="FFFFFF" w:sz="0"/>
-          <w:bottom w:val="none" w:color="FFFFFF" w:sz="0"/>
-          <w:right w:val="none" w:color="FFFFFF" w:sz="0"/>
-          <w:insideH w:val="none" w:color="FFFFFF" w:sz="0"/>
-          <w:insideV w:val="none" w:color="FFFFFF" w:sz="0"/>
-        </w:tblBorders>
-      </w:tblPr>
-      <w:tblGrid>
-        <w:gridCol w:w="9800"/>
-      </w:tblGrid>
-      <w:tr>
-        <w:trPr>
-          <w:cantSplit/>
-        </w:trPr>
-        <w:tc>
-          <w:tcPr>
-            <w:tcW w:type="dxa" w:w="9800"/>
-            <w:tcBorders>
-              <w:top w:val="none" w:color="FFFFFF" w:sz="0"/>
-              <w:left w:val="none" w:color="FFFFFF" w:sz="0"/>
-              <w:bottom w:val="none" w:color="FFFFFF" w:sz="0"/>
-              <w:right w:val="none" w:color="FFFFFF" w:sz="0"/>
-            </w:tcBorders>
-            <w:tcMar>
-              <w:top w:type="dxa" w:w="0"/>
-              <w:left w:type="dxa" w:w="0"/>
-              <w:bottom w:type="dxa" w:w="0"/>
-              <w:right w:type="dxa" w:w="0"/>
-            </w:tcMar>
-          </w:tcPr>
-          <w:p>
-            <w:pPr>
-              <w:keepNext/>
-              <w:spacing w:after="80" w:before="80" w:line="264"/>
-            </w:pPr>
-            <w:r>
-              <w:rPr>
-                <w:rFonts w:ascii="Arial" w:cs="Arial" w:eastAsia="Arial" w:hAnsi="Arial"/>
-                <w:b/>
-                <w:bCs/>
-                <w:color w:val="B37A33"/>
-                <w:sz w:val="19"/>
-                <w:szCs w:val="19"/>
-              </w:rPr>
-              <w:t xml:space="preserve">Word bank 3</w:t>
-            </w:r>
-            <w:r>
-              <w:rPr>
-                <w:rFonts w:ascii="Arial" w:cs="Arial" w:eastAsia="Arial" w:hAnsi="Arial"/>
-                <w:i/>
-                <w:iCs/>
-                <w:color w:val="6B675E"/>
-                <w:sz w:val="18"/>
-                <w:szCs w:val="18"/>
-              </w:rPr>
-              <w:t xml:space="preserve">   Write the letter of the word or phrase that completes each statement. Each is used once at most, and some are not used.</w:t>
-            </w:r>
-          </w:p>
-          <w:tbl>
-            <w:tblPr>
-              <w:tblW w:type="dxa" w:w="9798"/>
-              <w:tblBorders>
-                <w:top w:val="single" w:color="FFFFFF" w:sz="4"/>
-                <w:left w:val="single" w:color="FFFFFF" w:sz="4"/>
-                <w:bottom w:val="single" w:color="FFFFFF" w:sz="4"/>
-                <w:right w:val="single" w:color="FFFFFF" w:sz="4"/>
-                <w:insideH w:val="single" w:color="FFFFFF" w:sz="4"/>
-                <w:insideV w:val="single" w:color="FFFFFF" w:sz="4"/>
-              </w:tblBorders>
-            </w:tblPr>
-            <w:tblGrid>
-              <w:gridCol w:w="3266"/>
-              <w:gridCol w:w="3266"/>
-              <w:gridCol w:w="3266"/>
-            </w:tblGrid>
-            <w:tr>
-              <w:trPr>
-                <w:cantSplit/>
-              </w:trPr>
-              <w:tc>
-                <w:tcPr>
-                  <w:tcW w:type="dxa" w:w="3266"/>
-                  <w:tcBorders>
-                    <w:top w:val="single" w:color="FFFFFF" w:sz="4"/>
-                    <w:left w:val="single" w:color="FFFFFF" w:sz="4"/>
-                    <w:bottom w:val="single" w:color="FFFFFF" w:sz="4"/>
-                    <w:right w:val="single" w:color="FFFFFF" w:sz="4"/>
-                  </w:tcBorders>
-                  <w:shd w:fill="F3F1EA" w:color="auto" w:val="clear"/>
-                  <w:tcMar>
-                    <w:top w:type="dxa" w:w="60"/>
-                    <w:left w:type="dxa" w:w="140"/>
-                    <w:bottom w:type="dxa" w:w="60"/>
-                    <w:right w:type="dxa" w:w="100"/>
-                  </w:tcMar>
-                  <w:vAlign w:val="center"/>
-                </w:tcPr>
-                <w:p>
-                  <w:pPr>
-                    <w:keepNext/>
-                    <w:spacing w:after="0" w:line="252"/>
-                  </w:pPr>
-                  <w:r>
-                    <w:rPr>
-                      <w:rFonts w:ascii="Arial" w:cs="Arial" w:eastAsia="Arial" w:hAnsi="Arial"/>
-                      <w:b/>
-                      <w:bCs/>
-                      <w:color w:val="B37A33"/>
-                      <w:sz w:val="20"/>
-                      <w:szCs w:val="20"/>
-                    </w:rPr>
-                    <w:t xml:space="preserve">A   </w:t>
-                  </w:r>
-                  <w:r>
-                    <w:rPr>
-                      <w:rFonts w:ascii="Arial" w:cs="Arial" w:eastAsia="Arial" w:hAnsi="Arial"/>
-                      <w:color w:val="1C1B16"/>
-                      <w:sz w:val="20"/>
-                      <w:szCs w:val="20"/>
-                    </w:rPr>
-                    <w:t xml:space="preserve">drift</w:t>
-                  </w:r>
-                </w:p>
-              </w:tc>
-              <w:tc>
-                <w:tcPr>
-                  <w:tcW w:type="dxa" w:w="3266"/>
-                  <w:tcBorders>
-                    <w:top w:val="single" w:color="FFFFFF" w:sz="4"/>
-                    <w:left w:val="single" w:color="FFFFFF" w:sz="4"/>
-                    <w:bottom w:val="single" w:color="FFFFFF" w:sz="4"/>
-                    <w:right w:val="single" w:color="FFFFFF" w:sz="4"/>
-                  </w:tcBorders>
-                  <w:shd w:fill="F3F1EA" w:color="auto" w:val="clear"/>
-                  <w:tcMar>
-                    <w:top w:type="dxa" w:w="60"/>
-                    <w:left w:type="dxa" w:w="140"/>
-                    <w:bottom w:type="dxa" w:w="60"/>
-                    <w:right w:type="dxa" w:w="100"/>
-                  </w:tcMar>
-                  <w:vAlign w:val="center"/>
-                </w:tcPr>
-                <w:p>
-                  <w:pPr>
-                    <w:keepNext/>
-                    <w:spacing w:after="0" w:line="252"/>
-                  </w:pPr>
-                  <w:r>
-                    <w:rPr>
-                      <w:rFonts w:ascii="Arial" w:cs="Arial" w:eastAsia="Arial" w:hAnsi="Arial"/>
-                      <w:b/>
-                      <w:bCs/>
-                      <w:color w:val="B37A33"/>
-                      <w:sz w:val="20"/>
-                      <w:szCs w:val="20"/>
-                    </w:rPr>
-                    <w:t xml:space="preserve">B   </w:t>
-                  </w:r>
-                  <w:r>
-                    <w:rPr>
-                      <w:rFonts w:ascii="Arial" w:cs="Arial" w:eastAsia="Arial" w:hAnsi="Arial"/>
-                      <w:color w:val="1C1B16"/>
-                      <w:sz w:val="20"/>
-                      <w:szCs w:val="20"/>
-                    </w:rPr>
-                    <w:t xml:space="preserve">imbalance</w:t>
-                  </w:r>
-                </w:p>
-              </w:tc>
-              <w:tc>
-                <w:tcPr>
-                  <w:tcW w:type="dxa" w:w="3266"/>
-                  <w:tcBorders>
-                    <w:top w:val="single" w:color="FFFFFF" w:sz="4"/>
-                    <w:left w:val="single" w:color="FFFFFF" w:sz="4"/>
-                    <w:bottom w:val="single" w:color="FFFFFF" w:sz="4"/>
-                    <w:right w:val="single" w:color="FFFFFF" w:sz="4"/>
-                  </w:tcBorders>
-                  <w:shd w:fill="F3F1EA" w:color="auto" w:val="clear"/>
-                  <w:tcMar>
-                    <w:top w:type="dxa" w:w="60"/>
-                    <w:left w:type="dxa" w:w="140"/>
-                    <w:bottom w:type="dxa" w:w="60"/>
-                    <w:right w:type="dxa" w:w="100"/>
-                  </w:tcMar>
-                  <w:vAlign w:val="center"/>
-                </w:tcPr>
-                <w:p>
-                  <w:pPr>
-                    <w:keepNext/>
-                    <w:spacing w:after="0" w:line="252"/>
-                  </w:pPr>
-                  <w:r>
-                    <w:rPr>
-                      <w:rFonts w:ascii="Arial" w:cs="Arial" w:eastAsia="Arial" w:hAnsi="Arial"/>
-                      <w:b/>
-                      <w:bCs/>
-                      <w:color w:val="B37A33"/>
-                      <w:sz w:val="20"/>
-                      <w:szCs w:val="20"/>
-                    </w:rPr>
-                    <w:t xml:space="preserve">C   </w:t>
-                  </w:r>
-                  <w:r>
-                    <w:rPr>
-                      <w:rFonts w:ascii="Arial" w:cs="Arial" w:eastAsia="Arial" w:hAnsi="Arial"/>
-                      <w:color w:val="1C1B16"/>
-                      <w:sz w:val="20"/>
-                      <w:szCs w:val="20"/>
-                    </w:rPr>
-                    <w:t xml:space="preserve">leakage</w:t>
-                  </w:r>
-                </w:p>
-              </w:tc>
-            </w:tr>
-            <w:tr>
-              <w:trPr>
-                <w:cantSplit/>
-              </w:trPr>
-              <w:tc>
-                <w:tcPr>
-                  <w:tcW w:type="dxa" w:w="3266"/>
-                  <w:tcBorders>
-                    <w:top w:val="single" w:color="FFFFFF" w:sz="4"/>
-                    <w:left w:val="single" w:color="FFFFFF" w:sz="4"/>
-                    <w:bottom w:val="single" w:color="FFFFFF" w:sz="4"/>
-                    <w:right w:val="single" w:color="FFFFFF" w:sz="4"/>
-                  </w:tcBorders>
-                  <w:shd w:fill="F3F1EA" w:color="auto" w:val="clear"/>
-                  <w:tcMar>
-                    <w:top w:type="dxa" w:w="60"/>
-                    <w:left w:type="dxa" w:w="140"/>
-                    <w:bottom w:type="dxa" w:w="60"/>
-                    <w:right w:type="dxa" w:w="100"/>
-                  </w:tcMar>
-                  <w:vAlign w:val="center"/>
-                </w:tcPr>
-                <w:p>
-                  <w:pPr>
-                    <w:keepNext/>
-                    <w:spacing w:after="0" w:line="252"/>
-                  </w:pPr>
-                  <w:r>
-                    <w:rPr>
-                      <w:rFonts w:ascii="Arial" w:cs="Arial" w:eastAsia="Arial" w:hAnsi="Arial"/>
-                      <w:b/>
-                      <w:bCs/>
-                      <w:color w:val="B37A33"/>
-                      <w:sz w:val="20"/>
-                      <w:szCs w:val="20"/>
-                    </w:rPr>
-                    <w:t xml:space="preserve">D   </w:t>
-                  </w:r>
-                  <w:r>
-                    <w:rPr>
-                      <w:rFonts w:ascii="Arial" w:cs="Arial" w:eastAsia="Arial" w:hAnsi="Arial"/>
-                      <w:color w:val="1C1B16"/>
-                      <w:sz w:val="20"/>
-                      <w:szCs w:val="20"/>
-                    </w:rPr>
-                    <w:t xml:space="preserve">collinearity</w:t>
-                  </w:r>
-                </w:p>
-              </w:tc>
-              <w:tc>
-                <w:tcPr>
-                  <w:tcW w:type="dxa" w:w="3266"/>
-                  <w:tcBorders>
-                    <w:top w:val="single" w:color="FFFFFF" w:sz="4"/>
-                    <w:left w:val="single" w:color="FFFFFF" w:sz="4"/>
-                    <w:bottom w:val="single" w:color="FFFFFF" w:sz="4"/>
-                    <w:right w:val="single" w:color="FFFFFF" w:sz="4"/>
-                  </w:tcBorders>
-                  <w:shd w:fill="F3F1EA" w:color="auto" w:val="clear"/>
-                  <w:tcMar>
-                    <w:top w:type="dxa" w:w="60"/>
-                    <w:left w:type="dxa" w:w="140"/>
-                    <w:bottom w:type="dxa" w:w="60"/>
-                    <w:right w:type="dxa" w:w="100"/>
-                  </w:tcMar>
-                  <w:vAlign w:val="center"/>
-                </w:tcPr>
-                <w:p>
-                  <w:pPr>
-                    <w:keepNext/>
-                    <w:spacing w:after="0" w:line="252"/>
-                  </w:pPr>
-                  <w:r>
-                    <w:rPr>
-                      <w:rFonts w:ascii="Arial" w:cs="Arial" w:eastAsia="Arial" w:hAnsi="Arial"/>
-                      <w:b/>
-                      <w:bCs/>
-                      <w:color w:val="B37A33"/>
-                      <w:sz w:val="20"/>
-                      <w:szCs w:val="20"/>
-                    </w:rPr>
-                    <w:t xml:space="preserve">E   </w:t>
-                  </w:r>
-                  <w:r>
-                    <w:rPr>
-                      <w:rFonts w:ascii="Arial" w:cs="Arial" w:eastAsia="Arial" w:hAnsi="Arial"/>
-                      <w:color w:val="1C1B16"/>
-                      <w:sz w:val="20"/>
-                      <w:szCs w:val="20"/>
-                    </w:rPr>
-                    <w:t xml:space="preserve">overfitting</w:t>
-                  </w:r>
-                </w:p>
-              </w:tc>
-              <w:tc>
-                <w:tcPr>
-                  <w:tcW w:type="dxa" w:w="3266"/>
-                  <w:tcBorders>
-                    <w:top w:val="single" w:color="FFFFFF" w:sz="4"/>
-                    <w:left w:val="single" w:color="FFFFFF" w:sz="4"/>
-                    <w:bottom w:val="single" w:color="FFFFFF" w:sz="4"/>
-                    <w:right w:val="single" w:color="FFFFFF" w:sz="4"/>
-                  </w:tcBorders>
-                  <w:shd w:fill="F3F1EA" w:color="auto" w:val="clear"/>
-                  <w:tcMar>
-                    <w:top w:type="dxa" w:w="60"/>
-                    <w:left w:type="dxa" w:w="140"/>
-                    <w:bottom w:type="dxa" w:w="60"/>
-                    <w:right w:type="dxa" w:w="100"/>
-                  </w:tcMar>
-                  <w:vAlign w:val="center"/>
-                </w:tcPr>
-                <w:p>
-                  <w:pPr>
-                    <w:keepNext/>
-                    <w:spacing w:after="80" w:before="0" w:line="276"/>
-                  </w:pPr>
-                  <w:r>
-                    <w:rPr>
-                      <w:rFonts w:ascii="Arial" w:cs="Arial" w:eastAsia="Arial" w:hAnsi="Arial"/>
-                      <w:color w:val="1C1B16"/>
-                      <w:sz w:val="21"/>
-                      <w:szCs w:val="21"/>
-                    </w:rPr>
-                    <w:t xml:space="preserve"/>
-                  </w:r>
-                </w:p>
-              </w:tc>
-            </w:tr>
-          </w:tbl>
-          <w:p>
-            <w:pPr>
-              <w:keepNext/>
-              <w:spacing w:after="140" w:before="0"/>
-            </w:pPr>
-          </w:p>
-          <w:p>
-            <w:pPr>
-              <w:keepNext/>
-              <w:spacing w:after="60" w:before="60" w:line="276"/>
-            </w:pPr>
-            <w:r>
-              <w:rPr>
-                <w:rFonts w:ascii="Arial" w:cs="Arial" w:eastAsia="Arial" w:hAnsi="Arial"/>
-                <w:b/>
-                <w:bCs/>
-                <w:color w:val="B37A33"/>
-                <w:sz w:val="22"/>
-                <w:szCs w:val="22"/>
-              </w:rPr>
-              <w:t xml:space="preserve">Q16</w:t>
-            </w:r>
-            <w:r>
-              <w:rPr>
-                <w:rFonts w:ascii="Arial" w:cs="Arial" w:eastAsia="Arial" w:hAnsi="Arial"/>
-                <w:b/>
-                <w:bCs/>
-                <w:color w:val="6B675E"/>
-                <w:sz w:val="18"/>
-                <w:szCs w:val="18"/>
-              </w:rPr>
-              <w:t xml:space="preserve">   Easy</w:t>
-            </w:r>
-            <w:r>
-              <w:rPr>
-                <w:rFonts w:ascii="Arial" w:cs="Arial" w:eastAsia="Arial" w:hAnsi="Arial"/>
-                <w:color w:val="6B675E"/>
-                <w:sz w:val="18"/>
-                <w:szCs w:val="18"/>
-              </w:rPr>
-              <w:t xml:space="preserve">  ·  Name the trap</w:t>
-            </w:r>
-            <w:r>
-              <w:rPr>
-                <w:rFonts w:ascii="Arial" w:cs="Arial" w:eastAsia="Arial" w:hAnsi="Arial"/>
-                <w:i/>
-                <w:iCs/>
-                <w:color w:val="6B675E"/>
-                <w:sz w:val="18"/>
-                <w:szCs w:val="18"/>
-              </w:rPr>
-              <w:t xml:space="preserve">  ·  a letter from Word bank 3</w:t>
-            </w:r>
-          </w:p>
-          <w:p>
-            <w:pPr>
-              <w:keepNext/>
-              <w:spacing w:after="80" w:line="276"/>
-            </w:pPr>
-            <w:r>
-              <w:rPr>
-                <w:rFonts w:ascii="Arial" w:cs="Arial" w:eastAsia="Arial" w:hAnsi="Arial"/>
-                <w:color w:val="1C1B16"/>
-                <w:sz w:val="21"/>
-                <w:szCs w:val="21"/>
-              </w:rPr>
-              <w:t xml:space="preserve">A feature that would not be known at prediction time is a case of data ____.</w:t>
+              <w:t xml:space="preserve">Both fail: a yes lengthens the call, and the rate moves with the other indicators; neither is an effect.</w:t>
             </w:r>
           </w:p>
         </w:tc>
@@ -10627,7 +10241,7 @@
           <w:sz w:val="19"/>
           <w:szCs w:val="19"/>
         </w:rPr>
-        <w:t xml:space="preserve">4 items, Q17 to Q20, about 10 minutes. What it shows: whether you can read training against validation, choose complexity by cross-validation and say when the simpler model ships.</w:t>
+        <w:t xml:space="preserve">4 items, Q14 to Q17, about 10 minutes. What it shows: whether you can read training against validation, choose complexity by cross-validation and say when the simpler model ships.</w:t>
       </w:r>
     </w:p>
     <w:p>
@@ -11536,7 +11150,7 @@
                 <w:sz w:val="22"/>
                 <w:szCs w:val="22"/>
               </w:rPr>
-              <w:t xml:space="preserve">Q17</w:t>
+              <w:t xml:space="preserve">Q14</w:t>
             </w:r>
             <w:r>
               <w:rPr>
@@ -11755,7 +11369,7 @@
                 <w:sz w:val="22"/>
                 <w:szCs w:val="22"/>
               </w:rPr>
-              <w:t xml:space="preserve">Q18</w:t>
+              <w:t xml:space="preserve">Q15</w:t>
             </w:r>
             <w:r>
               <w:rPr>
@@ -12780,7 +12394,7 @@
                 <w:sz w:val="22"/>
                 <w:szCs w:val="22"/>
               </w:rPr>
-              <w:t xml:space="preserve">Q19</w:t>
+              <w:t xml:space="preserve">Q16</w:t>
             </w:r>
             <w:r>
               <w:rPr>
@@ -12999,7 +12613,7 @@
                 <w:sz w:val="22"/>
                 <w:szCs w:val="22"/>
               </w:rPr>
-              <w:t xml:space="preserve">Q20</w:t>
+              <w:t xml:space="preserve">Q17</w:t>
             </w:r>
             <w:r>
               <w:rPr>
@@ -13193,7 +12807,7 @@
           <w:sz w:val="19"/>
           <w:szCs w:val="19"/>
         </w:rPr>
-        <w:t xml:space="preserve">4 items, Q21 to Q24, about 10 minutes. What it shows: whether you can say what a memo must prove, how a model is caught going stale and why the same model draws an opposite line in lending.</w:t>
+        <w:t xml:space="preserve">5 items, Q18 to Q22, about 12.5 minutes. What it shows: whether you can say what a memo must prove, how a model is caught going stale and why the same model draws an opposite line in lending.</w:t>
       </w:r>
     </w:p>
     <w:p>
@@ -14019,7 +13633,7 @@
                 <w:sz w:val="22"/>
                 <w:szCs w:val="22"/>
               </w:rPr>
-              <w:t xml:space="preserve">Q21</w:t>
+              <w:t xml:space="preserve">Q18</w:t>
             </w:r>
             <w:r>
               <w:rPr>
@@ -14065,7 +13679,7 @@
                 <w:sz w:val="21"/>
                 <w:szCs w:val="21"/>
               </w:rPr>
-              <w:t xml:space="preserve">On the latest 30 percent of calls the model's mean score was 0.152 while 24.6 percent said yes (Exhibit 5A). Which monitoring rule catches this first, and what does it mean for the cost line drawn on these scores?</w:t>
+              <w:t xml:space="preserve">On the latest 30 percent of calls the model's mean score was 0.152 while 24.6 percent said yes (Exhibit 5A). Which monitoring rule catches this first, and what happens to the cut on these scores that the cost line sets?</w:t>
             </w:r>
           </w:p>
           <w:p>
@@ -14093,7 +13707,7 @@
                 <w:sz w:val="20"/>
                 <w:szCs w:val="20"/>
               </w:rPr>
-              <w:t xml:space="preserve">Set each month's called yes rate against the mean score, with a stated gap; the cost line moves too, as the scores run low.</w:t>
+              <w:t xml:space="preserve">Set each month's called yes rate against the mean score, with a stated gap; the cut moves down, as scores run low.</w:t>
             </w:r>
           </w:p>
           <w:p>
@@ -14121,7 +13735,7 @@
                 <w:sz w:val="20"/>
                 <w:szCs w:val="20"/>
               </w:rPr>
-              <w:t xml:space="preserve">Retrain every night on the newest calls; the scores then stay current, so the cost line drawn on them needs no second look.</w:t>
+              <w:t xml:space="preserve">Set each month's called yes rate against the mean score, with a stated gap; the cut moves up, as more clients now say yes.</w:t>
             </w:r>
           </w:p>
           <w:p>
@@ -14149,7 +13763,7 @@
                 <w:sz w:val="20"/>
                 <w:szCs w:val="20"/>
               </w:rPr>
-              <w:t xml:space="preserve">Compare training accuracy month by month; a fall there flags the drift, and the cost line stays where Tuesday drew it.</w:t>
+              <w:t xml:space="preserve">Retrain every night on the newest calls; the scores then stay current, so the cut on them needs no second look.</w:t>
             </w:r>
           </w:p>
           <w:p>
@@ -14177,7 +13791,7 @@
                 <w:sz w:val="20"/>
                 <w:szCs w:val="20"/>
               </w:rPr>
-              <w:t xml:space="preserve">Wait for the marketing head's report; a score that still ranks buyers first keeps the cost line drawn on it valid.</w:t>
+              <w:t xml:space="preserve">Compare training accuracy month by month; a fall there flags the drift, and the cut stays where Tuesday drew it.</w:t>
             </w:r>
           </w:p>
         </w:tc>
@@ -14238,7 +13852,7 @@
                 <w:sz w:val="22"/>
                 <w:szCs w:val="22"/>
               </w:rPr>
-              <w:t xml:space="preserve">Q22</w:t>
+              <w:t xml:space="preserve">Q19</w:t>
             </w:r>
             <w:r>
               <w:rPr>
@@ -14457,7 +14071,7 @@
                 <w:sz w:val="22"/>
                 <w:szCs w:val="22"/>
               </w:rPr>
-              <w:t xml:space="preserve">Q23</w:t>
+              <w:t xml:space="preserve">Q20</w:t>
             </w:r>
             <w:r>
               <w:rPr>
@@ -14468,7 +14082,7 @@
                 <w:sz w:val="18"/>
                 <w:szCs w:val="18"/>
               </w:rPr>
-              <w:t xml:space="preserve">   Medium</w:t>
+              <w:t xml:space="preserve">   Hard</w:t>
             </w:r>
             <w:r>
               <w:rPr>
@@ -14503,7 +14117,7 @@
                 <w:sz w:val="21"/>
                 <w:szCs w:val="21"/>
               </w:rPr>
-              <w:t xml:space="preserve">Anand Iyer asks what evidence would make him sign. Across 23 comparisons, Booking.com found offline gains and business gains almost uncorrelated (Exhibit 5B). What does the memo propose?</w:t>
+              <w:t xml:space="preserve">Anand Iyer asks what evidence would make him sign. Across 23 comparisons, Booking.com found offline gains and business gains almost uncorrelated (Exhibit 5B). Which test does the memo propose for next month?</w:t>
             </w:r>
           </w:p>
           <w:p>
@@ -14531,7 +14145,7 @@
                 <w:sz w:val="20"/>
                 <w:szCs w:val="20"/>
               </w:rPr>
-              <w:t xml:space="preserve">a bigger validation slice, so that the AUC of 0.795 can be quoted to three decimal places</w:t>
+              <w:t xml:space="preserve">Call every client by the list next month, then compare its deposits per call with this month's, before the switch.</w:t>
             </w:r>
           </w:p>
           <w:p>
@@ -14559,7 +14173,7 @@
                 <w:sz w:val="20"/>
                 <w:szCs w:val="20"/>
               </w:rPr>
-              <w:t xml:space="preserve">a switch to gradient boosting, whose 0.806 gives the committee the strongest offline case</w:t>
+              <w:t xml:space="preserve">Score the list once on the sealed test slice, and sign if its AUC holds near the 0.795 it scored on validation.</w:t>
             </w:r>
           </w:p>
           <w:p>
@@ -14587,7 +14201,7 @@
                 <w:sz w:val="20"/>
                 <w:szCs w:val="20"/>
               </w:rPr>
-              <w:t xml:space="preserve">a random trial: half the next calls by the model's list, half by today's rule, scored on deposits</w:t>
+              <w:t xml:space="preserve">Run the list beside today's rule for a month, each on the branches it suits best, and compare deposits sold.</w:t>
             </w:r>
           </w:p>
           <w:p>
@@ -14615,7 +14229,7 @@
                 <w:sz w:val="20"/>
                 <w:szCs w:val="20"/>
               </w:rPr>
-              <w:t xml:space="preserve">the sealed test score on its own, since a slice opened once is all the evidence a committee needs</w:t>
+              <w:t xml:space="preserve">Assign next month's clients at random, half to the list and half to today's rule; compare deposits per call.</w:t>
             </w:r>
           </w:p>
         </w:tc>
@@ -14676,7 +14290,7 @@
                 <w:sz w:val="22"/>
                 <w:szCs w:val="22"/>
               </w:rPr>
-              <w:t xml:space="preserve">Q24</w:t>
+              <w:t xml:space="preserve">Q21</w:t>
             </w:r>
             <w:r>
               <w:rPr>
@@ -14806,7 +14420,7 @@
                 <w:sz w:val="20"/>
                 <w:szCs w:val="20"/>
               </w:rPr>
-              <w:t xml:space="preserve">Both: the nudge acts on a 3 percent chance, so the same method approves anyone above that line.</w:t>
+              <w:t xml:space="preserve">Both: an 8 percent chance of default means 92 in 100 such borrowers repay, a strong book for any lender.</w:t>
             </w:r>
           </w:p>
           <w:p>
@@ -14835,6 +14449,581 @@
                 <w:szCs w:val="20"/>
               </w:rPr>
               <w:t xml:space="preserve">Neither: a default costs twenty times a rejection, so any chance above 1 in 20 must mean a rejection.</w:t>
+            </w:r>
+          </w:p>
+        </w:tc>
+      </w:tr>
+    </w:tbl>
+    <w:p>
+      <w:pPr>
+        <w:keepNext w:val="false"/>
+        <w:spacing w:after="120" w:before="0"/>
+      </w:pPr>
+    </w:p>
+    <w:tbl>
+      <w:tblPr>
+        <w:tblW w:type="dxa" w:w="9800"/>
+        <w:tblBorders>
+          <w:top w:val="none" w:color="FFFFFF" w:sz="0"/>
+          <w:left w:val="none" w:color="FFFFFF" w:sz="0"/>
+          <w:bottom w:val="none" w:color="FFFFFF" w:sz="0"/>
+          <w:right w:val="none" w:color="FFFFFF" w:sz="0"/>
+          <w:insideH w:val="none" w:color="FFFFFF" w:sz="0"/>
+          <w:insideV w:val="none" w:color="FFFFFF" w:sz="0"/>
+        </w:tblBorders>
+      </w:tblPr>
+      <w:tblGrid>
+        <w:gridCol w:w="9800"/>
+      </w:tblGrid>
+      <w:tr>
+        <w:trPr>
+          <w:cantSplit/>
+        </w:trPr>
+        <w:tc>
+          <w:tcPr>
+            <w:tcW w:type="dxa" w:w="9800"/>
+            <w:tcBorders>
+              <w:top w:val="none" w:color="FFFFFF" w:sz="0"/>
+              <w:left w:val="none" w:color="FFFFFF" w:sz="0"/>
+              <w:bottom w:val="none" w:color="FFFFFF" w:sz="0"/>
+              <w:right w:val="none" w:color="FFFFFF" w:sz="0"/>
+            </w:tcBorders>
+            <w:tcMar>
+              <w:top w:type="dxa" w:w="0"/>
+              <w:left w:type="dxa" w:w="0"/>
+              <w:bottom w:type="dxa" w:w="0"/>
+              <w:right w:type="dxa" w:w="0"/>
+            </w:tcMar>
+          </w:tcPr>
+          <w:p>
+            <w:pPr>
+              <w:keepNext/>
+              <w:spacing w:after="80" w:before="80"/>
+            </w:pPr>
+            <w:r>
+              <w:rPr>
+                <w:rFonts w:ascii="Arial" w:cs="Arial" w:eastAsia="Arial" w:hAnsi="Arial"/>
+                <w:b/>
+                <w:bCs/>
+                <w:color w:val="B37A33"/>
+                <w:sz w:val="19"/>
+                <w:szCs w:val="19"/>
+              </w:rPr>
+              <w:t xml:space="preserve">Exhibit 5C</w:t>
+            </w:r>
+            <w:r>
+              <w:rPr>
+                <w:rFonts w:ascii="Arial" w:cs="Arial" w:eastAsia="Arial" w:hAnsi="Arial"/>
+                <w:i/>
+                <w:iCs/>
+                <w:color w:val="6B675E"/>
+                <w:sz w:val="18"/>
+                <w:szCs w:val="18"/>
+              </w:rPr>
+              <w:t xml:space="preserve">   Two public fraud cases. Stripe: its primer on machine learning for fraud protection. Flipkart with Carnegie Mellon: Hooi and others, BIRDNEST, arXiv 1511.06030.</w:t>
+            </w:r>
+          </w:p>
+          <w:tbl>
+            <w:tblPr>
+              <w:tblW w:type="dxa" w:w="9799"/>
+              <w:tblBorders>
+                <w:top w:val="single" w:color="D5D0C4" w:sz="4"/>
+                <w:left w:val="single" w:color="D5D0C4" w:sz="4"/>
+                <w:bottom w:val="single" w:color="D5D0C4" w:sz="4"/>
+                <w:right w:val="single" w:color="D5D0C4" w:sz="4"/>
+                <w:insideH w:val="single" w:color="D5D0C4" w:sz="4"/>
+                <w:insideV w:val="single" w:color="D5D0C4" w:sz="4"/>
+              </w:tblBorders>
+            </w:tblPr>
+            <w:tblGrid>
+              <w:gridCol w:w="1430"/>
+              <w:gridCol w:w="8369"/>
+            </w:tblGrid>
+            <w:tr>
+              <w:trPr>
+                <w:cantSplit/>
+                <w:tblHeader/>
+              </w:trPr>
+              <w:tc>
+                <w:tcPr>
+                  <w:tcW w:type="dxa" w:w="1430"/>
+                  <w:tcBorders>
+                    <w:top w:val="single" w:color="D5D0C4" w:sz="4"/>
+                    <w:left w:val="single" w:color="D5D0C4" w:sz="4"/>
+                    <w:bottom w:val="single" w:color="D5D0C4" w:sz="4"/>
+                    <w:right w:val="single" w:color="D5D0C4" w:sz="4"/>
+                  </w:tcBorders>
+                  <w:shd w:fill="F9F8F3" w:color="auto" w:val="clear"/>
+                  <w:tcMar>
+                    <w:top w:type="dxa" w:w="40"/>
+                    <w:left w:type="dxa" w:w="100"/>
+                    <w:bottom w:type="dxa" w:w="40"/>
+                    <w:right w:type="dxa" w:w="100"/>
+                  </w:tcMar>
+                  <w:vAlign w:val="center"/>
+                </w:tcPr>
+                <w:p>
+                  <w:pPr>
+                    <w:keepNext/>
+                    <w:spacing w:after="0" w:line="240"/>
+                    <w:jc w:val="left"/>
+                  </w:pPr>
+                  <w:r>
+                    <w:rPr>
+                      <w:rFonts w:ascii="Arial" w:cs="Arial" w:eastAsia="Arial" w:hAnsi="Arial"/>
+                      <w:b/>
+                      <w:bCs/>
+                      <w:color w:val="1C1B16"/>
+                      <w:sz w:val="18"/>
+                      <w:szCs w:val="18"/>
+                    </w:rPr>
+                    <w:t xml:space="preserve">Case</w:t>
+                  </w:r>
+                </w:p>
+              </w:tc>
+              <w:tc>
+                <w:tcPr>
+                  <w:tcW w:type="dxa" w:w="8369"/>
+                  <w:tcBorders>
+                    <w:top w:val="single" w:color="D5D0C4" w:sz="4"/>
+                    <w:left w:val="single" w:color="D5D0C4" w:sz="4"/>
+                    <w:bottom w:val="single" w:color="D5D0C4" w:sz="4"/>
+                    <w:right w:val="single" w:color="D5D0C4" w:sz="4"/>
+                  </w:tcBorders>
+                  <w:shd w:fill="F9F8F3" w:color="auto" w:val="clear"/>
+                  <w:tcMar>
+                    <w:top w:type="dxa" w:w="40"/>
+                    <w:left w:type="dxa" w:w="100"/>
+                    <w:bottom w:type="dxa" w:w="40"/>
+                    <w:right w:type="dxa" w:w="100"/>
+                  </w:tcMar>
+                  <w:vAlign w:val="center"/>
+                </w:tcPr>
+                <w:p>
+                  <w:pPr>
+                    <w:keepNext/>
+                    <w:spacing w:after="0" w:line="240"/>
+                    <w:jc w:val="left"/>
+                  </w:pPr>
+                  <w:r>
+                    <w:rPr>
+                      <w:rFonts w:ascii="Arial" w:cs="Arial" w:eastAsia="Arial" w:hAnsi="Arial"/>
+                      <w:b/>
+                      <w:bCs/>
+                      <w:color w:val="1C1B16"/>
+                      <w:sz w:val="18"/>
+                      <w:szCs w:val="18"/>
+                    </w:rPr>
+                    <w:t xml:space="preserve">What the source reports</w:t>
+                  </w:r>
+                </w:p>
+              </w:tc>
+            </w:tr>
+            <w:tr>
+              <w:trPr>
+                <w:cantSplit/>
+              </w:trPr>
+              <w:tc>
+                <w:tcPr>
+                  <w:tcW w:type="dxa" w:w="1430"/>
+                  <w:tcBorders>
+                    <w:top w:val="single" w:color="D5D0C4" w:sz="4"/>
+                    <w:left w:val="single" w:color="D5D0C4" w:sz="4"/>
+                    <w:bottom w:val="single" w:color="D5D0C4" w:sz="4"/>
+                    <w:right w:val="single" w:color="D5D0C4" w:sz="4"/>
+                  </w:tcBorders>
+                  <w:tcMar>
+                    <w:top w:type="dxa" w:w="40"/>
+                    <w:left w:type="dxa" w:w="100"/>
+                    <w:bottom w:type="dxa" w:w="40"/>
+                    <w:right w:type="dxa" w:w="100"/>
+                  </w:tcMar>
+                  <w:vAlign w:val="center"/>
+                </w:tcPr>
+                <w:p>
+                  <w:pPr>
+                    <w:keepNext w:val="false"/>
+                    <w:spacing w:after="0" w:line="252"/>
+                    <w:jc w:val="left"/>
+                  </w:pPr>
+                  <w:r>
+                    <w:rPr>
+                      <w:rFonts w:ascii="Arial" w:cs="Arial" w:eastAsia="Arial" w:hAnsi="Arial"/>
+                      <w:color w:val="1C1B16"/>
+                      <w:sz w:val="18"/>
+                      <w:szCs w:val="18"/>
+                    </w:rPr>
+                    <w:t xml:space="preserve">Stripe's worked example</w:t>
+                  </w:r>
+                </w:p>
+              </w:tc>
+              <w:tc>
+                <w:tcPr>
+                  <w:tcW w:type="dxa" w:w="8369"/>
+                  <w:tcBorders>
+                    <w:top w:val="single" w:color="D5D0C4" w:sz="4"/>
+                    <w:left w:val="single" w:color="D5D0C4" w:sz="4"/>
+                    <w:bottom w:val="single" w:color="D5D0C4" w:sz="4"/>
+                    <w:right w:val="single" w:color="D5D0C4" w:sz="4"/>
+                  </w:tcBorders>
+                  <w:tcMar>
+                    <w:top w:type="dxa" w:w="40"/>
+                    <w:left w:type="dxa" w:w="100"/>
+                    <w:bottom w:type="dxa" w:w="40"/>
+                    <w:right w:type="dxa" w:w="100"/>
+                  </w:tcMar>
+                  <w:vAlign w:val="center"/>
+                </w:tcPr>
+                <w:p>
+                  <w:pPr>
+                    <w:keepNext w:val="false"/>
+                    <w:spacing w:after="0" w:line="252"/>
+                    <w:jc w:val="left"/>
+                  </w:pPr>
+                  <w:r>
+                    <w:rPr>
+                      <w:rFonts w:ascii="Arial" w:cs="Arial" w:eastAsia="Arial" w:hAnsi="Arial"/>
+                      <w:b w:val="false"/>
+                      <w:bCs w:val="false"/>
+                      <w:color w:val="1C1B16"/>
+                      <w:sz w:val="18"/>
+                      <w:szCs w:val="18"/>
+                    </w:rPr>
+                    <w:t xml:space="preserve">A sale earns a profit of 2.08 dollars and a fraudulent sale loses 38.92 dollars, so one fraud costs the profit of 18.71 good sales and the break-even precision of a block is 5.07 percent</w:t>
+                  </w:r>
+                </w:p>
+              </w:tc>
+            </w:tr>
+            <w:tr>
+              <w:trPr>
+                <w:cantSplit/>
+              </w:trPr>
+              <w:tc>
+                <w:tcPr>
+                  <w:tcW w:type="dxa" w:w="1430"/>
+                  <w:tcBorders>
+                    <w:top w:val="single" w:color="D5D0C4" w:sz="4"/>
+                    <w:left w:val="single" w:color="D5D0C4" w:sz="4"/>
+                    <w:bottom w:val="single" w:color="D5D0C4" w:sz="4"/>
+                    <w:right w:val="single" w:color="D5D0C4" w:sz="4"/>
+                  </w:tcBorders>
+                  <w:tcMar>
+                    <w:top w:type="dxa" w:w="40"/>
+                    <w:left w:type="dxa" w:w="100"/>
+                    <w:bottom w:type="dxa" w:w="40"/>
+                    <w:right w:type="dxa" w:w="100"/>
+                  </w:tcMar>
+                  <w:vAlign w:val="center"/>
+                </w:tcPr>
+                <w:p>
+                  <w:pPr>
+                    <w:keepNext w:val="false"/>
+                    <w:spacing w:after="0" w:line="252"/>
+                    <w:jc w:val="left"/>
+                  </w:pPr>
+                  <w:r>
+                    <w:rPr>
+                      <w:rFonts w:ascii="Arial" w:cs="Arial" w:eastAsia="Arial" w:hAnsi="Arial"/>
+                      <w:color w:val="1C1B16"/>
+                      <w:sz w:val="18"/>
+                      <w:szCs w:val="18"/>
+                    </w:rPr>
+                    <w:t xml:space="preserve">Stripe, on false declines</w:t>
+                  </w:r>
+                </w:p>
+              </w:tc>
+              <w:tc>
+                <w:tcPr>
+                  <w:tcW w:type="dxa" w:w="8369"/>
+                  <w:tcBorders>
+                    <w:top w:val="single" w:color="D5D0C4" w:sz="4"/>
+                    <w:left w:val="single" w:color="D5D0C4" w:sz="4"/>
+                    <w:bottom w:val="single" w:color="D5D0C4" w:sz="4"/>
+                    <w:right w:val="single" w:color="D5D0C4" w:sz="4"/>
+                  </w:tcBorders>
+                  <w:tcMar>
+                    <w:top w:type="dxa" w:w="40"/>
+                    <w:left w:type="dxa" w:w="100"/>
+                    <w:bottom w:type="dxa" w:w="40"/>
+                    <w:right w:type="dxa" w:w="100"/>
+                  </w:tcMar>
+                  <w:vAlign w:val="center"/>
+                </w:tcPr>
+                <w:p>
+                  <w:pPr>
+                    <w:keepNext w:val="false"/>
+                    <w:spacing w:after="0" w:line="252"/>
+                    <w:jc w:val="left"/>
+                  </w:pPr>
+                  <w:r>
+                    <w:rPr>
+                      <w:rFonts w:ascii="Arial" w:cs="Arial" w:eastAsia="Arial" w:hAnsi="Arial"/>
+                      <w:b w:val="false"/>
+                      <w:bCs w:val="false"/>
+                      <w:color w:val="1C1B16"/>
+                      <w:sz w:val="18"/>
+                      <w:szCs w:val="18"/>
+                    </w:rPr>
+                    <w:t xml:space="preserve">In a survey Stripe cites, 33 percent of consumers said they would not shop again at a business after a false decline</w:t>
+                  </w:r>
+                </w:p>
+              </w:tc>
+            </w:tr>
+            <w:tr>
+              <w:trPr>
+                <w:cantSplit/>
+              </w:trPr>
+              <w:tc>
+                <w:tcPr>
+                  <w:tcW w:type="dxa" w:w="1430"/>
+                  <w:tcBorders>
+                    <w:top w:val="single" w:color="D5D0C4" w:sz="4"/>
+                    <w:left w:val="single" w:color="D5D0C4" w:sz="4"/>
+                    <w:bottom w:val="single" w:color="D5D0C4" w:sz="4"/>
+                    <w:right w:val="single" w:color="D5D0C4" w:sz="4"/>
+                  </w:tcBorders>
+                  <w:tcMar>
+                    <w:top w:type="dxa" w:w="40"/>
+                    <w:left w:type="dxa" w:w="100"/>
+                    <w:bottom w:type="dxa" w:w="40"/>
+                    <w:right w:type="dxa" w:w="100"/>
+                  </w:tcMar>
+                  <w:vAlign w:val="center"/>
+                </w:tcPr>
+                <w:p>
+                  <w:pPr>
+                    <w:keepNext w:val="false"/>
+                    <w:spacing w:after="0" w:line="252"/>
+                    <w:jc w:val="left"/>
+                  </w:pPr>
+                  <w:r>
+                    <w:rPr>
+                      <w:rFonts w:ascii="Arial" w:cs="Arial" w:eastAsia="Arial" w:hAnsi="Arial"/>
+                      <w:color w:val="1C1B16"/>
+                      <w:sz w:val="18"/>
+                      <w:szCs w:val="18"/>
+                    </w:rPr>
+                    <w:t xml:space="preserve">Flipkart's ratings-fraud model</w:t>
+                  </w:r>
+                </w:p>
+              </w:tc>
+              <w:tc>
+                <w:tcPr>
+                  <w:tcW w:type="dxa" w:w="8369"/>
+                  <w:tcBorders>
+                    <w:top w:val="single" w:color="D5D0C4" w:sz="4"/>
+                    <w:left w:val="single" w:color="D5D0C4" w:sz="4"/>
+                    <w:bottom w:val="single" w:color="D5D0C4" w:sz="4"/>
+                    <w:right w:val="single" w:color="D5D0C4" w:sz="4"/>
+                  </w:tcBorders>
+                  <w:tcMar>
+                    <w:top w:type="dxa" w:w="40"/>
+                    <w:left w:type="dxa" w:w="100"/>
+                    <w:bottom w:type="dxa" w:w="40"/>
+                    <w:right w:type="dxa" w:w="100"/>
+                  </w:tcMar>
+                  <w:vAlign w:val="center"/>
+                </w:tcPr>
+                <w:p>
+                  <w:pPr>
+                    <w:keepNext w:val="false"/>
+                    <w:spacing w:after="0" w:line="252"/>
+                    <w:jc w:val="left"/>
+                  </w:pPr>
+                  <w:r>
+                    <w:rPr>
+                      <w:rFonts w:ascii="Arial" w:cs="Arial" w:eastAsia="Arial" w:hAnsi="Arial"/>
+                      <w:b w:val="false"/>
+                      <w:bCs w:val="false"/>
+                      <w:color w:val="1C1B16"/>
+                      <w:sz w:val="18"/>
+                      <w:szCs w:val="18"/>
+                    </w:rPr>
+                    <w:t xml:space="preserve">The trust team investigated the 250 accounts the model ranked most suspicious, and 211 of them were involved in fraud</w:t>
+                  </w:r>
+                </w:p>
+              </w:tc>
+            </w:tr>
+          </w:tbl>
+          <w:p>
+            <w:pPr>
+              <w:keepNext/>
+              <w:spacing w:after="140" w:before="0"/>
+            </w:pPr>
+          </w:p>
+          <w:p>
+            <w:pPr>
+              <w:keepNext/>
+              <w:spacing w:after="60" w:before="60" w:line="276"/>
+            </w:pPr>
+            <w:r>
+              <w:rPr>
+                <w:rFonts w:ascii="Arial" w:cs="Arial" w:eastAsia="Arial" w:hAnsi="Arial"/>
+                <w:b/>
+                <w:bCs/>
+                <w:color w:val="B37A33"/>
+                <w:sz w:val="22"/>
+                <w:szCs w:val="22"/>
+              </w:rPr>
+              <w:t xml:space="preserve">Q22</w:t>
+            </w:r>
+            <w:r>
+              <w:rPr>
+                <w:rFonts w:ascii="Arial" w:cs="Arial" w:eastAsia="Arial" w:hAnsi="Arial"/>
+                <w:b/>
+                <w:bCs/>
+                <w:color w:val="6B675E"/>
+                <w:sz w:val="18"/>
+                <w:szCs w:val="18"/>
+              </w:rPr>
+              <w:t xml:space="preserve">   Hard</w:t>
+            </w:r>
+            <w:r>
+              <w:rPr>
+                <w:rFonts w:ascii="Arial" w:cs="Arial" w:eastAsia="Arial" w:hAnsi="Arial"/>
+                <w:color w:val="6B675E"/>
+                <w:sz w:val="18"/>
+                <w:szCs w:val="18"/>
+              </w:rPr>
+              <w:t xml:space="preserve">  ·  Answer Rohan's question</w:t>
+            </w:r>
+            <w:r>
+              <w:rPr>
+                <w:rFonts w:ascii="Arial" w:cs="Arial" w:eastAsia="Arial" w:hAnsi="Arial"/>
+                <w:i/>
+                <w:iCs/>
+                <w:color w:val="6B675E"/>
+                <w:sz w:val="18"/>
+                <w:szCs w:val="18"/>
+              </w:rPr>
+              <w:t xml:space="preserve">  ·  one letter</w:t>
+            </w:r>
+          </w:p>
+          <w:p>
+            <w:pPr>
+              <w:keepNext/>
+              <w:spacing w:after="80" w:line="276"/>
+            </w:pPr>
+            <w:r>
+              <w:rPr>
+                <w:rFonts w:ascii="Arial" w:cs="Arial" w:eastAsia="Arial" w:hAnsi="Arial"/>
+                <w:color w:val="1C1B16"/>
+                <w:sz w:val="21"/>
+                <w:szCs w:val="21"/>
+              </w:rPr>
+              <w:t xml:space="preserve">Rohan Desai asks one question about a fraud model for Kalpa Financial Services' payments app: "Do we tune it for precision or for recall?" Exhibit 5C sets two public cases beside his question. What is the best first reply?</w:t>
+            </w:r>
+          </w:p>
+          <w:p>
+            <w:pPr>
+              <w:keepNext/>
+              <w:keepLines/>
+              <w:spacing w:after="60" w:before="0" w:line="264"/>
+              <w:ind w:left="360" w:hanging="360"/>
+            </w:pPr>
+            <w:r>
+              <w:rPr>
+                <w:rFonts w:ascii="Arial" w:cs="Arial" w:eastAsia="Arial" w:hAnsi="Arial"/>
+                <w:b/>
+                <w:bCs/>
+                <w:color w:val="1C1B16"/>
+                <w:sz w:val="20"/>
+                <w:szCs w:val="20"/>
+              </w:rPr>
+              <w:t xml:space="preserve">A.  </w:t>
+            </w:r>
+            <w:r>
+              <w:rPr>
+                <w:rFonts w:ascii="Arial" w:cs="Arial" w:eastAsia="Arial" w:hAnsi="Arial"/>
+                <w:color w:val="1C1B16"/>
+                <w:sz w:val="20"/>
+                <w:szCs w:val="20"/>
+              </w:rPr>
+              <w:t xml:space="preserve">Recall: Stripe's arithmetic blocks above a 5 percent break-even, so a missed fraud is the cost; catch all of it.</w:t>
+            </w:r>
+          </w:p>
+          <w:p>
+            <w:pPr>
+              <w:keepNext/>
+              <w:keepLines/>
+              <w:spacing w:after="60" w:before="0" w:line="264"/>
+              <w:ind w:left="360" w:hanging="360"/>
+            </w:pPr>
+            <w:r>
+              <w:rPr>
+                <w:rFonts w:ascii="Arial" w:cs="Arial" w:eastAsia="Arial" w:hAnsi="Arial"/>
+                <w:b/>
+                <w:bCs/>
+                <w:color w:val="1C1B16"/>
+                <w:sz w:val="20"/>
+                <w:szCs w:val="20"/>
+              </w:rPr>
+              <w:t xml:space="preserve">B.  </w:t>
+            </w:r>
+            <w:r>
+              <w:rPr>
+                <w:rFonts w:ascii="Arial" w:cs="Arial" w:eastAsia="Arial" w:hAnsi="Arial"/>
+                <w:color w:val="1C1B16"/>
+                <w:sz w:val="20"/>
+                <w:szCs w:val="20"/>
+              </w:rPr>
+              <w:t xml:space="preserve">Precision: a third of customers leave after a false decline, so flag only the payments the model is sure of.</w:t>
+            </w:r>
+          </w:p>
+          <w:p>
+            <w:pPr>
+              <w:keepNext/>
+              <w:keepLines/>
+              <w:spacing w:after="60" w:before="0" w:line="264"/>
+              <w:ind w:left="360" w:hanging="360"/>
+            </w:pPr>
+            <w:r>
+              <w:rPr>
+                <w:rFonts w:ascii="Arial" w:cs="Arial" w:eastAsia="Arial" w:hAnsi="Arial"/>
+                <w:b/>
+                <w:bCs/>
+                <w:color w:val="1C1B16"/>
+                <w:sz w:val="20"/>
+                <w:szCs w:val="20"/>
+              </w:rPr>
+              <w:t xml:space="preserve">C.  </w:t>
+            </w:r>
+            <w:r>
+              <w:rPr>
+                <w:rFonts w:ascii="Arial" w:cs="Arial" w:eastAsia="Arial" w:hAnsi="Arial"/>
+                <w:color w:val="1C1B16"/>
+                <w:sz w:val="20"/>
+                <w:szCs w:val="20"/>
+              </w:rPr>
+              <w:t xml:space="preserve">Ask first: does a flag block the payment or send it to a reviewer, and how many can the team review a day?</w:t>
+            </w:r>
+          </w:p>
+          <w:p>
+            <w:pPr>
+              <w:keepNext w:val="false"/>
+              <w:keepLines/>
+              <w:spacing w:after="60" w:before="0" w:line="264"/>
+              <w:ind w:left="360" w:hanging="360"/>
+            </w:pPr>
+            <w:r>
+              <w:rPr>
+                <w:rFonts w:ascii="Arial" w:cs="Arial" w:eastAsia="Arial" w:hAnsi="Arial"/>
+                <w:b/>
+                <w:bCs/>
+                <w:color w:val="1C1B16"/>
+                <w:sz w:val="20"/>
+                <w:szCs w:val="20"/>
+              </w:rPr>
+              <w:t xml:space="preserve">D.  </w:t>
+            </w:r>
+            <w:r>
+              <w:rPr>
+                <w:rFonts w:ascii="Arial" w:cs="Arial" w:eastAsia="Arial" w:hAnsi="Arial"/>
+                <w:color w:val="1C1B16"/>
+                <w:sz w:val="20"/>
+                <w:szCs w:val="20"/>
+              </w:rPr>
+              <w:t xml:space="preserve">F1: fraud is rare, so F1 weighs both errors at once, and the threshold goes where F1 peaks on validation.</w:t>
             </w:r>
           </w:p>
         </w:tc>
@@ -15642,7 +15831,7 @@
                 <w:sz w:val="18"/>
                 <w:szCs w:val="18"/>
               </w:rPr>
-              <w:t xml:space="preserve">____ of 24</w:t>
+              <w:t xml:space="preserve">____ of 22</w:t>
             </w:r>
           </w:p>
         </w:tc>
@@ -16118,7 +16307,7 @@
                 <w:sz w:val="16"/>
                 <w:szCs w:val="16"/>
               </w:rPr>
-              <w:t xml:space="preserve">____ of 5</w:t>
+              <w:t xml:space="preserve">____ of 4</w:t>
             </w:r>
           </w:p>
         </w:tc>
@@ -16334,7 +16523,7 @@
                 <w:sz w:val="16"/>
                 <w:szCs w:val="16"/>
               </w:rPr>
-              <w:t xml:space="preserve">____ of 6</w:t>
+              <w:t xml:space="preserve">____ of 5</w:t>
             </w:r>
           </w:p>
         </w:tc>
@@ -16550,7 +16739,7 @@
                 <w:sz w:val="16"/>
                 <w:szCs w:val="16"/>
               </w:rPr>
-              <w:t xml:space="preserve">____ of 5</w:t>
+              <w:t xml:space="preserve">____ of 4</w:t>
             </w:r>
           </w:p>
         </w:tc>
@@ -16982,7 +17171,7 @@
                 <w:sz w:val="16"/>
                 <w:szCs w:val="16"/>
               </w:rPr>
-              <w:t xml:space="preserve">____ of 4</w:t>
+              <w:t xml:space="preserve">____ of 5</w:t>
             </w:r>
           </w:p>
         </w:tc>
@@ -17298,7 +17487,7 @@
                       <w:sz w:val="16"/>
                       <w:szCs w:val="16"/>
                     </w:rPr>
-                    <w:t xml:space="preserve">Q1</w:t>
+                    <w:t xml:space="preserve">Q1*</w:t>
                   </w:r>
                 </w:p>
               </w:tc>
@@ -17841,7 +18030,7 @@
                       <w:sz w:val="16"/>
                       <w:szCs w:val="16"/>
                     </w:rPr>
-                    <w:t xml:space="preserve">Q4*</w:t>
+                    <w:t xml:space="preserve">Q4</w:t>
                   </w:r>
                 </w:p>
               </w:tc>
@@ -18022,7 +18211,7 @@
                       <w:sz w:val="16"/>
                       <w:szCs w:val="16"/>
                     </w:rPr>
-                    <w:t xml:space="preserve">Q6</w:t>
+                    <w:t xml:space="preserve">Q5</w:t>
                   </w:r>
                 </w:p>
               </w:tc>
@@ -18806,7 +18995,7 @@
                       <w:sz w:val="16"/>
                       <w:szCs w:val="16"/>
                     </w:rPr>
-                    <w:t xml:space="preserve">Q12</w:t>
+                    <w:t xml:space="preserve">Q11*</w:t>
                   </w:r>
                 </w:p>
               </w:tc>
@@ -18987,7 +19176,7 @@
                       <w:sz w:val="16"/>
                       <w:szCs w:val="16"/>
                     </w:rPr>
-                    <w:t xml:space="preserve">Q13*</w:t>
+                    <w:t xml:space="preserve">Q12</w:t>
                   </w:r>
                 </w:p>
               </w:tc>
@@ -19168,7 +19357,7 @@
                       <w:sz w:val="16"/>
                       <w:szCs w:val="16"/>
                     </w:rPr>
-                    <w:t xml:space="preserve">Q14</w:t>
+                    <w:t xml:space="preserve">Q13</w:t>
                   </w:r>
                 </w:p>
               </w:tc>
@@ -19349,7 +19538,7 @@
                       <w:sz w:val="16"/>
                       <w:szCs w:val="16"/>
                     </w:rPr>
-                    <w:t xml:space="preserve">Q15</w:t>
+                    <w:t xml:space="preserve">Q14</w:t>
                   </w:r>
                 </w:p>
               </w:tc>
@@ -19530,7 +19719,7 @@
                       <w:sz w:val="16"/>
                       <w:szCs w:val="16"/>
                     </w:rPr>
-                    <w:t xml:space="preserve">Q17</w:t>
+                    <w:t xml:space="preserve">Q15*</w:t>
                   </w:r>
                 </w:p>
               </w:tc>
@@ -19711,7 +19900,7 @@
                       <w:sz w:val="16"/>
                       <w:szCs w:val="16"/>
                     </w:rPr>
-                    <w:t xml:space="preserve">Q18*</w:t>
+                    <w:t xml:space="preserve">Q16</w:t>
                   </w:r>
                 </w:p>
               </w:tc>
@@ -19892,7 +20081,7 @@
                       <w:sz w:val="16"/>
                       <w:szCs w:val="16"/>
                     </w:rPr>
-                    <w:t xml:space="preserve">Q19</w:t>
+                    <w:t xml:space="preserve">Q17</w:t>
                   </w:r>
                 </w:p>
               </w:tc>
@@ -20314,7 +20503,7 @@
                       <w:sz w:val="16"/>
                       <w:szCs w:val="16"/>
                     </w:rPr>
-                    <w:t xml:space="preserve">Q20</w:t>
+                    <w:t xml:space="preserve">Q18</w:t>
                   </w:r>
                 </w:p>
               </w:tc>
@@ -20495,7 +20684,7 @@
                       <w:sz w:val="16"/>
                       <w:szCs w:val="16"/>
                     </w:rPr>
-                    <w:t xml:space="preserve">Q21</w:t>
+                    <w:t xml:space="preserve">Q19*</w:t>
                   </w:r>
                 </w:p>
               </w:tc>
@@ -20676,7 +20865,7 @@
                       <w:sz w:val="16"/>
                       <w:szCs w:val="16"/>
                     </w:rPr>
-                    <w:t xml:space="preserve">Q22*</w:t>
+                    <w:t xml:space="preserve">Q20</w:t>
                   </w:r>
                 </w:p>
               </w:tc>
@@ -20857,7 +21046,7 @@
                       <w:sz w:val="16"/>
                       <w:szCs w:val="16"/>
                     </w:rPr>
-                    <w:t xml:space="preserve">Q23</w:t>
+                    <w:t xml:space="preserve">Q21</w:t>
                   </w:r>
                 </w:p>
               </w:tc>
@@ -21038,7 +21227,7 @@
                       <w:sz w:val="16"/>
                       <w:szCs w:val="16"/>
                     </w:rPr>
-                    <w:t xml:space="preserve">Q24</w:t>
+                    <w:t xml:space="preserve">Q22</w:t>
                   </w:r>
                 </w:p>
               </w:tc>
@@ -21426,7 +21615,7 @@
                       <w:sz w:val="16"/>
                       <w:szCs w:val="16"/>
                     </w:rPr>
-                    <w:t xml:space="preserve">Q5</w:t>
+                    <w:t xml:space="preserve">Q6</w:t>
                   </w:r>
                 </w:p>
               </w:tc>
@@ -21461,7 +21650,7 @@
                       <w:sz w:val="14"/>
                       <w:szCs w:val="14"/>
                     </w:rPr>
-                    <w:t xml:space="preserve">Letter</w:t>
+                    <w:t xml:space="preserve">Final answer</w:t>
                   </w:r>
                 </w:p>
               </w:tc>
@@ -21538,117 +21727,6 @@
                       <w:szCs w:val="16"/>
                     </w:rPr>
                     <w:t xml:space="preserve">Q7</w:t>
-                  </w:r>
-                </w:p>
-              </w:tc>
-              <w:tc>
-                <w:tcPr>
-                  <w:tcW w:type="dxa" w:w="1250"/>
-                  <w:tcBorders>
-                    <w:top w:val="single" w:color="D5D0C4" w:sz="4"/>
-                    <w:left w:val="single" w:color="D5D0C4" w:sz="4"/>
-                    <w:bottom w:val="single" w:color="D5D0C4" w:sz="4"/>
-                    <w:right w:val="single" w:color="D5D0C4" w:sz="4"/>
-                  </w:tcBorders>
-                  <w:tcMar>
-                    <w:top w:type="dxa" w:w="20"/>
-                    <w:left w:type="dxa" w:w="60"/>
-                    <w:bottom w:type="dxa" w:w="20"/>
-                    <w:right w:type="dxa" w:w="60"/>
-                  </w:tcMar>
-                  <w:vAlign w:val="center"/>
-                </w:tcPr>
-                <w:p>
-                  <w:pPr>
-                    <w:spacing w:after="20" w:before="20" w:line="240"/>
-                    <w:jc w:val="center"/>
-                  </w:pPr>
-                  <w:r>
-                    <w:rPr>
-                      <w:rFonts w:ascii="Arial" w:cs="Arial" w:eastAsia="Arial" w:hAnsi="Arial"/>
-                      <w:b w:val="false"/>
-                      <w:bCs w:val="false"/>
-                      <w:color w:val="6B675E"/>
-                      <w:sz w:val="14"/>
-                      <w:szCs w:val="14"/>
-                    </w:rPr>
-                    <w:t xml:space="preserve">Final answer</w:t>
-                  </w:r>
-                </w:p>
-              </w:tc>
-              <w:tc>
-                <w:tcPr>
-                  <w:tcW w:type="dxa" w:w="2860"/>
-                  <w:tcBorders>
-                    <w:top w:val="single" w:color="D5D0C4" w:sz="4"/>
-                    <w:left w:val="single" w:color="D5D0C4" w:sz="4"/>
-                    <w:bottom w:val="single" w:color="D5D0C4" w:sz="4"/>
-                    <w:right w:val="single" w:color="D5D0C4" w:sz="4"/>
-                  </w:tcBorders>
-                  <w:tcMar>
-                    <w:top w:type="dxa" w:w="20"/>
-                    <w:left w:type="dxa" w:w="60"/>
-                    <w:bottom w:type="dxa" w:w="20"/>
-                    <w:right w:type="dxa" w:w="60"/>
-                  </w:tcMar>
-                  <w:vAlign w:val="center"/>
-                </w:tcPr>
-                <w:p>
-                  <w:pPr>
-                    <w:spacing w:after="20" w:before="20" w:line="240"/>
-                    <w:jc w:val="left"/>
-                  </w:pPr>
-                  <w:r>
-                    <w:rPr>
-                      <w:rFonts w:ascii="Arial" w:cs="Arial" w:eastAsia="Arial" w:hAnsi="Arial"/>
-                      <w:b w:val="false"/>
-                      <w:bCs w:val="false"/>
-                      <w:color w:val="1C1B16"/>
-                      <w:sz w:val="16"/>
-                      <w:szCs w:val="16"/>
-                    </w:rPr>
-                    <w:t xml:space="preserve"/>
-                  </w:r>
-                </w:p>
-              </w:tc>
-            </w:tr>
-            <w:tr>
-              <w:trPr>
-                <w:cantSplit/>
-                <w:trHeight w:val="380" w:hRule="atLeast"/>
-              </w:trPr>
-              <w:tc>
-                <w:tcPr>
-                  <w:tcW w:type="dxa" w:w="640"/>
-                  <w:tcBorders>
-                    <w:top w:val="single" w:color="D5D0C4" w:sz="4"/>
-                    <w:left w:val="single" w:color="D5D0C4" w:sz="4"/>
-                    <w:bottom w:val="single" w:color="D5D0C4" w:sz="4"/>
-                    <w:right w:val="single" w:color="D5D0C4" w:sz="4"/>
-                  </w:tcBorders>
-                  <w:tcMar>
-                    <w:top w:type="dxa" w:w="20"/>
-                    <w:left w:type="dxa" w:w="60"/>
-                    <w:bottom w:type="dxa" w:w="20"/>
-                    <w:right w:type="dxa" w:w="60"/>
-                  </w:tcMar>
-                  <w:vAlign w:val="center"/>
-                </w:tcPr>
-                <w:p>
-                  <w:pPr>
-                    <w:spacing w:after="20" w:before="20" w:line="240"/>
-                    <w:jc w:val="center"/>
-                  </w:pPr>
-                  <w:r>
-                    <w:rPr>
-                      <w:rFonts w:ascii="Arial" w:cs="Arial" w:eastAsia="Arial" w:hAnsi="Arial"/>
-                      <w:b w:val="false"/>
-                      <w:bCs w:val="false"/>
-                      <w:color w:val="1C1B16"/>
-                      <w:sz w:val="16"/>
-                      <w:szCs w:val="16"/>
-                    </w:rPr>
-                    <w:t xml:space="preserve">Q8</w:t>
                   </w:r>
                 </w:p>
               </w:tc>
@@ -21926,7 +22004,7 @@
                       <w:sz w:val="16"/>
                       <w:szCs w:val="16"/>
                     </w:rPr>
-                    <w:t xml:space="preserve">Q11</w:t>
+                    <w:t xml:space="preserve">Q8</w:t>
                   </w:r>
                 </w:p>
               </w:tc>
@@ -21961,118 +22039,7 @@
                       <w:sz w:val="14"/>
                       <w:szCs w:val="14"/>
                     </w:rPr>
-                    <w:t xml:space="preserve">Letter</w:t>
-                  </w:r>
-                </w:p>
-              </w:tc>
-              <w:tc>
-                <w:tcPr>
-                  <w:tcW w:type="dxa" w:w="2860"/>
-                  <w:tcBorders>
-                    <w:top w:val="single" w:color="D5D0C4" w:sz="4"/>
-                    <w:left w:val="single" w:color="D5D0C4" w:sz="4"/>
-                    <w:bottom w:val="single" w:color="D5D0C4" w:sz="4"/>
-                    <w:right w:val="single" w:color="D5D0C4" w:sz="4"/>
-                  </w:tcBorders>
-                  <w:tcMar>
-                    <w:top w:type="dxa" w:w="20"/>
-                    <w:left w:type="dxa" w:w="60"/>
-                    <w:bottom w:type="dxa" w:w="20"/>
-                    <w:right w:type="dxa" w:w="60"/>
-                  </w:tcMar>
-                  <w:vAlign w:val="center"/>
-                </w:tcPr>
-                <w:p>
-                  <w:pPr>
-                    <w:spacing w:after="20" w:before="20" w:line="240"/>
-                    <w:jc w:val="left"/>
-                  </w:pPr>
-                  <w:r>
-                    <w:rPr>
-                      <w:rFonts w:ascii="Arial" w:cs="Arial" w:eastAsia="Arial" w:hAnsi="Arial"/>
-                      <w:b w:val="false"/>
-                      <w:bCs w:val="false"/>
-                      <w:color w:val="1C1B16"/>
-                      <w:sz w:val="16"/>
-                      <w:szCs w:val="16"/>
-                    </w:rPr>
-                    <w:t xml:space="preserve"/>
-                  </w:r>
-                </w:p>
-              </w:tc>
-            </w:tr>
-            <w:tr>
-              <w:trPr>
-                <w:cantSplit/>
-                <w:trHeight w:val="380" w:hRule="atLeast"/>
-              </w:trPr>
-              <w:tc>
-                <w:tcPr>
-                  <w:tcW w:type="dxa" w:w="640"/>
-                  <w:tcBorders>
-                    <w:top w:val="single" w:color="D5D0C4" w:sz="4"/>
-                    <w:left w:val="single" w:color="D5D0C4" w:sz="4"/>
-                    <w:bottom w:val="single" w:color="D5D0C4" w:sz="4"/>
-                    <w:right w:val="single" w:color="D5D0C4" w:sz="4"/>
-                  </w:tcBorders>
-                  <w:tcMar>
-                    <w:top w:type="dxa" w:w="20"/>
-                    <w:left w:type="dxa" w:w="60"/>
-                    <w:bottom w:type="dxa" w:w="20"/>
-                    <w:right w:type="dxa" w:w="60"/>
-                  </w:tcMar>
-                  <w:vAlign w:val="center"/>
-                </w:tcPr>
-                <w:p>
-                  <w:pPr>
-                    <w:spacing w:after="20" w:before="20" w:line="240"/>
-                    <w:jc w:val="center"/>
-                  </w:pPr>
-                  <w:r>
-                    <w:rPr>
-                      <w:rFonts w:ascii="Arial" w:cs="Arial" w:eastAsia="Arial" w:hAnsi="Arial"/>
-                      <w:b w:val="false"/>
-                      <w:bCs w:val="false"/>
-                      <w:color w:val="1C1B16"/>
-                      <w:sz w:val="16"/>
-                      <w:szCs w:val="16"/>
-                    </w:rPr>
-                    <w:t xml:space="preserve">Q16</w:t>
-                  </w:r>
-                </w:p>
-              </w:tc>
-              <w:tc>
-                <w:tcPr>
-                  <w:tcW w:type="dxa" w:w="1250"/>
-                  <w:tcBorders>
-                    <w:top w:val="single" w:color="D5D0C4" w:sz="4"/>
-                    <w:left w:val="single" w:color="D5D0C4" w:sz="4"/>
-                    <w:bottom w:val="single" w:color="D5D0C4" w:sz="4"/>
-                    <w:right w:val="single" w:color="D5D0C4" w:sz="4"/>
-                  </w:tcBorders>
-                  <w:tcMar>
-                    <w:top w:type="dxa" w:w="20"/>
-                    <w:left w:type="dxa" w:w="60"/>
-                    <w:bottom w:type="dxa" w:w="20"/>
-                    <w:right w:type="dxa" w:w="60"/>
-                  </w:tcMar>
-                  <w:vAlign w:val="center"/>
-                </w:tcPr>
-                <w:p>
-                  <w:pPr>
-                    <w:spacing w:after="20" w:before="20" w:line="240"/>
-                    <w:jc w:val="center"/>
-                  </w:pPr>
-                  <w:r>
-                    <w:rPr>
-                      <w:rFonts w:ascii="Arial" w:cs="Arial" w:eastAsia="Arial" w:hAnsi="Arial"/>
-                      <w:b w:val="false"/>
-                      <w:bCs w:val="false"/>
-                      <w:color w:val="6B675E"/>
-                      <w:sz w:val="14"/>
-                      <w:szCs w:val="14"/>
-                    </w:rPr>
-                    <w:t xml:space="preserve">Letter</w:t>
+                    <w:t xml:space="preserve">Final answer</w:t>
                   </w:r>
                 </w:p>
               </w:tc>

</xml_diff>